<commit_message>
rendering, first gun, weapon controller
</commit_message>
<xml_diff>
--- a/DesignDocument.docx
+++ b/DesignDocument.docx
@@ -529,16 +529,1823 @@
             <w:br w:type="page"/>
           </w:r>
         </w:p>
+        <w:sdt>
+          <w:sdtPr>
+            <w:id w:val="1102994137"/>
+            <w:docPartObj>
+              <w:docPartGallery w:val="Table of Contents"/>
+              <w:docPartUnique/>
+            </w:docPartObj>
+          </w:sdtPr>
+          <w:sdtEndPr>
+            <w:rPr>
+              <w:rFonts w:asciiTheme="minorHAnsi" w:eastAsiaTheme="minorHAnsi" w:hAnsiTheme="minorHAnsi" w:cstheme="minorBidi"/>
+              <w:b/>
+              <w:bCs/>
+              <w:color w:val="auto"/>
+              <w:kern w:val="2"/>
+              <w:sz w:val="24"/>
+              <w:szCs w:val="24"/>
+              <w:lang w:eastAsia="en-US"/>
+              <w14:ligatures w14:val="standardContextual"/>
+            </w:rPr>
+          </w:sdtEndPr>
+          <w:sdtContent>
+            <w:p>
+              <w:pPr>
+                <w:pStyle w:val="TOCHeading"/>
+              </w:pPr>
+              <w:r>
+                <w:t>Contents</w:t>
+              </w:r>
+            </w:p>
+            <w:p>
+              <w:pPr>
+                <w:pStyle w:val="TOC1"/>
+                <w:tabs>
+                  <w:tab w:val="right" w:leader="dot" w:pos="9016"/>
+                </w:tabs>
+                <w:rPr>
+                  <w:rFonts w:eastAsiaTheme="minorEastAsia"/>
+                  <w:noProof/>
+                  <w:lang w:eastAsia="en-GB"/>
+                </w:rPr>
+              </w:pPr>
+              <w:r>
+                <w:fldChar w:fldCharType="begin"/>
+              </w:r>
+              <w:r>
+                <w:instrText xml:space="preserve"> TOC \o "1-3" \h \z \u </w:instrText>
+              </w:r>
+              <w:r>
+                <w:fldChar w:fldCharType="separate"/>
+              </w:r>
+              <w:hyperlink w:anchor="_Toc195799408" w:history="1">
+                <w:r>
+                  <w:rPr>
+                    <w:rStyle w:val="Hyperlink"/>
+                    <w:noProof/>
+                  </w:rPr>
+                  <w:t>Aims of the project</w:t>
+                </w:r>
+                <w:r>
+                  <w:rPr>
+                    <w:noProof/>
+                    <w:webHidden/>
+                  </w:rPr>
+                  <w:tab/>
+                </w:r>
+                <w:r>
+                  <w:rPr>
+                    <w:noProof/>
+                    <w:webHidden/>
+                  </w:rPr>
+                  <w:fldChar w:fldCharType="begin"/>
+                </w:r>
+                <w:r>
+                  <w:rPr>
+                    <w:noProof/>
+                    <w:webHidden/>
+                  </w:rPr>
+                  <w:instrText xml:space="preserve"> PAGEREF _Toc195799408 \h </w:instrText>
+                </w:r>
+                <w:r>
+                  <w:rPr>
+                    <w:noProof/>
+                    <w:webHidden/>
+                  </w:rPr>
+                </w:r>
+                <w:r>
+                  <w:rPr>
+                    <w:noProof/>
+                    <w:webHidden/>
+                  </w:rPr>
+                  <w:fldChar w:fldCharType="separate"/>
+                </w:r>
+                <w:r>
+                  <w:rPr>
+                    <w:noProof/>
+                    <w:webHidden/>
+                  </w:rPr>
+                  <w:t>2</w:t>
+                </w:r>
+                <w:r>
+                  <w:rPr>
+                    <w:noProof/>
+                    <w:webHidden/>
+                  </w:rPr>
+                  <w:fldChar w:fldCharType="end"/>
+                </w:r>
+              </w:hyperlink>
+            </w:p>
+            <w:p>
+              <w:pPr>
+                <w:pStyle w:val="TOC1"/>
+                <w:tabs>
+                  <w:tab w:val="right" w:leader="dot" w:pos="9016"/>
+                </w:tabs>
+                <w:rPr>
+                  <w:rFonts w:eastAsiaTheme="minorEastAsia"/>
+                  <w:noProof/>
+                  <w:lang w:eastAsia="en-GB"/>
+                </w:rPr>
+              </w:pPr>
+              <w:hyperlink w:anchor="_Toc195799409" w:history="1">
+                <w:r>
+                  <w:rPr>
+                    <w:rStyle w:val="Hyperlink"/>
+                    <w:noProof/>
+                  </w:rPr>
+                  <w:t>Planned Features</w:t>
+                </w:r>
+                <w:r>
+                  <w:rPr>
+                    <w:noProof/>
+                    <w:webHidden/>
+                  </w:rPr>
+                  <w:tab/>
+                </w:r>
+                <w:r>
+                  <w:rPr>
+                    <w:noProof/>
+                    <w:webHidden/>
+                  </w:rPr>
+                  <w:fldChar w:fldCharType="begin"/>
+                </w:r>
+                <w:r>
+                  <w:rPr>
+                    <w:noProof/>
+                    <w:webHidden/>
+                  </w:rPr>
+                  <w:instrText xml:space="preserve"> PAGEREF _Toc195799409 \h </w:instrText>
+                </w:r>
+                <w:r>
+                  <w:rPr>
+                    <w:noProof/>
+                    <w:webHidden/>
+                  </w:rPr>
+                </w:r>
+                <w:r>
+                  <w:rPr>
+                    <w:noProof/>
+                    <w:webHidden/>
+                  </w:rPr>
+                  <w:fldChar w:fldCharType="separate"/>
+                </w:r>
+                <w:r>
+                  <w:rPr>
+                    <w:noProof/>
+                    <w:webHidden/>
+                  </w:rPr>
+                  <w:t>2</w:t>
+                </w:r>
+                <w:r>
+                  <w:rPr>
+                    <w:noProof/>
+                    <w:webHidden/>
+                  </w:rPr>
+                  <w:fldChar w:fldCharType="end"/>
+                </w:r>
+              </w:hyperlink>
+            </w:p>
+            <w:p>
+              <w:pPr>
+                <w:pStyle w:val="TOC2"/>
+                <w:tabs>
+                  <w:tab w:val="right" w:leader="dot" w:pos="9016"/>
+                </w:tabs>
+                <w:rPr>
+                  <w:rFonts w:eastAsiaTheme="minorEastAsia"/>
+                  <w:noProof/>
+                  <w:lang w:eastAsia="en-GB"/>
+                </w:rPr>
+              </w:pPr>
+              <w:hyperlink w:anchor="_Toc195799410" w:history="1">
+                <w:r>
+                  <w:rPr>
+                    <w:rStyle w:val="Hyperlink"/>
+                    <w:noProof/>
+                  </w:rPr>
+                  <w:t>Weapon Implementation</w:t>
+                </w:r>
+                <w:r>
+                  <w:rPr>
+                    <w:noProof/>
+                    <w:webHidden/>
+                  </w:rPr>
+                  <w:tab/>
+                </w:r>
+                <w:r>
+                  <w:rPr>
+                    <w:noProof/>
+                    <w:webHidden/>
+                  </w:rPr>
+                  <w:fldChar w:fldCharType="begin"/>
+                </w:r>
+                <w:r>
+                  <w:rPr>
+                    <w:noProof/>
+                    <w:webHidden/>
+                  </w:rPr>
+                  <w:instrText xml:space="preserve"> PAGEREF _Toc195799410 \h </w:instrText>
+                </w:r>
+                <w:r>
+                  <w:rPr>
+                    <w:noProof/>
+                    <w:webHidden/>
+                  </w:rPr>
+                </w:r>
+                <w:r>
+                  <w:rPr>
+                    <w:noProof/>
+                    <w:webHidden/>
+                  </w:rPr>
+                  <w:fldChar w:fldCharType="separate"/>
+                </w:r>
+                <w:r>
+                  <w:rPr>
+                    <w:noProof/>
+                    <w:webHidden/>
+                  </w:rPr>
+                  <w:t>2</w:t>
+                </w:r>
+                <w:r>
+                  <w:rPr>
+                    <w:noProof/>
+                    <w:webHidden/>
+                  </w:rPr>
+                  <w:fldChar w:fldCharType="end"/>
+                </w:r>
+              </w:hyperlink>
+            </w:p>
+            <w:p>
+              <w:pPr>
+                <w:pStyle w:val="TOC3"/>
+                <w:tabs>
+                  <w:tab w:val="right" w:leader="dot" w:pos="9016"/>
+                </w:tabs>
+                <w:rPr>
+                  <w:rFonts w:eastAsiaTheme="minorEastAsia"/>
+                  <w:noProof/>
+                  <w:lang w:eastAsia="en-GB"/>
+                </w:rPr>
+              </w:pPr>
+              <w:hyperlink w:anchor="_Toc195799411" w:history="1">
+                <w:r>
+                  <w:rPr>
+                    <w:rStyle w:val="Hyperlink"/>
+                    <w:noProof/>
+                  </w:rPr>
+                  <w:t>Firearms</w:t>
+                </w:r>
+                <w:r>
+                  <w:rPr>
+                    <w:noProof/>
+                    <w:webHidden/>
+                  </w:rPr>
+                  <w:tab/>
+                </w:r>
+                <w:r>
+                  <w:rPr>
+                    <w:noProof/>
+                    <w:webHidden/>
+                  </w:rPr>
+                  <w:fldChar w:fldCharType="begin"/>
+                </w:r>
+                <w:r>
+                  <w:rPr>
+                    <w:noProof/>
+                    <w:webHidden/>
+                  </w:rPr>
+                  <w:instrText xml:space="preserve"> PAGEREF _Toc195799411 \h </w:instrText>
+                </w:r>
+                <w:r>
+                  <w:rPr>
+                    <w:noProof/>
+                    <w:webHidden/>
+                  </w:rPr>
+                </w:r>
+                <w:r>
+                  <w:rPr>
+                    <w:noProof/>
+                    <w:webHidden/>
+                  </w:rPr>
+                  <w:fldChar w:fldCharType="separate"/>
+                </w:r>
+                <w:r>
+                  <w:rPr>
+                    <w:noProof/>
+                    <w:webHidden/>
+                  </w:rPr>
+                  <w:t>2</w:t>
+                </w:r>
+                <w:r>
+                  <w:rPr>
+                    <w:noProof/>
+                    <w:webHidden/>
+                  </w:rPr>
+                  <w:fldChar w:fldCharType="end"/>
+                </w:r>
+              </w:hyperlink>
+            </w:p>
+            <w:p>
+              <w:pPr>
+                <w:pStyle w:val="TOC3"/>
+                <w:tabs>
+                  <w:tab w:val="right" w:leader="dot" w:pos="9016"/>
+                </w:tabs>
+                <w:rPr>
+                  <w:rFonts w:eastAsiaTheme="minorEastAsia"/>
+                  <w:noProof/>
+                  <w:lang w:eastAsia="en-GB"/>
+                </w:rPr>
+              </w:pPr>
+              <w:hyperlink w:anchor="_Toc195799412" w:history="1">
+                <w:r>
+                  <w:rPr>
+                    <w:rStyle w:val="Hyperlink"/>
+                    <w:noProof/>
+                  </w:rPr>
+                  <w:t>Melee</w:t>
+                </w:r>
+                <w:r>
+                  <w:rPr>
+                    <w:noProof/>
+                    <w:webHidden/>
+                  </w:rPr>
+                  <w:tab/>
+                </w:r>
+                <w:r>
+                  <w:rPr>
+                    <w:noProof/>
+                    <w:webHidden/>
+                  </w:rPr>
+                  <w:fldChar w:fldCharType="begin"/>
+                </w:r>
+                <w:r>
+                  <w:rPr>
+                    <w:noProof/>
+                    <w:webHidden/>
+                  </w:rPr>
+                  <w:instrText xml:space="preserve"> PAGEREF _Toc195799412 \h </w:instrText>
+                </w:r>
+                <w:r>
+                  <w:rPr>
+                    <w:noProof/>
+                    <w:webHidden/>
+                  </w:rPr>
+                </w:r>
+                <w:r>
+                  <w:rPr>
+                    <w:noProof/>
+                    <w:webHidden/>
+                  </w:rPr>
+                  <w:fldChar w:fldCharType="separate"/>
+                </w:r>
+                <w:r>
+                  <w:rPr>
+                    <w:noProof/>
+                    <w:webHidden/>
+                  </w:rPr>
+                  <w:t>2</w:t>
+                </w:r>
+                <w:r>
+                  <w:rPr>
+                    <w:noProof/>
+                    <w:webHidden/>
+                  </w:rPr>
+                  <w:fldChar w:fldCharType="end"/>
+                </w:r>
+              </w:hyperlink>
+            </w:p>
+            <w:p>
+              <w:pPr>
+                <w:pStyle w:val="TOC1"/>
+                <w:tabs>
+                  <w:tab w:val="right" w:leader="dot" w:pos="9016"/>
+                </w:tabs>
+                <w:rPr>
+                  <w:rFonts w:eastAsiaTheme="minorEastAsia"/>
+                  <w:noProof/>
+                  <w:lang w:eastAsia="en-GB"/>
+                </w:rPr>
+              </w:pPr>
+              <w:hyperlink w:anchor="_Toc195799413" w:history="1">
+                <w:r>
+                  <w:rPr>
+                    <w:rStyle w:val="Hyperlink"/>
+                    <w:noProof/>
+                  </w:rPr>
+                  <w:t>Raycast Commands &amp; Bullet Scheduling</w:t>
+                </w:r>
+                <w:r>
+                  <w:rPr>
+                    <w:noProof/>
+                    <w:webHidden/>
+                  </w:rPr>
+                  <w:tab/>
+                </w:r>
+                <w:r>
+                  <w:rPr>
+                    <w:noProof/>
+                    <w:webHidden/>
+                  </w:rPr>
+                  <w:fldChar w:fldCharType="begin"/>
+                </w:r>
+                <w:r>
+                  <w:rPr>
+                    <w:noProof/>
+                    <w:webHidden/>
+                  </w:rPr>
+                  <w:instrText xml:space="preserve"> PAGEREF _Toc195799413 \h </w:instrText>
+                </w:r>
+                <w:r>
+                  <w:rPr>
+                    <w:noProof/>
+                    <w:webHidden/>
+                  </w:rPr>
+                </w:r>
+                <w:r>
+                  <w:rPr>
+                    <w:noProof/>
+                    <w:webHidden/>
+                  </w:rPr>
+                  <w:fldChar w:fldCharType="separate"/>
+                </w:r>
+                <w:r>
+                  <w:rPr>
+                    <w:noProof/>
+                    <w:webHidden/>
+                  </w:rPr>
+                  <w:t>3</w:t>
+                </w:r>
+                <w:r>
+                  <w:rPr>
+                    <w:noProof/>
+                    <w:webHidden/>
+                  </w:rPr>
+                  <w:fldChar w:fldCharType="end"/>
+                </w:r>
+              </w:hyperlink>
+            </w:p>
+            <w:p>
+              <w:pPr>
+                <w:pStyle w:val="TOC3"/>
+                <w:tabs>
+                  <w:tab w:val="right" w:leader="dot" w:pos="9016"/>
+                </w:tabs>
+                <w:rPr>
+                  <w:rFonts w:eastAsiaTheme="minorEastAsia"/>
+                  <w:noProof/>
+                  <w:lang w:eastAsia="en-GB"/>
+                </w:rPr>
+              </w:pPr>
+              <w:hyperlink w:anchor="_Toc195799414" w:history="1">
+                <w:r>
+                  <w:rPr>
+                    <w:rStyle w:val="Hyperlink"/>
+                    <w:noProof/>
+                  </w:rPr>
+                  <w:t>Test Conditions</w:t>
+                </w:r>
+                <w:r>
+                  <w:rPr>
+                    <w:noProof/>
+                    <w:webHidden/>
+                  </w:rPr>
+                  <w:tab/>
+                </w:r>
+                <w:r>
+                  <w:rPr>
+                    <w:noProof/>
+                    <w:webHidden/>
+                  </w:rPr>
+                  <w:fldChar w:fldCharType="begin"/>
+                </w:r>
+                <w:r>
+                  <w:rPr>
+                    <w:noProof/>
+                    <w:webHidden/>
+                  </w:rPr>
+                  <w:instrText xml:space="preserve"> PAGEREF _Toc195799414 \h </w:instrText>
+                </w:r>
+                <w:r>
+                  <w:rPr>
+                    <w:noProof/>
+                    <w:webHidden/>
+                  </w:rPr>
+                </w:r>
+                <w:r>
+                  <w:rPr>
+                    <w:noProof/>
+                    <w:webHidden/>
+                  </w:rPr>
+                  <w:fldChar w:fldCharType="separate"/>
+                </w:r>
+                <w:r>
+                  <w:rPr>
+                    <w:noProof/>
+                    <w:webHidden/>
+                  </w:rPr>
+                  <w:t>3</w:t>
+                </w:r>
+                <w:r>
+                  <w:rPr>
+                    <w:noProof/>
+                    <w:webHidden/>
+                  </w:rPr>
+                  <w:fldChar w:fldCharType="end"/>
+                </w:r>
+              </w:hyperlink>
+            </w:p>
+            <w:p>
+              <w:pPr>
+                <w:pStyle w:val="TOC1"/>
+                <w:tabs>
+                  <w:tab w:val="right" w:leader="dot" w:pos="9016"/>
+                </w:tabs>
+                <w:rPr>
+                  <w:rFonts w:eastAsiaTheme="minorEastAsia"/>
+                  <w:noProof/>
+                  <w:lang w:eastAsia="en-GB"/>
+                </w:rPr>
+              </w:pPr>
+              <w:hyperlink w:anchor="_Toc195799415" w:history="1">
+                <w:r>
+                  <w:rPr>
+                    <w:rStyle w:val="Hyperlink"/>
+                    <w:noProof/>
+                  </w:rPr>
+                  <w:t>Ranged Weapon Implementation</w:t>
+                </w:r>
+                <w:r>
+                  <w:rPr>
+                    <w:noProof/>
+                    <w:webHidden/>
+                  </w:rPr>
+                  <w:tab/>
+                </w:r>
+                <w:r>
+                  <w:rPr>
+                    <w:noProof/>
+                    <w:webHidden/>
+                  </w:rPr>
+                  <w:fldChar w:fldCharType="begin"/>
+                </w:r>
+                <w:r>
+                  <w:rPr>
+                    <w:noProof/>
+                    <w:webHidden/>
+                  </w:rPr>
+                  <w:instrText xml:space="preserve"> PAGEREF _Toc195799415 \h </w:instrText>
+                </w:r>
+                <w:r>
+                  <w:rPr>
+                    <w:noProof/>
+                    <w:webHidden/>
+                  </w:rPr>
+                </w:r>
+                <w:r>
+                  <w:rPr>
+                    <w:noProof/>
+                    <w:webHidden/>
+                  </w:rPr>
+                  <w:fldChar w:fldCharType="separate"/>
+                </w:r>
+                <w:r>
+                  <w:rPr>
+                    <w:noProof/>
+                    <w:webHidden/>
+                  </w:rPr>
+                  <w:t>4</w:t>
+                </w:r>
+                <w:r>
+                  <w:rPr>
+                    <w:noProof/>
+                    <w:webHidden/>
+                  </w:rPr>
+                  <w:fldChar w:fldCharType="end"/>
+                </w:r>
+              </w:hyperlink>
+            </w:p>
+            <w:p>
+              <w:pPr>
+                <w:pStyle w:val="TOC1"/>
+                <w:tabs>
+                  <w:tab w:val="right" w:leader="dot" w:pos="9016"/>
+                </w:tabs>
+                <w:rPr>
+                  <w:rFonts w:eastAsiaTheme="minorEastAsia"/>
+                  <w:noProof/>
+                  <w:lang w:eastAsia="en-GB"/>
+                </w:rPr>
+              </w:pPr>
+              <w:hyperlink w:anchor="_Toc195799416" w:history="1">
+                <w:r>
+                  <w:rPr>
+                    <w:rStyle w:val="Hyperlink"/>
+                    <w:noProof/>
+                  </w:rPr>
+                  <w:t>Melee Weapon Implementation</w:t>
+                </w:r>
+                <w:r>
+                  <w:rPr>
+                    <w:noProof/>
+                    <w:webHidden/>
+                  </w:rPr>
+                  <w:tab/>
+                </w:r>
+                <w:r>
+                  <w:rPr>
+                    <w:noProof/>
+                    <w:webHidden/>
+                  </w:rPr>
+                  <w:fldChar w:fldCharType="begin"/>
+                </w:r>
+                <w:r>
+                  <w:rPr>
+                    <w:noProof/>
+                    <w:webHidden/>
+                  </w:rPr>
+                  <w:instrText xml:space="preserve"> PAGEREF _Toc195799416 \h </w:instrText>
+                </w:r>
+                <w:r>
+                  <w:rPr>
+                    <w:noProof/>
+                    <w:webHidden/>
+                  </w:rPr>
+                </w:r>
+                <w:r>
+                  <w:rPr>
+                    <w:noProof/>
+                    <w:webHidden/>
+                  </w:rPr>
+                  <w:fldChar w:fldCharType="separate"/>
+                </w:r>
+                <w:r>
+                  <w:rPr>
+                    <w:noProof/>
+                    <w:webHidden/>
+                  </w:rPr>
+                  <w:t>4</w:t>
+                </w:r>
+                <w:r>
+                  <w:rPr>
+                    <w:noProof/>
+                    <w:webHidden/>
+                  </w:rPr>
+                  <w:fldChar w:fldCharType="end"/>
+                </w:r>
+              </w:hyperlink>
+            </w:p>
+            <w:p>
+              <w:pPr>
+                <w:pStyle w:val="TOC1"/>
+                <w:tabs>
+                  <w:tab w:val="right" w:leader="dot" w:pos="9016"/>
+                </w:tabs>
+                <w:rPr>
+                  <w:rFonts w:eastAsiaTheme="minorEastAsia"/>
+                  <w:noProof/>
+                  <w:lang w:eastAsia="en-GB"/>
+                </w:rPr>
+              </w:pPr>
+              <w:hyperlink w:anchor="_Toc195799417" w:history="1">
+                <w:r>
+                  <w:rPr>
+                    <w:rStyle w:val="Hyperlink"/>
+                    <w:noProof/>
+                  </w:rPr>
+                  <w:t>Damageable Entities</w:t>
+                </w:r>
+                <w:r>
+                  <w:rPr>
+                    <w:noProof/>
+                    <w:webHidden/>
+                  </w:rPr>
+                  <w:tab/>
+                </w:r>
+                <w:r>
+                  <w:rPr>
+                    <w:noProof/>
+                    <w:webHidden/>
+                  </w:rPr>
+                  <w:fldChar w:fldCharType="begin"/>
+                </w:r>
+                <w:r>
+                  <w:rPr>
+                    <w:noProof/>
+                    <w:webHidden/>
+                  </w:rPr>
+                  <w:instrText xml:space="preserve"> PAGEREF _Toc195799417 \h </w:instrText>
+                </w:r>
+                <w:r>
+                  <w:rPr>
+                    <w:noProof/>
+                    <w:webHidden/>
+                  </w:rPr>
+                </w:r>
+                <w:r>
+                  <w:rPr>
+                    <w:noProof/>
+                    <w:webHidden/>
+                  </w:rPr>
+                  <w:fldChar w:fldCharType="separate"/>
+                </w:r>
+                <w:r>
+                  <w:rPr>
+                    <w:noProof/>
+                    <w:webHidden/>
+                  </w:rPr>
+                  <w:t>4</w:t>
+                </w:r>
+                <w:r>
+                  <w:rPr>
+                    <w:noProof/>
+                    <w:webHidden/>
+                  </w:rPr>
+                  <w:fldChar w:fldCharType="end"/>
+                </w:r>
+              </w:hyperlink>
+            </w:p>
+            <w:p>
+              <w:pPr>
+                <w:pStyle w:val="TOC1"/>
+                <w:tabs>
+                  <w:tab w:val="right" w:leader="dot" w:pos="9016"/>
+                </w:tabs>
+                <w:rPr>
+                  <w:rFonts w:eastAsiaTheme="minorEastAsia"/>
+                  <w:noProof/>
+                  <w:lang w:eastAsia="en-GB"/>
+                </w:rPr>
+              </w:pPr>
+              <w:hyperlink w:anchor="_Toc195799418" w:history="1">
+                <w:r>
+                  <w:rPr>
+                    <w:rStyle w:val="Hyperlink"/>
+                    <w:noProof/>
+                  </w:rPr>
+                  <w:t>Animation</w:t>
+                </w:r>
+                <w:r>
+                  <w:rPr>
+                    <w:noProof/>
+                    <w:webHidden/>
+                  </w:rPr>
+                  <w:tab/>
+                </w:r>
+                <w:r>
+                  <w:rPr>
+                    <w:noProof/>
+                    <w:webHidden/>
+                  </w:rPr>
+                  <w:fldChar w:fldCharType="begin"/>
+                </w:r>
+                <w:r>
+                  <w:rPr>
+                    <w:noProof/>
+                    <w:webHidden/>
+                  </w:rPr>
+                  <w:instrText xml:space="preserve"> PAGEREF _Toc195799418 \h </w:instrText>
+                </w:r>
+                <w:r>
+                  <w:rPr>
+                    <w:noProof/>
+                    <w:webHidden/>
+                  </w:rPr>
+                </w:r>
+                <w:r>
+                  <w:rPr>
+                    <w:noProof/>
+                    <w:webHidden/>
+                  </w:rPr>
+                  <w:fldChar w:fldCharType="separate"/>
+                </w:r>
+                <w:r>
+                  <w:rPr>
+                    <w:noProof/>
+                    <w:webHidden/>
+                  </w:rPr>
+                  <w:t>4</w:t>
+                </w:r>
+                <w:r>
+                  <w:rPr>
+                    <w:noProof/>
+                    <w:webHidden/>
+                  </w:rPr>
+                  <w:fldChar w:fldCharType="end"/>
+                </w:r>
+              </w:hyperlink>
+            </w:p>
+            <w:p>
+              <w:pPr>
+                <w:pStyle w:val="TOC2"/>
+                <w:tabs>
+                  <w:tab w:val="right" w:leader="dot" w:pos="9016"/>
+                </w:tabs>
+                <w:rPr>
+                  <w:rFonts w:eastAsiaTheme="minorEastAsia"/>
+                  <w:noProof/>
+                  <w:lang w:eastAsia="en-GB"/>
+                </w:rPr>
+              </w:pPr>
+              <w:hyperlink w:anchor="_Toc195799419" w:history="1">
+                <w:r>
+                  <w:rPr>
+                    <w:rStyle w:val="Hyperlink"/>
+                    <w:noProof/>
+                  </w:rPr>
+                  <w:t>Research</w:t>
+                </w:r>
+                <w:r>
+                  <w:rPr>
+                    <w:noProof/>
+                    <w:webHidden/>
+                  </w:rPr>
+                  <w:tab/>
+                </w:r>
+                <w:r>
+                  <w:rPr>
+                    <w:noProof/>
+                    <w:webHidden/>
+                  </w:rPr>
+                  <w:fldChar w:fldCharType="begin"/>
+                </w:r>
+                <w:r>
+                  <w:rPr>
+                    <w:noProof/>
+                    <w:webHidden/>
+                  </w:rPr>
+                  <w:instrText xml:space="preserve"> PAGEREF _Toc195799419 \h </w:instrText>
+                </w:r>
+                <w:r>
+                  <w:rPr>
+                    <w:noProof/>
+                    <w:webHidden/>
+                  </w:rPr>
+                </w:r>
+                <w:r>
+                  <w:rPr>
+                    <w:noProof/>
+                    <w:webHidden/>
+                  </w:rPr>
+                  <w:fldChar w:fldCharType="separate"/>
+                </w:r>
+                <w:r>
+                  <w:rPr>
+                    <w:noProof/>
+                    <w:webHidden/>
+                  </w:rPr>
+                  <w:t>4</w:t>
+                </w:r>
+                <w:r>
+                  <w:rPr>
+                    <w:noProof/>
+                    <w:webHidden/>
+                  </w:rPr>
+                  <w:fldChar w:fldCharType="end"/>
+                </w:r>
+              </w:hyperlink>
+            </w:p>
+            <w:p>
+              <w:pPr>
+                <w:pStyle w:val="TOC2"/>
+                <w:tabs>
+                  <w:tab w:val="right" w:leader="dot" w:pos="9016"/>
+                </w:tabs>
+                <w:rPr>
+                  <w:rFonts w:eastAsiaTheme="minorEastAsia"/>
+                  <w:noProof/>
+                  <w:lang w:eastAsia="en-GB"/>
+                </w:rPr>
+              </w:pPr>
+              <w:hyperlink w:anchor="_Toc195799420" w:history="1">
+                <w:r>
+                  <w:rPr>
+                    <w:rStyle w:val="Hyperlink"/>
+                    <w:noProof/>
+                  </w:rPr>
+                  <w:t>Design</w:t>
+                </w:r>
+                <w:r>
+                  <w:rPr>
+                    <w:noProof/>
+                    <w:webHidden/>
+                  </w:rPr>
+                  <w:tab/>
+                </w:r>
+                <w:r>
+                  <w:rPr>
+                    <w:noProof/>
+                    <w:webHidden/>
+                  </w:rPr>
+                  <w:fldChar w:fldCharType="begin"/>
+                </w:r>
+                <w:r>
+                  <w:rPr>
+                    <w:noProof/>
+                    <w:webHidden/>
+                  </w:rPr>
+                  <w:instrText xml:space="preserve"> PAGEREF _Toc195799420 \h </w:instrText>
+                </w:r>
+                <w:r>
+                  <w:rPr>
+                    <w:noProof/>
+                    <w:webHidden/>
+                  </w:rPr>
+                </w:r>
+                <w:r>
+                  <w:rPr>
+                    <w:noProof/>
+                    <w:webHidden/>
+                  </w:rPr>
+                  <w:fldChar w:fldCharType="separate"/>
+                </w:r>
+                <w:r>
+                  <w:rPr>
+                    <w:noProof/>
+                    <w:webHidden/>
+                  </w:rPr>
+                  <w:t>5</w:t>
+                </w:r>
+                <w:r>
+                  <w:rPr>
+                    <w:noProof/>
+                    <w:webHidden/>
+                  </w:rPr>
+                  <w:fldChar w:fldCharType="end"/>
+                </w:r>
+              </w:hyperlink>
+            </w:p>
+            <w:p>
+              <w:pPr>
+                <w:pStyle w:val="TOC3"/>
+                <w:tabs>
+                  <w:tab w:val="right" w:leader="dot" w:pos="9016"/>
+                </w:tabs>
+                <w:rPr>
+                  <w:rFonts w:eastAsiaTheme="minorEastAsia"/>
+                  <w:noProof/>
+                  <w:lang w:eastAsia="en-GB"/>
+                </w:rPr>
+              </w:pPr>
+              <w:hyperlink w:anchor="_Toc195799421" w:history="1">
+                <w:r>
+                  <w:rPr>
+                    <w:rStyle w:val="Hyperlink"/>
+                    <w:noProof/>
+                  </w:rPr>
+                  <w:t>Lower Body</w:t>
+                </w:r>
+                <w:r>
+                  <w:rPr>
+                    <w:noProof/>
+                    <w:webHidden/>
+                  </w:rPr>
+                  <w:tab/>
+                </w:r>
+                <w:r>
+                  <w:rPr>
+                    <w:noProof/>
+                    <w:webHidden/>
+                  </w:rPr>
+                  <w:fldChar w:fldCharType="begin"/>
+                </w:r>
+                <w:r>
+                  <w:rPr>
+                    <w:noProof/>
+                    <w:webHidden/>
+                  </w:rPr>
+                  <w:instrText xml:space="preserve"> PAGEREF _Toc195799421 \h </w:instrText>
+                </w:r>
+                <w:r>
+                  <w:rPr>
+                    <w:noProof/>
+                    <w:webHidden/>
+                  </w:rPr>
+                </w:r>
+                <w:r>
+                  <w:rPr>
+                    <w:noProof/>
+                    <w:webHidden/>
+                  </w:rPr>
+                  <w:fldChar w:fldCharType="separate"/>
+                </w:r>
+                <w:r>
+                  <w:rPr>
+                    <w:noProof/>
+                    <w:webHidden/>
+                  </w:rPr>
+                  <w:t>5</w:t>
+                </w:r>
+                <w:r>
+                  <w:rPr>
+                    <w:noProof/>
+                    <w:webHidden/>
+                  </w:rPr>
+                  <w:fldChar w:fldCharType="end"/>
+                </w:r>
+              </w:hyperlink>
+            </w:p>
+            <w:p>
+              <w:pPr>
+                <w:pStyle w:val="TOC3"/>
+                <w:tabs>
+                  <w:tab w:val="right" w:leader="dot" w:pos="9016"/>
+                </w:tabs>
+                <w:rPr>
+                  <w:rFonts w:eastAsiaTheme="minorEastAsia"/>
+                  <w:noProof/>
+                  <w:lang w:eastAsia="en-GB"/>
+                </w:rPr>
+              </w:pPr>
+              <w:hyperlink w:anchor="_Toc195799422" w:history="1">
+                <w:r>
+                  <w:rPr>
+                    <w:rStyle w:val="Hyperlink"/>
+                    <w:noProof/>
+                  </w:rPr>
+                  <w:t>Upper Body</w:t>
+                </w:r>
+                <w:r>
+                  <w:rPr>
+                    <w:noProof/>
+                    <w:webHidden/>
+                  </w:rPr>
+                  <w:tab/>
+                </w:r>
+                <w:r>
+                  <w:rPr>
+                    <w:noProof/>
+                    <w:webHidden/>
+                  </w:rPr>
+                  <w:fldChar w:fldCharType="begin"/>
+                </w:r>
+                <w:r>
+                  <w:rPr>
+                    <w:noProof/>
+                    <w:webHidden/>
+                  </w:rPr>
+                  <w:instrText xml:space="preserve"> PAGEREF _Toc195799422 \h </w:instrText>
+                </w:r>
+                <w:r>
+                  <w:rPr>
+                    <w:noProof/>
+                    <w:webHidden/>
+                  </w:rPr>
+                </w:r>
+                <w:r>
+                  <w:rPr>
+                    <w:noProof/>
+                    <w:webHidden/>
+                  </w:rPr>
+                  <w:fldChar w:fldCharType="separate"/>
+                </w:r>
+                <w:r>
+                  <w:rPr>
+                    <w:noProof/>
+                    <w:webHidden/>
+                  </w:rPr>
+                  <w:t>5</w:t>
+                </w:r>
+                <w:r>
+                  <w:rPr>
+                    <w:noProof/>
+                    <w:webHidden/>
+                  </w:rPr>
+                  <w:fldChar w:fldCharType="end"/>
+                </w:r>
+              </w:hyperlink>
+            </w:p>
+            <w:p>
+              <w:pPr>
+                <w:pStyle w:val="TOC3"/>
+                <w:tabs>
+                  <w:tab w:val="right" w:leader="dot" w:pos="9016"/>
+                </w:tabs>
+                <w:rPr>
+                  <w:rFonts w:eastAsiaTheme="minorEastAsia"/>
+                  <w:noProof/>
+                  <w:lang w:eastAsia="en-GB"/>
+                </w:rPr>
+              </w:pPr>
+              <w:hyperlink w:anchor="_Toc195799423" w:history="1">
+                <w:r>
+                  <w:rPr>
+                    <w:rStyle w:val="Hyperlink"/>
+                    <w:noProof/>
+                  </w:rPr>
+                  <w:t>Weapon Target</w:t>
+                </w:r>
+                <w:r>
+                  <w:rPr>
+                    <w:noProof/>
+                    <w:webHidden/>
+                  </w:rPr>
+                  <w:tab/>
+                </w:r>
+                <w:r>
+                  <w:rPr>
+                    <w:noProof/>
+                    <w:webHidden/>
+                  </w:rPr>
+                  <w:fldChar w:fldCharType="begin"/>
+                </w:r>
+                <w:r>
+                  <w:rPr>
+                    <w:noProof/>
+                    <w:webHidden/>
+                  </w:rPr>
+                  <w:instrText xml:space="preserve"> PAGEREF _Toc195799423 \h </w:instrText>
+                </w:r>
+                <w:r>
+                  <w:rPr>
+                    <w:noProof/>
+                    <w:webHidden/>
+                  </w:rPr>
+                </w:r>
+                <w:r>
+                  <w:rPr>
+                    <w:noProof/>
+                    <w:webHidden/>
+                  </w:rPr>
+                  <w:fldChar w:fldCharType="separate"/>
+                </w:r>
+                <w:r>
+                  <w:rPr>
+                    <w:noProof/>
+                    <w:webHidden/>
+                  </w:rPr>
+                  <w:t>5</w:t>
+                </w:r>
+                <w:r>
+                  <w:rPr>
+                    <w:noProof/>
+                    <w:webHidden/>
+                  </w:rPr>
+                  <w:fldChar w:fldCharType="end"/>
+                </w:r>
+              </w:hyperlink>
+            </w:p>
+            <w:p>
+              <w:pPr>
+                <w:pStyle w:val="TOC3"/>
+                <w:tabs>
+                  <w:tab w:val="right" w:leader="dot" w:pos="9016"/>
+                </w:tabs>
+                <w:rPr>
+                  <w:rFonts w:eastAsiaTheme="minorEastAsia"/>
+                  <w:noProof/>
+                  <w:lang w:eastAsia="en-GB"/>
+                </w:rPr>
+              </w:pPr>
+              <w:hyperlink w:anchor="_Toc195799424" w:history="1">
+                <w:r>
+                  <w:rPr>
+                    <w:rStyle w:val="Hyperlink"/>
+                    <w:noProof/>
+                  </w:rPr>
+                  <w:t>Weapon Rigs</w:t>
+                </w:r>
+                <w:r>
+                  <w:rPr>
+                    <w:noProof/>
+                    <w:webHidden/>
+                  </w:rPr>
+                  <w:tab/>
+                </w:r>
+                <w:r>
+                  <w:rPr>
+                    <w:noProof/>
+                    <w:webHidden/>
+                  </w:rPr>
+                  <w:fldChar w:fldCharType="begin"/>
+                </w:r>
+                <w:r>
+                  <w:rPr>
+                    <w:noProof/>
+                    <w:webHidden/>
+                  </w:rPr>
+                  <w:instrText xml:space="preserve"> PAGEREF _Toc195799424 \h </w:instrText>
+                </w:r>
+                <w:r>
+                  <w:rPr>
+                    <w:noProof/>
+                    <w:webHidden/>
+                  </w:rPr>
+                </w:r>
+                <w:r>
+                  <w:rPr>
+                    <w:noProof/>
+                    <w:webHidden/>
+                  </w:rPr>
+                  <w:fldChar w:fldCharType="separate"/>
+                </w:r>
+                <w:r>
+                  <w:rPr>
+                    <w:noProof/>
+                    <w:webHidden/>
+                  </w:rPr>
+                  <w:t>6</w:t>
+                </w:r>
+                <w:r>
+                  <w:rPr>
+                    <w:noProof/>
+                    <w:webHidden/>
+                  </w:rPr>
+                  <w:fldChar w:fldCharType="end"/>
+                </w:r>
+              </w:hyperlink>
+            </w:p>
+            <w:p>
+              <w:pPr>
+                <w:pStyle w:val="TOC2"/>
+                <w:tabs>
+                  <w:tab w:val="right" w:leader="dot" w:pos="9016"/>
+                </w:tabs>
+                <w:rPr>
+                  <w:rFonts w:eastAsiaTheme="minorEastAsia"/>
+                  <w:noProof/>
+                  <w:lang w:eastAsia="en-GB"/>
+                </w:rPr>
+              </w:pPr>
+              <w:hyperlink w:anchor="_Toc195799425" w:history="1">
+                <w:r>
+                  <w:rPr>
+                    <w:rStyle w:val="Hyperlink"/>
+                    <w:noProof/>
+                  </w:rPr>
+                  <w:t>Import Pipeline</w:t>
+                </w:r>
+                <w:r>
+                  <w:rPr>
+                    <w:noProof/>
+                    <w:webHidden/>
+                  </w:rPr>
+                  <w:tab/>
+                </w:r>
+                <w:r>
+                  <w:rPr>
+                    <w:noProof/>
+                    <w:webHidden/>
+                  </w:rPr>
+                  <w:fldChar w:fldCharType="begin"/>
+                </w:r>
+                <w:r>
+                  <w:rPr>
+                    <w:noProof/>
+                    <w:webHidden/>
+                  </w:rPr>
+                  <w:instrText xml:space="preserve"> PAGEREF _Toc195799425 \h </w:instrText>
+                </w:r>
+                <w:r>
+                  <w:rPr>
+                    <w:noProof/>
+                    <w:webHidden/>
+                  </w:rPr>
+                </w:r>
+                <w:r>
+                  <w:rPr>
+                    <w:noProof/>
+                    <w:webHidden/>
+                  </w:rPr>
+                  <w:fldChar w:fldCharType="separate"/>
+                </w:r>
+                <w:r>
+                  <w:rPr>
+                    <w:noProof/>
+                    <w:webHidden/>
+                  </w:rPr>
+                  <w:t>6</w:t>
+                </w:r>
+                <w:r>
+                  <w:rPr>
+                    <w:noProof/>
+                    <w:webHidden/>
+                  </w:rPr>
+                  <w:fldChar w:fldCharType="end"/>
+                </w:r>
+              </w:hyperlink>
+            </w:p>
+            <w:p>
+              <w:pPr>
+                <w:pStyle w:val="TOC3"/>
+                <w:tabs>
+                  <w:tab w:val="right" w:leader="dot" w:pos="9016"/>
+                </w:tabs>
+                <w:rPr>
+                  <w:rFonts w:eastAsiaTheme="minorEastAsia"/>
+                  <w:noProof/>
+                  <w:lang w:eastAsia="en-GB"/>
+                </w:rPr>
+              </w:pPr>
+              <w:hyperlink w:anchor="_Toc195799426" w:history="1">
+                <w:r>
+                  <w:rPr>
+                    <w:rStyle w:val="Hyperlink"/>
+                    <w:noProof/>
+                  </w:rPr>
+                  <w:t>Character Animations</w:t>
+                </w:r>
+                <w:r>
+                  <w:rPr>
+                    <w:noProof/>
+                    <w:webHidden/>
+                  </w:rPr>
+                  <w:tab/>
+                </w:r>
+                <w:r>
+                  <w:rPr>
+                    <w:noProof/>
+                    <w:webHidden/>
+                  </w:rPr>
+                  <w:fldChar w:fldCharType="begin"/>
+                </w:r>
+                <w:r>
+                  <w:rPr>
+                    <w:noProof/>
+                    <w:webHidden/>
+                  </w:rPr>
+                  <w:instrText xml:space="preserve"> PAGEREF _Toc195799426 \h </w:instrText>
+                </w:r>
+                <w:r>
+                  <w:rPr>
+                    <w:noProof/>
+                    <w:webHidden/>
+                  </w:rPr>
+                </w:r>
+                <w:r>
+                  <w:rPr>
+                    <w:noProof/>
+                    <w:webHidden/>
+                  </w:rPr>
+                  <w:fldChar w:fldCharType="separate"/>
+                </w:r>
+                <w:r>
+                  <w:rPr>
+                    <w:noProof/>
+                    <w:webHidden/>
+                  </w:rPr>
+                  <w:t>6</w:t>
+                </w:r>
+                <w:r>
+                  <w:rPr>
+                    <w:noProof/>
+                    <w:webHidden/>
+                  </w:rPr>
+                  <w:fldChar w:fldCharType="end"/>
+                </w:r>
+              </w:hyperlink>
+            </w:p>
+            <w:p>
+              <w:pPr>
+                <w:pStyle w:val="TOC3"/>
+                <w:tabs>
+                  <w:tab w:val="right" w:leader="dot" w:pos="9016"/>
+                </w:tabs>
+                <w:rPr>
+                  <w:rFonts w:eastAsiaTheme="minorEastAsia"/>
+                  <w:noProof/>
+                  <w:lang w:eastAsia="en-GB"/>
+                </w:rPr>
+              </w:pPr>
+              <w:hyperlink w:anchor="_Toc195799427" w:history="1">
+                <w:r>
+                  <w:rPr>
+                    <w:rStyle w:val="Hyperlink"/>
+                    <w:noProof/>
+                  </w:rPr>
+                  <w:t>Weapon Animations</w:t>
+                </w:r>
+                <w:r>
+                  <w:rPr>
+                    <w:noProof/>
+                    <w:webHidden/>
+                  </w:rPr>
+                  <w:tab/>
+                </w:r>
+                <w:r>
+                  <w:rPr>
+                    <w:noProof/>
+                    <w:webHidden/>
+                  </w:rPr>
+                  <w:fldChar w:fldCharType="begin"/>
+                </w:r>
+                <w:r>
+                  <w:rPr>
+                    <w:noProof/>
+                    <w:webHidden/>
+                  </w:rPr>
+                  <w:instrText xml:space="preserve"> PAGEREF _Toc195799427 \h </w:instrText>
+                </w:r>
+                <w:r>
+                  <w:rPr>
+                    <w:noProof/>
+                    <w:webHidden/>
+                  </w:rPr>
+                </w:r>
+                <w:r>
+                  <w:rPr>
+                    <w:noProof/>
+                    <w:webHidden/>
+                  </w:rPr>
+                  <w:fldChar w:fldCharType="separate"/>
+                </w:r>
+                <w:r>
+                  <w:rPr>
+                    <w:noProof/>
+                    <w:webHidden/>
+                  </w:rPr>
+                  <w:t>6</w:t>
+                </w:r>
+                <w:r>
+                  <w:rPr>
+                    <w:noProof/>
+                    <w:webHidden/>
+                  </w:rPr>
+                  <w:fldChar w:fldCharType="end"/>
+                </w:r>
+              </w:hyperlink>
+            </w:p>
+            <w:p>
+              <w:pPr>
+                <w:pStyle w:val="TOC2"/>
+                <w:tabs>
+                  <w:tab w:val="right" w:leader="dot" w:pos="9016"/>
+                </w:tabs>
+                <w:rPr>
+                  <w:rFonts w:eastAsiaTheme="minorEastAsia"/>
+                  <w:noProof/>
+                  <w:lang w:eastAsia="en-GB"/>
+                </w:rPr>
+              </w:pPr>
+              <w:hyperlink w:anchor="_Toc195799428" w:history="1">
+                <w:r>
+                  <w:rPr>
+                    <w:rStyle w:val="Hyperlink"/>
+                    <w:noProof/>
+                  </w:rPr>
+                  <w:t>Implementation</w:t>
+                </w:r>
+                <w:r>
+                  <w:rPr>
+                    <w:noProof/>
+                    <w:webHidden/>
+                  </w:rPr>
+                  <w:tab/>
+                </w:r>
+                <w:r>
+                  <w:rPr>
+                    <w:noProof/>
+                    <w:webHidden/>
+                  </w:rPr>
+                  <w:fldChar w:fldCharType="begin"/>
+                </w:r>
+                <w:r>
+                  <w:rPr>
+                    <w:noProof/>
+                    <w:webHidden/>
+                  </w:rPr>
+                  <w:instrText xml:space="preserve"> PAGEREF _Toc195799428 \h </w:instrText>
+                </w:r>
+                <w:r>
+                  <w:rPr>
+                    <w:noProof/>
+                    <w:webHidden/>
+                  </w:rPr>
+                </w:r>
+                <w:r>
+                  <w:rPr>
+                    <w:noProof/>
+                    <w:webHidden/>
+                  </w:rPr>
+                  <w:fldChar w:fldCharType="separate"/>
+                </w:r>
+                <w:r>
+                  <w:rPr>
+                    <w:noProof/>
+                    <w:webHidden/>
+                  </w:rPr>
+                  <w:t>6</w:t>
+                </w:r>
+                <w:r>
+                  <w:rPr>
+                    <w:noProof/>
+                    <w:webHidden/>
+                  </w:rPr>
+                  <w:fldChar w:fldCharType="end"/>
+                </w:r>
+              </w:hyperlink>
+            </w:p>
+            <w:p>
+              <w:pPr>
+                <w:pStyle w:val="TOC1"/>
+                <w:tabs>
+                  <w:tab w:val="right" w:leader="dot" w:pos="9016"/>
+                </w:tabs>
+                <w:rPr>
+                  <w:rFonts w:eastAsiaTheme="minorEastAsia"/>
+                  <w:noProof/>
+                  <w:lang w:eastAsia="en-GB"/>
+                </w:rPr>
+              </w:pPr>
+              <w:hyperlink w:anchor="_Toc195799429" w:history="1">
+                <w:r>
+                  <w:rPr>
+                    <w:rStyle w:val="Hyperlink"/>
+                    <w:noProof/>
+                  </w:rPr>
+                  <w:t>Character Controller Interoperability</w:t>
+                </w:r>
+                <w:r>
+                  <w:rPr>
+                    <w:noProof/>
+                    <w:webHidden/>
+                  </w:rPr>
+                  <w:tab/>
+                </w:r>
+                <w:r>
+                  <w:rPr>
+                    <w:noProof/>
+                    <w:webHidden/>
+                  </w:rPr>
+                  <w:fldChar w:fldCharType="begin"/>
+                </w:r>
+                <w:r>
+                  <w:rPr>
+                    <w:noProof/>
+                    <w:webHidden/>
+                  </w:rPr>
+                  <w:instrText xml:space="preserve"> PAGEREF _Toc195799429 \h </w:instrText>
+                </w:r>
+                <w:r>
+                  <w:rPr>
+                    <w:noProof/>
+                    <w:webHidden/>
+                  </w:rPr>
+                </w:r>
+                <w:r>
+                  <w:rPr>
+                    <w:noProof/>
+                    <w:webHidden/>
+                  </w:rPr>
+                  <w:fldChar w:fldCharType="separate"/>
+                </w:r>
+                <w:r>
+                  <w:rPr>
+                    <w:noProof/>
+                    <w:webHidden/>
+                  </w:rPr>
+                  <w:t>6</w:t>
+                </w:r>
+                <w:r>
+                  <w:rPr>
+                    <w:noProof/>
+                    <w:webHidden/>
+                  </w:rPr>
+                  <w:fldChar w:fldCharType="end"/>
+                </w:r>
+              </w:hyperlink>
+            </w:p>
+            <w:p>
+              <w:pPr>
+                <w:pStyle w:val="TOC1"/>
+                <w:tabs>
+                  <w:tab w:val="right" w:leader="dot" w:pos="9016"/>
+                </w:tabs>
+                <w:rPr>
+                  <w:rFonts w:eastAsiaTheme="minorEastAsia"/>
+                  <w:noProof/>
+                  <w:lang w:eastAsia="en-GB"/>
+                </w:rPr>
+              </w:pPr>
+              <w:hyperlink w:anchor="_Toc195799430" w:history="1">
+                <w:r>
+                  <w:rPr>
+                    <w:rStyle w:val="Hyperlink"/>
+                    <w:noProof/>
+                  </w:rPr>
+                  <w:t>Rendering Wizardry</w:t>
+                </w:r>
+                <w:r>
+                  <w:rPr>
+                    <w:noProof/>
+                    <w:webHidden/>
+                  </w:rPr>
+                  <w:tab/>
+                </w:r>
+                <w:r>
+                  <w:rPr>
+                    <w:noProof/>
+                    <w:webHidden/>
+                  </w:rPr>
+                  <w:fldChar w:fldCharType="begin"/>
+                </w:r>
+                <w:r>
+                  <w:rPr>
+                    <w:noProof/>
+                    <w:webHidden/>
+                  </w:rPr>
+                  <w:instrText xml:space="preserve"> PAGEREF _Toc195799430 \h </w:instrText>
+                </w:r>
+                <w:r>
+                  <w:rPr>
+                    <w:noProof/>
+                    <w:webHidden/>
+                  </w:rPr>
+                </w:r>
+                <w:r>
+                  <w:rPr>
+                    <w:noProof/>
+                    <w:webHidden/>
+                  </w:rPr>
+                  <w:fldChar w:fldCharType="separate"/>
+                </w:r>
+                <w:r>
+                  <w:rPr>
+                    <w:noProof/>
+                    <w:webHidden/>
+                  </w:rPr>
+                  <w:t>6</w:t>
+                </w:r>
+                <w:r>
+                  <w:rPr>
+                    <w:noProof/>
+                    <w:webHidden/>
+                  </w:rPr>
+                  <w:fldChar w:fldCharType="end"/>
+                </w:r>
+              </w:hyperlink>
+            </w:p>
+            <w:p>
+              <w:pPr>
+                <w:pStyle w:val="TOC2"/>
+                <w:tabs>
+                  <w:tab w:val="right" w:leader="dot" w:pos="9016"/>
+                </w:tabs>
+                <w:rPr>
+                  <w:rFonts w:eastAsiaTheme="minorEastAsia"/>
+                  <w:noProof/>
+                  <w:lang w:eastAsia="en-GB"/>
+                </w:rPr>
+              </w:pPr>
+              <w:hyperlink w:anchor="_Toc195799431" w:history="1">
+                <w:r>
+                  <w:rPr>
+                    <w:rStyle w:val="Hyperlink"/>
+                    <w:noProof/>
+                  </w:rPr>
+                  <w:t>Camera Trickery</w:t>
+                </w:r>
+                <w:r>
+                  <w:rPr>
+                    <w:noProof/>
+                    <w:webHidden/>
+                  </w:rPr>
+                  <w:tab/>
+                </w:r>
+                <w:r>
+                  <w:rPr>
+                    <w:noProof/>
+                    <w:webHidden/>
+                  </w:rPr>
+                  <w:fldChar w:fldCharType="begin"/>
+                </w:r>
+                <w:r>
+                  <w:rPr>
+                    <w:noProof/>
+                    <w:webHidden/>
+                  </w:rPr>
+                  <w:instrText xml:space="preserve"> PAGEREF _Toc195799431 \h </w:instrText>
+                </w:r>
+                <w:r>
+                  <w:rPr>
+                    <w:noProof/>
+                    <w:webHidden/>
+                  </w:rPr>
+                </w:r>
+                <w:r>
+                  <w:rPr>
+                    <w:noProof/>
+                    <w:webHidden/>
+                  </w:rPr>
+                  <w:fldChar w:fldCharType="separate"/>
+                </w:r>
+                <w:r>
+                  <w:rPr>
+                    <w:noProof/>
+                    <w:webHidden/>
+                  </w:rPr>
+                  <w:t>6</w:t>
+                </w:r>
+                <w:r>
+                  <w:rPr>
+                    <w:noProof/>
+                    <w:webHidden/>
+                  </w:rPr>
+                  <w:fldChar w:fldCharType="end"/>
+                </w:r>
+              </w:hyperlink>
+            </w:p>
+            <w:p>
+              <w:pPr>
+                <w:pStyle w:val="TOC2"/>
+                <w:tabs>
+                  <w:tab w:val="right" w:leader="dot" w:pos="9016"/>
+                </w:tabs>
+                <w:rPr>
+                  <w:rFonts w:eastAsiaTheme="minorEastAsia"/>
+                  <w:noProof/>
+                  <w:lang w:eastAsia="en-GB"/>
+                </w:rPr>
+              </w:pPr>
+              <w:hyperlink w:anchor="_Toc195799432" w:history="1">
+                <w:r>
+                  <w:rPr>
+                    <w:rStyle w:val="Hyperlink"/>
+                    <w:noProof/>
+                  </w:rPr>
+                  <w:t>Shader Magic</w:t>
+                </w:r>
+                <w:r>
+                  <w:rPr>
+                    <w:noProof/>
+                    <w:webHidden/>
+                  </w:rPr>
+                  <w:tab/>
+                </w:r>
+                <w:r>
+                  <w:rPr>
+                    <w:noProof/>
+                    <w:webHidden/>
+                  </w:rPr>
+                  <w:fldChar w:fldCharType="begin"/>
+                </w:r>
+                <w:r>
+                  <w:rPr>
+                    <w:noProof/>
+                    <w:webHidden/>
+                  </w:rPr>
+                  <w:instrText xml:space="preserve"> PAGEREF _Toc195799432 \h </w:instrText>
+                </w:r>
+                <w:r>
+                  <w:rPr>
+                    <w:noProof/>
+                    <w:webHidden/>
+                  </w:rPr>
+                </w:r>
+                <w:r>
+                  <w:rPr>
+                    <w:noProof/>
+                    <w:webHidden/>
+                  </w:rPr>
+                  <w:fldChar w:fldCharType="separate"/>
+                </w:r>
+                <w:r>
+                  <w:rPr>
+                    <w:noProof/>
+                    <w:webHidden/>
+                  </w:rPr>
+                  <w:t>6</w:t>
+                </w:r>
+                <w:r>
+                  <w:rPr>
+                    <w:noProof/>
+                    <w:webHidden/>
+                  </w:rPr>
+                  <w:fldChar w:fldCharType="end"/>
+                </w:r>
+              </w:hyperlink>
+            </w:p>
+            <w:p>
+              <w:r>
+                <w:rPr>
+                  <w:b/>
+                  <w:bCs/>
+                </w:rPr>
+                <w:fldChar w:fldCharType="end"/>
+              </w:r>
+            </w:p>
+          </w:sdtContent>
+        </w:sdt>
+        <w:p>
+          <w:r>
+            <w:br w:type="page"/>
+          </w:r>
+        </w:p>
+        <w:p/>
       </w:sdtContent>
     </w:sdt>
     <w:p>
       <w:pPr>
         <w:pStyle w:val="Heading1"/>
       </w:pPr>
-      <w:r>
-        <w:lastRenderedPageBreak/>
+      <w:bookmarkStart w:id="0" w:name="_Toc195799408"/>
+      <w:r>
         <w:t>Aims of the project</w:t>
       </w:r>
+      <w:bookmarkEnd w:id="0"/>
     </w:p>
     <w:p>
       <w:r>
@@ -569,25 +2376,31 @@
       <w:pPr>
         <w:pStyle w:val="Heading1"/>
       </w:pPr>
+      <w:bookmarkStart w:id="1" w:name="_Toc195799409"/>
       <w:r>
         <w:t>Planned Features</w:t>
       </w:r>
+      <w:bookmarkEnd w:id="1"/>
     </w:p>
     <w:p>
       <w:pPr>
         <w:pStyle w:val="Heading2"/>
       </w:pPr>
+      <w:bookmarkStart w:id="2" w:name="_Toc195799410"/>
       <w:r>
         <w:t>Weapon Implementation</w:t>
       </w:r>
+      <w:bookmarkEnd w:id="2"/>
     </w:p>
     <w:p>
       <w:pPr>
         <w:pStyle w:val="Heading3"/>
       </w:pPr>
+      <w:bookmarkStart w:id="3" w:name="_Toc195799411"/>
       <w:r>
         <w:t>Firearms</w:t>
       </w:r>
+      <w:bookmarkEnd w:id="3"/>
     </w:p>
     <w:p>
       <w:r>
@@ -616,7 +2429,15 @@
     </w:p>
     <w:p>
       <w:r>
-        <w:t xml:space="preserve">Hitscan Firearms will fire an imaginary “ray” called a “raycast.” This ray checks along the path </w:t>
+        <w:t>Hitscan Firearms will fire an imaginary “ray” called a “</w:t>
+      </w:r>
+      <w:proofErr w:type="spellStart"/>
+      <w:r>
+        <w:t>raycast</w:t>
+      </w:r>
+      <w:proofErr w:type="spellEnd"/>
+      <w:r>
+        <w:t xml:space="preserve">.” This ray checks along the path </w:t>
       </w:r>
       <w:r>
         <w:t>from the origin of the attack to an endpoint</w:t>
@@ -635,58 +2456,67 @@
     </w:p>
     <w:p>
       <w:r>
-        <w:t xml:space="preserve">Projectile Firearms will fire a rigidbody projectile (an object with physics). These projectiles will react to other objects in the game world, will be able to bounce </w:t>
+        <w:t xml:space="preserve">Projectile Firearms will fire a </w:t>
+      </w:r>
+      <w:proofErr w:type="spellStart"/>
+      <w:r>
+        <w:t>rigidbody</w:t>
+      </w:r>
+      <w:proofErr w:type="spellEnd"/>
+      <w:r>
+        <w:t xml:space="preserve"> projectile (an object with physics). These projectiles will react to other objects in the game world, will be able to bounce </w:t>
       </w:r>
       <w:r>
         <w:t>off</w:t>
       </w:r>
       <w:r>
-        <w:t xml:space="preserve"> walls, and can be affected by anything that might affect any rigidbodies in the scene.</w:t>
+        <w:t xml:space="preserve"> walls, and can be affected by anything that might affect any </w:t>
+      </w:r>
+      <w:proofErr w:type="spellStart"/>
+      <w:r>
+        <w:t>rigidbodies</w:t>
+      </w:r>
+      <w:proofErr w:type="spellEnd"/>
+      <w:r>
+        <w:t xml:space="preserve"> in the scene.</w:t>
       </w:r>
     </w:p>
     <w:p>
       <w:pPr>
         <w:pStyle w:val="Heading3"/>
       </w:pPr>
+      <w:bookmarkStart w:id="4" w:name="_Toc195799412"/>
       <w:r>
         <w:t>Melee</w:t>
       </w:r>
-    </w:p>
-    <w:p>
-      <w:r>
-        <w:t xml:space="preserve">Melee weapons will trace between two points each fixed timestep by storing their last position and performing a linecast between those two points, ensuring that no targets are missed between strikes. To ensure that targets are not missed due to being too close, the system will also cast outwards from the player to the end of the weapon along </w:t>
+      <w:bookmarkEnd w:id="4"/>
+    </w:p>
+    <w:p>
+      <w:r>
+        <w:t xml:space="preserve">Melee weapons will trace between two points each fixed timestep by storing their last position and performing a </w:t>
+      </w:r>
+      <w:proofErr w:type="spellStart"/>
+      <w:r>
+        <w:t>linecast</w:t>
+      </w:r>
+      <w:proofErr w:type="spellEnd"/>
+      <w:r>
+        <w:t xml:space="preserve"> between those two points, ensuring that no targets </w:t>
       </w:r>
       <w:r>
         <w:lastRenderedPageBreak/>
-        <w:t>the path of the strike. Anything that can be damage will be cached and ignored by further traces until the attack has ended.</w:t>
+        <w:t>are missed between strikes. To ensure that targets are not missed due to being too close, the system will also cast outwards from the player to the end of the weapon along the path of the strike. Anything that can be damage will be cached and ignored by further traces until the attack has ended.</w:t>
       </w:r>
     </w:p>
     <w:p>
       <w:pPr>
         <w:pStyle w:val="Heading1"/>
       </w:pPr>
-    </w:p>
-    <w:p>
-      <w:pPr>
-        <w:rPr>
-          <w:rFonts w:asciiTheme="majorHAnsi" w:eastAsiaTheme="majorEastAsia" w:hAnsiTheme="majorHAnsi" w:cstheme="majorBidi"/>
-          <w:color w:val="0F4761" w:themeColor="accent1" w:themeShade="BF"/>
-          <w:sz w:val="40"/>
-          <w:szCs w:val="40"/>
-        </w:rPr>
-      </w:pPr>
-      <w:r>
-        <w:br w:type="page"/>
-      </w:r>
-    </w:p>
-    <w:p>
-      <w:pPr>
-        <w:pStyle w:val="Heading1"/>
-      </w:pPr>
-      <w:r>
-        <w:lastRenderedPageBreak/>
+      <w:bookmarkStart w:id="5" w:name="_Toc195799413"/>
+      <w:r>
         <w:t>Raycast Commands &amp; Bullet Scheduling</w:t>
       </w:r>
+      <w:bookmarkEnd w:id="5"/>
     </w:p>
     <w:p>
       <w:r>
@@ -702,12 +2532,44 @@
         <w:t>.</w:t>
       </w:r>
       <w:r>
-        <w:t xml:space="preserve"> There is also an additional performance impact from the normalisation of the fire vector, since RaycastCommands will not accept a vector that is not normalised.</w:t>
-      </w:r>
-    </w:p>
-    <w:p>
-      <w:r>
-        <w:t>In its first iteration, the system used two lists of a BulletData struct, used to determine some information about the “bullets.” A Native Array of RaycastCommands and RaycastHits is currently used to store the information needed by the Raycast batch.</w:t>
+        <w:t xml:space="preserve"> There is also an additional performance impact from the normalisation of the fire vector, since </w:t>
+      </w:r>
+      <w:proofErr w:type="spellStart"/>
+      <w:r>
+        <w:t>RaycastCommands</w:t>
+      </w:r>
+      <w:proofErr w:type="spellEnd"/>
+      <w:r>
+        <w:t xml:space="preserve"> will not accept a vector that is not normalised.</w:t>
+      </w:r>
+    </w:p>
+    <w:p>
+      <w:r>
+        <w:t xml:space="preserve">In its first iteration, the system used two lists of a </w:t>
+      </w:r>
+      <w:proofErr w:type="spellStart"/>
+      <w:r>
+        <w:t>BulletData</w:t>
+      </w:r>
+      <w:proofErr w:type="spellEnd"/>
+      <w:r>
+        <w:t xml:space="preserve"> struct, used to determine some information about the “bullets.” A Native Array of </w:t>
+      </w:r>
+      <w:proofErr w:type="spellStart"/>
+      <w:r>
+        <w:t>RaycastCommands</w:t>
+      </w:r>
+      <w:proofErr w:type="spellEnd"/>
+      <w:r>
+        <w:t xml:space="preserve"> and </w:t>
+      </w:r>
+      <w:proofErr w:type="spellStart"/>
+      <w:r>
+        <w:t>RaycastHits</w:t>
+      </w:r>
+      <w:proofErr w:type="spellEnd"/>
+      <w:r>
+        <w:t xml:space="preserve"> is currently used to store the information needed by the Raycast batch.</w:t>
       </w:r>
     </w:p>
     <w:p>
@@ -729,23 +2591,57 @@
       <w:pPr>
         <w:pStyle w:val="Heading3"/>
       </w:pPr>
+      <w:bookmarkStart w:id="6" w:name="_Toc195799414"/>
       <w:r>
         <w:t>Test Conditions</w:t>
       </w:r>
-    </w:p>
-    <w:p>
-      <w:r>
-        <w:t>In the scene, there is a camera for rendering, the Input Manager that the player uses, a Rigidbody with a hinge joint placed in front of the test weapon, and the test weapon itself.</w:t>
-      </w:r>
-    </w:p>
-    <w:p>
-      <w:r>
-        <w:t>The test weapon fires a variable number of raycasts every frame, with an optional divergence. The divergence is a maximum measure, divided by 2, of how perpendicular the fire vector can be to the forward vector of the weapon.</w:t>
-      </w:r>
-    </w:p>
-    <w:p>
-      <w:r>
-        <w:t xml:space="preserve">When a raycast hits the Rigidbody in the scene, it applies a force at the point the ray hits, pushing the object around in a circle. </w:t>
+      <w:bookmarkEnd w:id="6"/>
+    </w:p>
+    <w:p>
+      <w:r>
+        <w:t xml:space="preserve">In the scene, there is a camera for rendering, the Input Manager that the player uses, a </w:t>
+      </w:r>
+      <w:proofErr w:type="spellStart"/>
+      <w:r>
+        <w:t>Rigidbody</w:t>
+      </w:r>
+      <w:proofErr w:type="spellEnd"/>
+      <w:r>
+        <w:t xml:space="preserve"> with a hinge joint placed in front of the test weapon, and the test weapon itself.</w:t>
+      </w:r>
+    </w:p>
+    <w:p>
+      <w:r>
+        <w:t xml:space="preserve">The test weapon fires a variable number of </w:t>
+      </w:r>
+      <w:proofErr w:type="spellStart"/>
+      <w:r>
+        <w:t>raycasts</w:t>
+      </w:r>
+      <w:proofErr w:type="spellEnd"/>
+      <w:r>
+        <w:t xml:space="preserve"> every frame, with an optional divergence. The divergence is a maximum measure, divided by 2, of how perpendicular the fire vector can be to the forward vector of the weapon.</w:t>
+      </w:r>
+    </w:p>
+    <w:p>
+      <w:r>
+        <w:t xml:space="preserve">When a </w:t>
+      </w:r>
+      <w:proofErr w:type="spellStart"/>
+      <w:r>
+        <w:t>raycast</w:t>
+      </w:r>
+      <w:proofErr w:type="spellEnd"/>
+      <w:r>
+        <w:t xml:space="preserve"> hits the </w:t>
+      </w:r>
+      <w:proofErr w:type="spellStart"/>
+      <w:r>
+        <w:t>Rigidbody</w:t>
+      </w:r>
+      <w:proofErr w:type="spellEnd"/>
+      <w:r>
+        <w:t xml:space="preserve"> in the scene, it applies a force at the point the ray hits, pushing the object around in a circle. </w:t>
       </w:r>
     </w:p>
     <w:p>
@@ -755,6 +2651,10 @@
     </w:p>
     <w:p>
       <w:r>
+        <w:rPr>
+          <w:noProof/>
+        </w:rPr>
+        <w:lastRenderedPageBreak/>
         <w:drawing>
           <wp:inline distT="0" distB="0" distL="0" distR="0" wp14:anchorId="08E461BD" wp14:editId="2688DEE2">
             <wp:extent cx="5731510" cy="1094105"/>
@@ -771,7 +2671,7 @@
                     <pic:cNvPicPr/>
                   </pic:nvPicPr>
                   <pic:blipFill>
-                    <a:blip r:embed="rId5"/>
+                    <a:blip r:embed="rId6"/>
                     <a:stretch>
                       <a:fillRect/>
                     </a:stretch>
@@ -792,7 +2692,418 @@
         </w:drawing>
       </w:r>
     </w:p>
+    <w:p>
+      <w:pPr>
+        <w:pStyle w:val="Heading1"/>
+      </w:pPr>
+      <w:bookmarkStart w:id="7" w:name="_Toc195799415"/>
+      <w:r>
+        <w:t>Ranged Weapon Implementation</w:t>
+      </w:r>
+      <w:bookmarkEnd w:id="7"/>
+    </w:p>
+    <w:p>
+      <w:pPr>
+        <w:pStyle w:val="Heading1"/>
+      </w:pPr>
+      <w:bookmarkStart w:id="8" w:name="_Toc195799416"/>
+      <w:r>
+        <w:t>Melee Weapon Implementation</w:t>
+      </w:r>
+      <w:bookmarkEnd w:id="8"/>
+    </w:p>
+    <w:p>
+      <w:pPr>
+        <w:pStyle w:val="Heading1"/>
+      </w:pPr>
+      <w:bookmarkStart w:id="9" w:name="_Toc195799417"/>
+      <w:r>
+        <w:t>Damageable Entities</w:t>
+      </w:r>
+      <w:bookmarkEnd w:id="9"/>
+    </w:p>
+    <w:p>
+      <w:pPr>
+        <w:pStyle w:val="Heading1"/>
+      </w:pPr>
+      <w:bookmarkStart w:id="10" w:name="_Toc195799418"/>
+      <w:r>
+        <w:t>Animation</w:t>
+      </w:r>
+      <w:bookmarkEnd w:id="10"/>
+    </w:p>
+    <w:p>
+      <w:pPr>
+        <w:pStyle w:val="Heading2"/>
+      </w:pPr>
+      <w:bookmarkStart w:id="11" w:name="_Toc195799419"/>
+      <w:r>
+        <w:t>Research</w:t>
+      </w:r>
+      <w:bookmarkEnd w:id="11"/>
+    </w:p>
+    <w:p>
+      <w:r>
+        <w:t xml:space="preserve">The first-person shooters I play (The Finals &amp; Call of Duty, primarily) are my biggest influences when it comes to animation. I have extensively watched multiple showreels by </w:t>
+      </w:r>
+      <w:hyperlink r:id="rId7" w:history="1">
+        <w:r>
+          <w:rPr>
+            <w:rStyle w:val="Hyperlink"/>
+          </w:rPr>
+          <w:t>Khoa Le</w:t>
+        </w:r>
+      </w:hyperlink>
+      <w:r>
+        <w:t xml:space="preserve">, </w:t>
+      </w:r>
+      <w:hyperlink r:id="rId8" w:history="1">
+        <w:r>
+          <w:rPr>
+            <w:rStyle w:val="Hyperlink"/>
+          </w:rPr>
+          <w:t>Hozq</w:t>
+        </w:r>
+      </w:hyperlink>
+      <w:r>
+        <w:t xml:space="preserve"> and </w:t>
+      </w:r>
+      <w:hyperlink r:id="rId9" w:history="1">
+        <w:proofErr w:type="spellStart"/>
+        <w:r>
+          <w:rPr>
+            <w:rStyle w:val="Hyperlink"/>
+          </w:rPr>
+          <w:t>LayzuhCatz</w:t>
+        </w:r>
+        <w:proofErr w:type="spellEnd"/>
+      </w:hyperlink>
+      <w:r>
+        <w:t xml:space="preserve">, among many others on YouTube, as well as studied the motions of many weapons in my favourite games whilst I play. I have noticed that “micro-movements” and little flourishes, as well as subtle shake and wobble on the camera, can help bring animations to life. </w:t>
+      </w:r>
+    </w:p>
+    <w:p>
+      <w:r>
+        <w:t>There’s a lack of a tactile element when playing a video game, especially when playing a flatscreen (non-VR) game, and this is solved by enhancing o</w:t>
+      </w:r>
+      <w:r>
+        <w:t>th</w:t>
+      </w:r>
+      <w:r>
+        <w:t xml:space="preserve">er aspects. When it comes to senses, the real world captures all five. A virtual reality game would capture three senses – sight, sound and touch (though the latter is limited) – while a flatscreen game can only capture sight and sound. If you count haptics (vibration and/or haptic feedback suits) then you can </w:t>
+      </w:r>
+      <w:r>
+        <w:rPr>
+          <w:i/>
+          <w:iCs/>
+        </w:rPr>
+        <w:t>graze</w:t>
+      </w:r>
+      <w:r>
+        <w:t xml:space="preserve"> touch but still cannot fully </w:t>
+      </w:r>
+      <w:r>
+        <w:t>utilise it.</w:t>
+      </w:r>
+    </w:p>
+    <w:p>
+      <w:r>
+        <w:t xml:space="preserve">In recent years, the quality and detail of animations has skyrocketed in video games. While I doubt this skill has been magically locked away, since Pixar’s animators were doing some incredible things in the early 2000s, we’ve only really tapped this newer style of animation in the past seven or eight years. Compare these two videos from Activision’s </w:t>
+      </w:r>
+      <w:hyperlink r:id="rId10" w:history="1">
+        <w:r>
+          <w:rPr>
+            <w:rStyle w:val="Hyperlink"/>
+          </w:rPr>
+          <w:t>Modern Warfare 2022</w:t>
+        </w:r>
+      </w:hyperlink>
+      <w:r>
+        <w:t xml:space="preserve"> and </w:t>
+      </w:r>
+      <w:hyperlink r:id="rId11" w:history="1">
+        <w:r>
+          <w:rPr>
+            <w:rStyle w:val="Hyperlink"/>
+          </w:rPr>
+          <w:t>Black Ops II</w:t>
+        </w:r>
+      </w:hyperlink>
+      <w:r>
+        <w:t xml:space="preserve"> – two games with 10 years between them.</w:t>
+      </w:r>
+    </w:p>
+    <w:p>
+      <w:r>
+        <w:t xml:space="preserve">The animations in Black Ops II are, for the most part, quite similar between the same “class” of weapons. Apart from the KAP-40 machine pistol and Executioner revolver, the first few weapons in the Black Ops II showcase have very similar animations. When </w:t>
+      </w:r>
+      <w:r>
+        <w:lastRenderedPageBreak/>
+        <w:t>equipping the “Fast Hands” perk, which speeds up reloads, the same animations play, just slightly faster.</w:t>
+      </w:r>
+    </w:p>
+    <w:p>
+      <w:r>
+        <w:t>The animations shown in Modern Warfare 22, however, have more variation between each weapon of the same class. Despite the first few weapons all being very similar in operation, shape and size, they each have their own differences in handling. Additionally, when equipping “Fast Hands,” different animations play, rather than simply speeding up the existing ones.</w:t>
+      </w:r>
+    </w:p>
+    <w:p>
+      <w:r>
+        <w:t xml:space="preserve">Computers have come a </w:t>
+      </w:r>
+      <w:r>
+        <w:rPr>
+          <w:i/>
+          <w:iCs/>
+        </w:rPr>
+        <w:t xml:space="preserve">very </w:t>
+      </w:r>
+      <w:r>
+        <w:t>long way in the 10 years between the two games, as evidenced by the visual fidelity of the games before you even acknowledge the animations in them. Perhaps this ability to do more, to</w:t>
+      </w:r>
+      <w:r>
+        <w:rPr>
+          <w:i/>
+          <w:iCs/>
+        </w:rPr>
+        <w:t xml:space="preserve"> have</w:t>
+      </w:r>
+      <w:r>
+        <w:t xml:space="preserve"> more detailed and intricate animation, is simply a byproduct of increased processing power? Perhaps the animators </w:t>
+      </w:r>
+      <w:r>
+        <w:t xml:space="preserve">also </w:t>
+      </w:r>
+      <w:r>
+        <w:t>have more</w:t>
+      </w:r>
+      <w:r>
+        <w:t xml:space="preserve"> resources to play</w:t>
+      </w:r>
+      <w:r>
+        <w:t xml:space="preserve"> </w:t>
+      </w:r>
+      <w:r>
+        <w:t>with and</w:t>
+      </w:r>
+      <w:r>
+        <w:t xml:space="preserve"> can create something more visually exciting with this additional </w:t>
+      </w:r>
+      <w:r>
+        <w:t>headroom.</w:t>
+      </w:r>
+    </w:p>
+    <w:p>
+      <w:pPr>
+        <w:pStyle w:val="Heading2"/>
+      </w:pPr>
+      <w:bookmarkStart w:id="12" w:name="_Toc195799420"/>
+      <w:r>
+        <w:t>Design</w:t>
+      </w:r>
+      <w:bookmarkEnd w:id="12"/>
+    </w:p>
+    <w:p>
+      <w:r>
+        <w:t xml:space="preserve">The most important part of animating a character is the rig. Having watched videos on the animation for The Finals, </w:t>
+      </w:r>
+      <w:hyperlink r:id="rId12" w:history="1">
+        <w:r>
+          <w:rPr>
+            <w:rStyle w:val="Hyperlink"/>
+          </w:rPr>
+          <w:t>with one video in particular</w:t>
+        </w:r>
+      </w:hyperlink>
+      <w:r>
+        <w:t xml:space="preserve"> giving some insight into the inner workings), I have come to the conclusion that my rig must be slightly more complex than I’d like it to be.</w:t>
+      </w:r>
+    </w:p>
+    <w:p>
+      <w:r>
+        <w:t xml:space="preserve">The character’s rig (created in Blender) has a somewhat complicated setup, making heavy use of Constraints and Inverse Kinematics to achieve a solution that makes it much easier to author the animations. </w:t>
+      </w:r>
+    </w:p>
+    <w:p>
+      <w:pPr>
+        <w:pStyle w:val="Heading3"/>
+      </w:pPr>
+      <w:bookmarkStart w:id="13" w:name="_Toc195799421"/>
+      <w:r>
+        <w:t>Lower Body</w:t>
+      </w:r>
+      <w:bookmarkEnd w:id="13"/>
+    </w:p>
+    <w:p>
+      <w:r>
+        <w:t>The lower body is a simple two-bone IK chain with a pole for each leg, with a two-point hip target, allowing decoupled rotation and translation of the hip target, as well as runtime control independent of the animation system in Unity. The arms’ IK poles are parented to the runtime hip target, allowing the elbows to respond correctly when standing/crouching.</w:t>
+      </w:r>
+    </w:p>
+    <w:p>
+      <w:pPr>
+        <w:pStyle w:val="Heading3"/>
+      </w:pPr>
+      <w:bookmarkStart w:id="14" w:name="_Toc195799422"/>
+      <w:r>
+        <w:t>Upper Body</w:t>
+      </w:r>
+      <w:bookmarkEnd w:id="14"/>
+    </w:p>
+    <w:p>
+      <w:r>
+        <w:t>The upper body features a chain of Copy Rotation constraints on the spine to achieve additive twisting (with a similar setup for the neck and head) and a Copy Position constraint for an “Upper IK Root” bone, which tracks the uppermost torso bone before the neck. The primary hand IK targets are parented to this Upper Root.</w:t>
+      </w:r>
+    </w:p>
+    <w:p>
+      <w:pPr>
+        <w:pStyle w:val="Heading3"/>
+      </w:pPr>
+      <w:bookmarkStart w:id="15" w:name="_Toc195799423"/>
+      <w:r>
+        <w:t>Weapon Target</w:t>
+      </w:r>
+      <w:bookmarkEnd w:id="15"/>
+    </w:p>
+    <w:p>
+      <w:r>
+        <w:t xml:space="preserve">The Upper Root has another child – the Weapon Target. The weapon target is comprised of three bones – The Weapon Root, the Weapon Target itself and the “Weapon Rotation Invert” bone. The Weapon Root is not animated but will be controlled at runtime instead </w:t>
+      </w:r>
+      <w:r>
+        <w:lastRenderedPageBreak/>
+        <w:t>to counteract the local position of the Weapon Target. The Weapon Target is the animated bone in this setup. The final bone – the Weapon Rotation Invert – is the last bone in the hierarchy here. At runtime, the inverse of the Weapon Target’s local rotation will be applied to this bone to zero the rotation (or, we can interpolate between ignoring and inverting the local rotation, to get allow for a bit of movement in some animations).</w:t>
+      </w:r>
+    </w:p>
+    <w:p>
+      <w:r>
+        <w:t xml:space="preserve">The Invert bone also has two more parented to it – the Weapon Hand bones. The Hand IK targets simply copy the orientation of these bones via a constraint, to allow the hands to ignore, or be influenced by, the weapon target. </w:t>
+      </w:r>
+    </w:p>
+    <w:p>
+      <w:pPr>
+        <w:pStyle w:val="Heading3"/>
+      </w:pPr>
+      <w:bookmarkStart w:id="16" w:name="_Toc195799424"/>
+      <w:r>
+        <w:t>Weapon Rigs</w:t>
+      </w:r>
+      <w:bookmarkEnd w:id="16"/>
+    </w:p>
+    <w:p>
+      <w:r>
+        <w:t xml:space="preserve">Weapons will not make </w:t>
+      </w:r>
+      <w:r>
+        <w:rPr>
+          <w:i/>
+          <w:iCs/>
+        </w:rPr>
+        <w:t>much</w:t>
+      </w:r>
+      <w:r>
+        <w:t xml:space="preserve"> use of constraints, aside from any bones that might be directly manipulated by a character’s hands, such as magazine or bullet. These will use a Child Of constraint (or multiple of them) to allow them to be moved around freely as though they are parented to the hand. </w:t>
+      </w:r>
+    </w:p>
+    <w:p>
+      <w:pPr>
+        <w:pStyle w:val="Heading2"/>
+      </w:pPr>
+      <w:bookmarkStart w:id="17" w:name="_Toc195799425"/>
+      <w:r>
+        <w:t>Import</w:t>
+      </w:r>
+      <w:r>
+        <w:t xml:space="preserve"> Pipeline</w:t>
+      </w:r>
+      <w:bookmarkEnd w:id="17"/>
+    </w:p>
+    <w:p>
+      <w:pPr>
+        <w:pStyle w:val="Heading3"/>
+      </w:pPr>
+      <w:bookmarkStart w:id="18" w:name="_Toc195799426"/>
+      <w:r>
+        <w:t>Character Animations</w:t>
+      </w:r>
+      <w:bookmarkEnd w:id="18"/>
+    </w:p>
     <w:p/>
+    <w:p>
+      <w:pPr>
+        <w:pStyle w:val="Heading3"/>
+      </w:pPr>
+      <w:bookmarkStart w:id="19" w:name="_Toc195799427"/>
+      <w:r>
+        <w:t>Weapon Animations</w:t>
+      </w:r>
+      <w:bookmarkEnd w:id="19"/>
+    </w:p>
+    <w:p/>
+    <w:p>
+      <w:pPr>
+        <w:pStyle w:val="Heading2"/>
+      </w:pPr>
+      <w:bookmarkStart w:id="20" w:name="_Toc195799428"/>
+      <w:r>
+        <w:t>Implementation</w:t>
+      </w:r>
+      <w:bookmarkEnd w:id="20"/>
+    </w:p>
+    <w:p>
+      <w:r>
+        <w:t xml:space="preserve">Animations for characters are almost </w:t>
+      </w:r>
+      <w:r>
+        <w:rPr>
+          <w:i/>
+          <w:iCs/>
+        </w:rPr>
+        <w:t>entirely</w:t>
+      </w:r>
+      <w:r>
+        <w:t xml:space="preserve"> runtime inverse kinematics. </w:t>
+      </w:r>
+    </w:p>
+    <w:p/>
+    <w:p>
+      <w:pPr>
+        <w:pStyle w:val="Heading1"/>
+      </w:pPr>
+      <w:bookmarkStart w:id="21" w:name="_Toc195799429"/>
+      <w:r>
+        <w:t>Character Controller Interoperability</w:t>
+      </w:r>
+      <w:bookmarkEnd w:id="21"/>
+    </w:p>
+    <w:p>
+      <w:pPr>
+        <w:pStyle w:val="Heading1"/>
+      </w:pPr>
+      <w:bookmarkStart w:id="22" w:name="_Toc195799430"/>
+      <w:r>
+        <w:t>Rendering Wizardry</w:t>
+      </w:r>
+      <w:bookmarkEnd w:id="22"/>
+    </w:p>
+    <w:p>
+      <w:pPr>
+        <w:pStyle w:val="Heading2"/>
+      </w:pPr>
+      <w:bookmarkStart w:id="23" w:name="_Toc195799431"/>
+      <w:r>
+        <w:t>Camera Trickery</w:t>
+      </w:r>
+      <w:bookmarkEnd w:id="23"/>
+    </w:p>
+    <w:p>
+      <w:pPr>
+        <w:pStyle w:val="Heading2"/>
+      </w:pPr>
+      <w:bookmarkStart w:id="24" w:name="_Toc195799432"/>
+      <w:r>
+        <w:t>Shader Magic</w:t>
+      </w:r>
+      <w:bookmarkEnd w:id="24"/>
+    </w:p>
     <w:sectPr>
       <w:pgSz w:w="11906" w:h="16838"/>
       <w:pgMar w:top="1440" w:right="1440" w:bottom="1440" w:left="1440" w:header="708" w:footer="708" w:gutter="0"/>
@@ -1405,6 +3716,7 @@
   <w:style w:type="character" w:default="1" w:styleId="DefaultParagraphFont">
     <w:name w:val="Default Paragraph Font"/>
     <w:uiPriority w:val="1"/>
+    <w:semiHidden/>
     <w:unhideWhenUsed/>
   </w:style>
   <w:style w:type="table" w:default="1" w:styleId="TableNormal">
@@ -1748,6 +4060,87 @@
       <w14:ligatures w14:val="none"/>
     </w:rPr>
   </w:style>
+  <w:style w:type="paragraph" w:styleId="TOCHeading">
+    <w:name w:val="TOC Heading"/>
+    <w:basedOn w:val="Heading1"/>
+    <w:next w:val="Normal"/>
+    <w:uiPriority w:val="39"/>
+    <w:unhideWhenUsed/>
+    <w:qFormat/>
+    <w:rsid w:val="001F5102"/>
+    <w:pPr>
+      <w:spacing w:before="240" w:after="0" w:line="259" w:lineRule="auto"/>
+      <w:outlineLvl w:val="9"/>
+    </w:pPr>
+    <w:rPr>
+      <w:kern w:val="0"/>
+      <w:sz w:val="32"/>
+      <w:szCs w:val="32"/>
+      <w:lang w:eastAsia="en-GB"/>
+      <w14:ligatures w14:val="none"/>
+    </w:rPr>
+  </w:style>
+  <w:style w:type="paragraph" w:styleId="TOC1">
+    <w:name w:val="toc 1"/>
+    <w:basedOn w:val="Normal"/>
+    <w:next w:val="Normal"/>
+    <w:autoRedefine/>
+    <w:uiPriority w:val="39"/>
+    <w:unhideWhenUsed/>
+    <w:rsid w:val="001F5102"/>
+    <w:pPr>
+      <w:spacing w:after="100"/>
+    </w:pPr>
+  </w:style>
+  <w:style w:type="paragraph" w:styleId="TOC2">
+    <w:name w:val="toc 2"/>
+    <w:basedOn w:val="Normal"/>
+    <w:next w:val="Normal"/>
+    <w:autoRedefine/>
+    <w:uiPriority w:val="39"/>
+    <w:unhideWhenUsed/>
+    <w:rsid w:val="001F5102"/>
+    <w:pPr>
+      <w:spacing w:after="100"/>
+      <w:ind w:left="240"/>
+    </w:pPr>
+  </w:style>
+  <w:style w:type="paragraph" w:styleId="TOC3">
+    <w:name w:val="toc 3"/>
+    <w:basedOn w:val="Normal"/>
+    <w:next w:val="Normal"/>
+    <w:autoRedefine/>
+    <w:uiPriority w:val="39"/>
+    <w:unhideWhenUsed/>
+    <w:rsid w:val="001F5102"/>
+    <w:pPr>
+      <w:spacing w:after="100"/>
+      <w:ind w:left="480"/>
+    </w:pPr>
+  </w:style>
+  <w:style w:type="character" w:styleId="Hyperlink">
+    <w:name w:val="Hyperlink"/>
+    <w:basedOn w:val="DefaultParagraphFont"/>
+    <w:uiPriority w:val="99"/>
+    <w:unhideWhenUsed/>
+    <w:rsid w:val="001F5102"/>
+    <w:rPr>
+      <w:color w:val="467886" w:themeColor="hyperlink"/>
+      <w:u w:val="single"/>
+    </w:rPr>
+  </w:style>
+  <w:style w:type="character" w:styleId="UnresolvedMention">
+    <w:name w:val="Unresolved Mention"/>
+    <w:basedOn w:val="DefaultParagraphFont"/>
+    <w:uiPriority w:val="99"/>
+    <w:semiHidden/>
+    <w:unhideWhenUsed/>
+    <w:rsid w:val="00E5752D"/>
+    <w:rPr>
+      <w:color w:val="605E5C"/>
+      <w:shd w:val="clear" w:color="auto" w:fill="E1DFDD"/>
+    </w:rPr>
+  </w:style>
 </w:styles>
 </file>
 
@@ -2057,10 +4450,22 @@
 </CoverPageProperties>
 </file>
 
+<file path=customXml/item2.xml><?xml version="1.0" encoding="utf-8"?>
+<b:Sources xmlns:b="http://schemas.openxmlformats.org/officeDocument/2006/bibliography" xmlns="http://schemas.openxmlformats.org/officeDocument/2006/bibliography" SelectedStyle="\APASixthEditionOfficeOnline.xsl" StyleName="APA" Version="6"/>
+</file>
+
 <file path=customXml/itemProps1.xml><?xml version="1.0" encoding="utf-8"?>
 <ds:datastoreItem xmlns:ds="http://schemas.openxmlformats.org/officeDocument/2006/customXml" ds:itemID="{55AF091B-3C7A-41E3-B477-F2FDAA23CFDA}">
   <ds:schemaRefs>
     <ds:schemaRef ds:uri="http://schemas.microsoft.com/office/2006/coverPageProps"/>
   </ds:schemaRefs>
 </ds:datastoreItem>
+</file>
+
+<file path=customXml/itemProps2.xml><?xml version="1.0" encoding="utf-8"?>
+<ds:datastoreItem xmlns:ds="http://schemas.openxmlformats.org/officeDocument/2006/customXml" ds:itemID="{D5FB7F20-FA0E-423A-A25F-CE5B37BB2264}">
+  <ds:schemaRefs>
+    <ds:schemaRef ds:uri="http://schemas.openxmlformats.org/officeDocument/2006/bibliography"/>
+  </ds:schemaRefs>
+</ds:datastoreItem>
 </file>
</xml_diff>

<commit_message>
Weapon switching + 2nd weapon
</commit_message>
<xml_diff>
--- a/DesignDocument.docx
+++ b/DesignDocument.docx
@@ -531,6 +531,15 @@
         </w:p>
         <w:sdt>
           <w:sdtPr>
+            <w:rPr>
+              <w:rFonts w:asciiTheme="minorHAnsi" w:eastAsiaTheme="minorHAnsi" w:hAnsiTheme="minorHAnsi" w:cstheme="minorBidi"/>
+              <w:color w:val="auto"/>
+              <w:kern w:val="2"/>
+              <w:sz w:val="24"/>
+              <w:szCs w:val="24"/>
+              <w:lang w:eastAsia="en-US"/>
+              <w14:ligatures w14:val="standardContextual"/>
+            </w:rPr>
             <w:id w:val="1102994137"/>
             <w:docPartObj>
               <w:docPartGallery w:val="Table of Contents"/>
@@ -539,15 +548,8 @@
           </w:sdtPr>
           <w:sdtEndPr>
             <w:rPr>
-              <w:rFonts w:asciiTheme="minorHAnsi" w:eastAsiaTheme="minorHAnsi" w:hAnsiTheme="minorHAnsi" w:cstheme="minorBidi"/>
               <w:b/>
               <w:bCs/>
-              <w:color w:val="auto"/>
-              <w:kern w:val="2"/>
-              <w:sz w:val="24"/>
-              <w:szCs w:val="24"/>
-              <w:lang w:eastAsia="en-US"/>
-              <w14:ligatures w14:val="standardContextual"/>
             </w:rPr>
           </w:sdtEndPr>
           <w:sdtContent>
@@ -2429,15 +2431,7 @@
     </w:p>
     <w:p>
       <w:r>
-        <w:t>Hitscan Firearms will fire an imaginary “ray” called a “</w:t>
-      </w:r>
-      <w:proofErr w:type="spellStart"/>
-      <w:r>
-        <w:t>raycast</w:t>
-      </w:r>
-      <w:proofErr w:type="spellEnd"/>
-      <w:r>
-        <w:t xml:space="preserve">.” This ray checks along the path </w:t>
+        <w:t xml:space="preserve">Hitscan Firearms will fire an imaginary “ray” called a “raycast.” This ray checks along the path </w:t>
       </w:r>
       <w:r>
         <w:t>from the origin of the attack to an endpoint</w:t>
@@ -2456,29 +2450,13 @@
     </w:p>
     <w:p>
       <w:r>
-        <w:t xml:space="preserve">Projectile Firearms will fire a </w:t>
-      </w:r>
-      <w:proofErr w:type="spellStart"/>
-      <w:r>
-        <w:t>rigidbody</w:t>
-      </w:r>
-      <w:proofErr w:type="spellEnd"/>
-      <w:r>
-        <w:t xml:space="preserve"> projectile (an object with physics). These projectiles will react to other objects in the game world, will be able to bounce </w:t>
+        <w:t xml:space="preserve">Projectile Firearms will fire a rigidbody projectile (an object with physics). These projectiles will react to other objects in the game world, will be able to bounce </w:t>
       </w:r>
       <w:r>
         <w:t>off</w:t>
       </w:r>
       <w:r>
-        <w:t xml:space="preserve"> walls, and can be affected by anything that might affect any </w:t>
-      </w:r>
-      <w:proofErr w:type="spellStart"/>
-      <w:r>
-        <w:t>rigidbodies</w:t>
-      </w:r>
-      <w:proofErr w:type="spellEnd"/>
-      <w:r>
-        <w:t xml:space="preserve"> in the scene.</w:t>
+        <w:t xml:space="preserve"> walls, and can be affected by anything that might affect any rigidbodies in the scene.</w:t>
       </w:r>
     </w:p>
     <w:p>
@@ -2493,15 +2471,7 @@
     </w:p>
     <w:p>
       <w:r>
-        <w:t xml:space="preserve">Melee weapons will trace between two points each fixed timestep by storing their last position and performing a </w:t>
-      </w:r>
-      <w:proofErr w:type="spellStart"/>
-      <w:r>
-        <w:t>linecast</w:t>
-      </w:r>
-      <w:proofErr w:type="spellEnd"/>
-      <w:r>
-        <w:t xml:space="preserve"> between those two points, ensuring that no targets </w:t>
+        <w:t xml:space="preserve">Melee weapons will trace between two points each fixed timestep by storing their last position and performing a linecast between those two points, ensuring that no targets </w:t>
       </w:r>
       <w:r>
         <w:lastRenderedPageBreak/>
@@ -2532,44 +2502,12 @@
         <w:t>.</w:t>
       </w:r>
       <w:r>
-        <w:t xml:space="preserve"> There is also an additional performance impact from the normalisation of the fire vector, since </w:t>
-      </w:r>
-      <w:proofErr w:type="spellStart"/>
-      <w:r>
-        <w:t>RaycastCommands</w:t>
-      </w:r>
-      <w:proofErr w:type="spellEnd"/>
-      <w:r>
-        <w:t xml:space="preserve"> will not accept a vector that is not normalised.</w:t>
-      </w:r>
-    </w:p>
-    <w:p>
-      <w:r>
-        <w:t xml:space="preserve">In its first iteration, the system used two lists of a </w:t>
-      </w:r>
-      <w:proofErr w:type="spellStart"/>
-      <w:r>
-        <w:t>BulletData</w:t>
-      </w:r>
-      <w:proofErr w:type="spellEnd"/>
-      <w:r>
-        <w:t xml:space="preserve"> struct, used to determine some information about the “bullets.” A Native Array of </w:t>
-      </w:r>
-      <w:proofErr w:type="spellStart"/>
-      <w:r>
-        <w:t>RaycastCommands</w:t>
-      </w:r>
-      <w:proofErr w:type="spellEnd"/>
-      <w:r>
-        <w:t xml:space="preserve"> and </w:t>
-      </w:r>
-      <w:proofErr w:type="spellStart"/>
-      <w:r>
-        <w:t>RaycastHits</w:t>
-      </w:r>
-      <w:proofErr w:type="spellEnd"/>
-      <w:r>
-        <w:t xml:space="preserve"> is currently used to store the information needed by the Raycast batch.</w:t>
+        <w:t xml:space="preserve"> There is also an additional performance impact from the normalisation of the fire vector, since RaycastCommands will not accept a vector that is not normalised.</w:t>
+      </w:r>
+    </w:p>
+    <w:p>
+      <w:r>
+        <w:t>In its first iteration, the system used two lists of a BulletData struct, used to determine some information about the “bullets.” A Native Array of RaycastCommands and RaycastHits is currently used to store the information needed by the Raycast batch.</w:t>
       </w:r>
     </w:p>
     <w:p>
@@ -2599,49 +2537,17 @@
     </w:p>
     <w:p>
       <w:r>
-        <w:t xml:space="preserve">In the scene, there is a camera for rendering, the Input Manager that the player uses, a </w:t>
-      </w:r>
-      <w:proofErr w:type="spellStart"/>
-      <w:r>
-        <w:t>Rigidbody</w:t>
-      </w:r>
-      <w:proofErr w:type="spellEnd"/>
-      <w:r>
-        <w:t xml:space="preserve"> with a hinge joint placed in front of the test weapon, and the test weapon itself.</w:t>
-      </w:r>
-    </w:p>
-    <w:p>
-      <w:r>
-        <w:t xml:space="preserve">The test weapon fires a variable number of </w:t>
-      </w:r>
-      <w:proofErr w:type="spellStart"/>
-      <w:r>
-        <w:t>raycasts</w:t>
-      </w:r>
-      <w:proofErr w:type="spellEnd"/>
-      <w:r>
-        <w:t xml:space="preserve"> every frame, with an optional divergence. The divergence is a maximum measure, divided by 2, of how perpendicular the fire vector can be to the forward vector of the weapon.</w:t>
-      </w:r>
-    </w:p>
-    <w:p>
-      <w:r>
-        <w:t xml:space="preserve">When a </w:t>
-      </w:r>
-      <w:proofErr w:type="spellStart"/>
-      <w:r>
-        <w:t>raycast</w:t>
-      </w:r>
-      <w:proofErr w:type="spellEnd"/>
-      <w:r>
-        <w:t xml:space="preserve"> hits the </w:t>
-      </w:r>
-      <w:proofErr w:type="spellStart"/>
-      <w:r>
-        <w:t>Rigidbody</w:t>
-      </w:r>
-      <w:proofErr w:type="spellEnd"/>
-      <w:r>
-        <w:t xml:space="preserve"> in the scene, it applies a force at the point the ray hits, pushing the object around in a circle. </w:t>
+        <w:t>In the scene, there is a camera for rendering, the Input Manager that the player uses, a Rigidbody with a hinge joint placed in front of the test weapon, and the test weapon itself.</w:t>
+      </w:r>
+    </w:p>
+    <w:p>
+      <w:r>
+        <w:t>The test weapon fires a variable number of raycasts every frame, with an optional divergence. The divergence is a maximum measure, divided by 2, of how perpendicular the fire vector can be to the forward vector of the weapon.</w:t>
+      </w:r>
+    </w:p>
+    <w:p>
+      <w:r>
+        <w:t xml:space="preserve">When a raycast hits the Rigidbody in the scene, it applies a force at the point the ray hits, pushing the object around in a circle. </w:t>
       </w:r>
     </w:p>
     <w:p>
@@ -2769,14 +2675,12 @@
         <w:t xml:space="preserve"> and </w:t>
       </w:r>
       <w:hyperlink r:id="rId9" w:history="1">
-        <w:proofErr w:type="spellStart"/>
         <w:r>
           <w:rPr>
             <w:rStyle w:val="Hyperlink"/>
           </w:rPr>
           <w:t>LayzuhCatz</w:t>
         </w:r>
-        <w:proofErr w:type="spellEnd"/>
       </w:hyperlink>
       <w:r>
         <w:t xml:space="preserve">, among many others on YouTube, as well as studied the motions of many weapons in my favourite games whilst I play. I have noticed that “micro-movements” and little flourishes, as well as subtle shake and wobble on the camera, can help bring animations to life. </w:t>
@@ -2966,11 +2870,7 @@
     </w:p>
     <w:p>
       <w:r>
-        <w:t xml:space="preserve">The Upper Root has another child – the Weapon Target. The weapon target is comprised of three bones – The Weapon Root, the Weapon Target itself and the “Weapon Rotation Invert” bone. The Weapon Root is not animated but will be controlled at runtime instead </w:t>
-      </w:r>
-      <w:r>
-        <w:lastRenderedPageBreak/>
-        <w:t>to counteract the local position of the Weapon Target. The Weapon Target is the animated bone in this setup. The final bone – the Weapon Rotation Invert – is the last bone in the hierarchy here. At runtime, the inverse of the Weapon Target’s local rotation will be applied to this bone to zero the rotation (or, we can interpolate between ignoring and inverting the local rotation, to get allow for a bit of movement in some animations).</w:t>
+        <w:t>The Upper Root has another child – the Weapon Target. The weapon target is comprised of three bones – The Weapon Root, the Weapon Target itself and the “Weapon Rotation Invert” bone. The Weapon Root is not animated but will be controlled at runtime instead to counteract the local position of the Weapon Target. The Weapon Target is the animated bone in this setup. The final bone – the Weapon Rotation Invert – is the last bone in the hierarchy here. At runtime, the inverse of the Weapon Target’s local rotation will be applied to this bone to zero the rotation (or, we can interpolate between ignoring and inverting the local rotation, to get allow for a bit of movement in some animations).</w:t>
       </w:r>
     </w:p>
     <w:p>
@@ -3017,6 +2917,11 @@
       <w:bookmarkEnd w:id="17"/>
     </w:p>
     <w:p>
+      <w:r>
+        <w:t>The character and weapon are animated together in a separate blend file for each weapon. These are then exported separately to easily split the weapon and character animations from each other.</w:t>
+      </w:r>
+    </w:p>
+    <w:p>
       <w:pPr>
         <w:pStyle w:val="Heading3"/>
       </w:pPr>
@@ -3026,7 +2931,11 @@
       </w:r>
       <w:bookmarkEnd w:id="18"/>
     </w:p>
-    <w:p/>
+    <w:p>
+      <w:r>
+        <w:t>The character animations are stripped of “excess” bones using an avatar mask. The lower body bones and IK targets are removed from the animation clips with this mask. Each animation is then split inside Unity using frame numbers from Blender. The clips then require “cleaning” – removing keyframes for scale on all bones and removing unnecessary keyframes for bones that only move/only rotate.</w:t>
+      </w:r>
+    </w:p>
     <w:p>
       <w:pPr>
         <w:pStyle w:val="Heading3"/>
@@ -3050,19 +2959,46 @@
     </w:p>
     <w:p>
       <w:r>
-        <w:t xml:space="preserve">Animations for characters are almost </w:t>
-      </w:r>
-      <w:r>
-        <w:rPr>
-          <w:i/>
-          <w:iCs/>
-        </w:rPr>
-        <w:t>entirely</w:t>
-      </w:r>
-      <w:r>
-        <w:t xml:space="preserve"> runtime inverse kinematics. </w:t>
-      </w:r>
-    </w:p>
+        <w:t>There are many shared parts between character and weapon animations in this system, which has also been kept reasonably simple. Characters and weapons both use the Weapon Animator component for common functionality such as setting runtime animations. This script also handles setting values on the character’s &amp; weapon’s animators at the same time.</w:t>
+      </w:r>
+    </w:p>
+    <w:p>
+      <w:pPr>
+        <w:pStyle w:val="Heading3"/>
+      </w:pPr>
+      <w:r>
+        <w:t>Characters</w:t>
+      </w:r>
+    </w:p>
+    <w:p>
+      <w:r>
+        <w:t xml:space="preserve">Characters employ an avatar mask limited to the upper body and its IK targets. Using an avatar mask prevents the engine from evaluating bones that are not in that in the mask </w:t>
+      </w:r>
+      <w:r>
+        <w:lastRenderedPageBreak/>
+        <w:t>and therefore improves performance slightly. Characters use a custom full body IK setup that is almost identical to the rig used in Blender to ensure a near-perfect recreation of the animations in the source files.</w:t>
+      </w:r>
+    </w:p>
+    <w:p>
+      <w:r>
+        <w:t xml:space="preserve">Currently, the character itself does not manage animation events, and instead calls methods on the weapon currently being used, despite both the character and weapons having </w:t>
+      </w:r>
+      <w:r>
+        <w:t>the same Weapon Animator component.</w:t>
+      </w:r>
+      <w:r>
+        <w:t xml:space="preserve"> </w:t>
+      </w:r>
+    </w:p>
+    <w:p>
+      <w:pPr>
+        <w:pStyle w:val="Heading3"/>
+      </w:pPr>
+      <w:r>
+        <w:t>Weapons</w:t>
+      </w:r>
+    </w:p>
+    <w:p/>
     <w:p/>
     <w:p>
       <w:pPr>

</xml_diff>

<commit_message>
Small changes to scripts + docs
</commit_message>
<xml_diff>
--- a/DesignDocument.docx
+++ b/DesignDocument.docx
@@ -582,7 +582,7 @@
               <w:r>
                 <w:fldChar w:fldCharType="separate"/>
               </w:r>
-              <w:hyperlink w:anchor="_Toc195799408" w:history="1">
+              <w:hyperlink w:anchor="_Toc197532739" w:history="1">
                 <w:r>
                   <w:rPr>
                     <w:rStyle w:val="Hyperlink"/>
@@ -609,7 +609,7 @@
                     <w:noProof/>
                     <w:webHidden/>
                   </w:rPr>
-                  <w:instrText xml:space="preserve"> PAGEREF _Toc195799408 \h </w:instrText>
+                  <w:instrText xml:space="preserve"> PAGEREF _Toc197532739 \h </w:instrText>
                 </w:r>
                 <w:r>
                   <w:rPr>
@@ -652,7 +652,7 @@
                   <w:lang w:eastAsia="en-GB"/>
                 </w:rPr>
               </w:pPr>
-              <w:hyperlink w:anchor="_Toc195799409" w:history="1">
+              <w:hyperlink w:anchor="_Toc197532740" w:history="1">
                 <w:r>
                   <w:rPr>
                     <w:rStyle w:val="Hyperlink"/>
@@ -679,7 +679,7 @@
                     <w:noProof/>
                     <w:webHidden/>
                   </w:rPr>
-                  <w:instrText xml:space="preserve"> PAGEREF _Toc195799409 \h </w:instrText>
+                  <w:instrText xml:space="preserve"> PAGEREF _Toc197532740 \h </w:instrText>
                 </w:r>
                 <w:r>
                   <w:rPr>
@@ -722,7 +722,7 @@
                   <w:lang w:eastAsia="en-GB"/>
                 </w:rPr>
               </w:pPr>
-              <w:hyperlink w:anchor="_Toc195799410" w:history="1">
+              <w:hyperlink w:anchor="_Toc197532741" w:history="1">
                 <w:r>
                   <w:rPr>
                     <w:rStyle w:val="Hyperlink"/>
@@ -749,7 +749,7 @@
                     <w:noProof/>
                     <w:webHidden/>
                   </w:rPr>
-                  <w:instrText xml:space="preserve"> PAGEREF _Toc195799410 \h </w:instrText>
+                  <w:instrText xml:space="preserve"> PAGEREF _Toc197532741 \h </w:instrText>
                 </w:r>
                 <w:r>
                   <w:rPr>
@@ -792,7 +792,7 @@
                   <w:lang w:eastAsia="en-GB"/>
                 </w:rPr>
               </w:pPr>
-              <w:hyperlink w:anchor="_Toc195799411" w:history="1">
+              <w:hyperlink w:anchor="_Toc197532742" w:history="1">
                 <w:r>
                   <w:rPr>
                     <w:rStyle w:val="Hyperlink"/>
@@ -819,7 +819,7 @@
                     <w:noProof/>
                     <w:webHidden/>
                   </w:rPr>
-                  <w:instrText xml:space="preserve"> PAGEREF _Toc195799411 \h </w:instrText>
+                  <w:instrText xml:space="preserve"> PAGEREF _Toc197532742 \h </w:instrText>
                 </w:r>
                 <w:r>
                   <w:rPr>
@@ -862,7 +862,7 @@
                   <w:lang w:eastAsia="en-GB"/>
                 </w:rPr>
               </w:pPr>
-              <w:hyperlink w:anchor="_Toc195799412" w:history="1">
+              <w:hyperlink w:anchor="_Toc197532743" w:history="1">
                 <w:r>
                   <w:rPr>
                     <w:rStyle w:val="Hyperlink"/>
@@ -889,7 +889,7 @@
                     <w:noProof/>
                     <w:webHidden/>
                   </w:rPr>
-                  <w:instrText xml:space="preserve"> PAGEREF _Toc195799412 \h </w:instrText>
+                  <w:instrText xml:space="preserve"> PAGEREF _Toc197532743 \h </w:instrText>
                 </w:r>
                 <w:r>
                   <w:rPr>
@@ -932,7 +932,7 @@
                   <w:lang w:eastAsia="en-GB"/>
                 </w:rPr>
               </w:pPr>
-              <w:hyperlink w:anchor="_Toc195799413" w:history="1">
+              <w:hyperlink w:anchor="_Toc197532744" w:history="1">
                 <w:r>
                   <w:rPr>
                     <w:rStyle w:val="Hyperlink"/>
@@ -959,7 +959,7 @@
                     <w:noProof/>
                     <w:webHidden/>
                   </w:rPr>
-                  <w:instrText xml:space="preserve"> PAGEREF _Toc195799413 \h </w:instrText>
+                  <w:instrText xml:space="preserve"> PAGEREF _Toc197532744 \h </w:instrText>
                 </w:r>
                 <w:r>
                   <w:rPr>
@@ -1002,7 +1002,7 @@
                   <w:lang w:eastAsia="en-GB"/>
                 </w:rPr>
               </w:pPr>
-              <w:hyperlink w:anchor="_Toc195799414" w:history="1">
+              <w:hyperlink w:anchor="_Toc197532745" w:history="1">
                 <w:r>
                   <w:rPr>
                     <w:rStyle w:val="Hyperlink"/>
@@ -1029,7 +1029,7 @@
                     <w:noProof/>
                     <w:webHidden/>
                   </w:rPr>
-                  <w:instrText xml:space="preserve"> PAGEREF _Toc195799414 \h </w:instrText>
+                  <w:instrText xml:space="preserve"> PAGEREF _Toc197532745 \h </w:instrText>
                 </w:r>
                 <w:r>
                   <w:rPr>
@@ -1072,7 +1072,7 @@
                   <w:lang w:eastAsia="en-GB"/>
                 </w:rPr>
               </w:pPr>
-              <w:hyperlink w:anchor="_Toc195799415" w:history="1">
+              <w:hyperlink w:anchor="_Toc197532746" w:history="1">
                 <w:r>
                   <w:rPr>
                     <w:rStyle w:val="Hyperlink"/>
@@ -1099,7 +1099,7 @@
                     <w:noProof/>
                     <w:webHidden/>
                   </w:rPr>
-                  <w:instrText xml:space="preserve"> PAGEREF _Toc195799415 \h </w:instrText>
+                  <w:instrText xml:space="preserve"> PAGEREF _Toc197532746 \h </w:instrText>
                 </w:r>
                 <w:r>
                   <w:rPr>
@@ -1120,6 +1120,146 @@
                     <w:webHidden/>
                   </w:rPr>
                   <w:t>4</w:t>
+                </w:r>
+                <w:r>
+                  <w:rPr>
+                    <w:noProof/>
+                    <w:webHidden/>
+                  </w:rPr>
+                  <w:fldChar w:fldCharType="end"/>
+                </w:r>
+              </w:hyperlink>
+            </w:p>
+            <w:p>
+              <w:pPr>
+                <w:pStyle w:val="TOC2"/>
+                <w:tabs>
+                  <w:tab w:val="right" w:leader="dot" w:pos="9016"/>
+                </w:tabs>
+                <w:rPr>
+                  <w:rFonts w:eastAsiaTheme="minorEastAsia"/>
+                  <w:noProof/>
+                  <w:lang w:eastAsia="en-GB"/>
+                </w:rPr>
+              </w:pPr>
+              <w:hyperlink w:anchor="_Toc197532747" w:history="1">
+                <w:r>
+                  <w:rPr>
+                    <w:rStyle w:val="Hyperlink"/>
+                    <w:noProof/>
+                  </w:rPr>
+                  <w:t>Hitscan</w:t>
+                </w:r>
+                <w:r>
+                  <w:rPr>
+                    <w:noProof/>
+                    <w:webHidden/>
+                  </w:rPr>
+                  <w:tab/>
+                </w:r>
+                <w:r>
+                  <w:rPr>
+                    <w:noProof/>
+                    <w:webHidden/>
+                  </w:rPr>
+                  <w:fldChar w:fldCharType="begin"/>
+                </w:r>
+                <w:r>
+                  <w:rPr>
+                    <w:noProof/>
+                    <w:webHidden/>
+                  </w:rPr>
+                  <w:instrText xml:space="preserve"> PAGEREF _Toc197532747 \h </w:instrText>
+                </w:r>
+                <w:r>
+                  <w:rPr>
+                    <w:noProof/>
+                    <w:webHidden/>
+                  </w:rPr>
+                </w:r>
+                <w:r>
+                  <w:rPr>
+                    <w:noProof/>
+                    <w:webHidden/>
+                  </w:rPr>
+                  <w:fldChar w:fldCharType="separate"/>
+                </w:r>
+                <w:r>
+                  <w:rPr>
+                    <w:noProof/>
+                    <w:webHidden/>
+                  </w:rPr>
+                  <w:t>4</w:t>
+                </w:r>
+                <w:r>
+                  <w:rPr>
+                    <w:noProof/>
+                    <w:webHidden/>
+                  </w:rPr>
+                  <w:fldChar w:fldCharType="end"/>
+                </w:r>
+              </w:hyperlink>
+            </w:p>
+            <w:p>
+              <w:pPr>
+                <w:pStyle w:val="TOC2"/>
+                <w:tabs>
+                  <w:tab w:val="right" w:leader="dot" w:pos="9016"/>
+                </w:tabs>
+                <w:rPr>
+                  <w:rFonts w:eastAsiaTheme="minorEastAsia"/>
+                  <w:noProof/>
+                  <w:lang w:eastAsia="en-GB"/>
+                </w:rPr>
+              </w:pPr>
+              <w:hyperlink w:anchor="_Toc197532748" w:history="1">
+                <w:r>
+                  <w:rPr>
+                    <w:rStyle w:val="Hyperlink"/>
+                    <w:noProof/>
+                  </w:rPr>
+                  <w:t>Projectiles</w:t>
+                </w:r>
+                <w:r>
+                  <w:rPr>
+                    <w:noProof/>
+                    <w:webHidden/>
+                  </w:rPr>
+                  <w:tab/>
+                </w:r>
+                <w:r>
+                  <w:rPr>
+                    <w:noProof/>
+                    <w:webHidden/>
+                  </w:rPr>
+                  <w:fldChar w:fldCharType="begin"/>
+                </w:r>
+                <w:r>
+                  <w:rPr>
+                    <w:noProof/>
+                    <w:webHidden/>
+                  </w:rPr>
+                  <w:instrText xml:space="preserve"> PAGEREF _Toc197532748 \h </w:instrText>
+                </w:r>
+                <w:r>
+                  <w:rPr>
+                    <w:noProof/>
+                    <w:webHidden/>
+                  </w:rPr>
+                </w:r>
+                <w:r>
+                  <w:rPr>
+                    <w:noProof/>
+                    <w:webHidden/>
+                  </w:rPr>
+                  <w:fldChar w:fldCharType="separate"/>
+                </w:r>
+                <w:r>
+                  <w:rPr>
+                    <w:noProof/>
+                    <w:webHidden/>
+                  </w:rPr>
+                  <w:t>5</w:t>
                 </w:r>
                 <w:r>
                   <w:rPr>
@@ -1142,7 +1282,7 @@
                   <w:lang w:eastAsia="en-GB"/>
                 </w:rPr>
               </w:pPr>
-              <w:hyperlink w:anchor="_Toc195799416" w:history="1">
+              <w:hyperlink w:anchor="_Toc197532749" w:history="1">
                 <w:r>
                   <w:rPr>
                     <w:rStyle w:val="Hyperlink"/>
@@ -1169,7 +1309,7 @@
                     <w:noProof/>
                     <w:webHidden/>
                   </w:rPr>
-                  <w:instrText xml:space="preserve"> PAGEREF _Toc195799416 \h </w:instrText>
+                  <w:instrText xml:space="preserve"> PAGEREF _Toc197532749 \h </w:instrText>
                 </w:r>
                 <w:r>
                   <w:rPr>
@@ -1189,7 +1329,7 @@
                     <w:noProof/>
                     <w:webHidden/>
                   </w:rPr>
-                  <w:t>4</w:t>
+                  <w:t>6</w:t>
                 </w:r>
                 <w:r>
                   <w:rPr>
@@ -1212,7 +1352,7 @@
                   <w:lang w:eastAsia="en-GB"/>
                 </w:rPr>
               </w:pPr>
-              <w:hyperlink w:anchor="_Toc195799417" w:history="1">
+              <w:hyperlink w:anchor="_Toc197532750" w:history="1">
                 <w:r>
                   <w:rPr>
                     <w:rStyle w:val="Hyperlink"/>
@@ -1239,7 +1379,7 @@
                     <w:noProof/>
                     <w:webHidden/>
                   </w:rPr>
-                  <w:instrText xml:space="preserve"> PAGEREF _Toc195799417 \h </w:instrText>
+                  <w:instrText xml:space="preserve"> PAGEREF _Toc197532750 \h </w:instrText>
                 </w:r>
                 <w:r>
                   <w:rPr>
@@ -1259,7 +1399,7 @@
                     <w:noProof/>
                     <w:webHidden/>
                   </w:rPr>
-                  <w:t>4</w:t>
+                  <w:t>6</w:t>
                 </w:r>
                 <w:r>
                   <w:rPr>
@@ -1282,7 +1422,7 @@
                   <w:lang w:eastAsia="en-GB"/>
                 </w:rPr>
               </w:pPr>
-              <w:hyperlink w:anchor="_Toc195799418" w:history="1">
+              <w:hyperlink w:anchor="_Toc197532751" w:history="1">
                 <w:r>
                   <w:rPr>
                     <w:rStyle w:val="Hyperlink"/>
@@ -1309,7 +1449,7 @@
                     <w:noProof/>
                     <w:webHidden/>
                   </w:rPr>
-                  <w:instrText xml:space="preserve"> PAGEREF _Toc195799418 \h </w:instrText>
+                  <w:instrText xml:space="preserve"> PAGEREF _Toc197532751 \h </w:instrText>
                 </w:r>
                 <w:r>
                   <w:rPr>
@@ -1329,7 +1469,7 @@
                     <w:noProof/>
                     <w:webHidden/>
                   </w:rPr>
-                  <w:t>4</w:t>
+                  <w:t>6</w:t>
                 </w:r>
                 <w:r>
                   <w:rPr>
@@ -1352,7 +1492,7 @@
                   <w:lang w:eastAsia="en-GB"/>
                 </w:rPr>
               </w:pPr>
-              <w:hyperlink w:anchor="_Toc195799419" w:history="1">
+              <w:hyperlink w:anchor="_Toc197532752" w:history="1">
                 <w:r>
                   <w:rPr>
                     <w:rStyle w:val="Hyperlink"/>
@@ -1379,7 +1519,7 @@
                     <w:noProof/>
                     <w:webHidden/>
                   </w:rPr>
-                  <w:instrText xml:space="preserve"> PAGEREF _Toc195799419 \h </w:instrText>
+                  <w:instrText xml:space="preserve"> PAGEREF _Toc197532752 \h </w:instrText>
                 </w:r>
                 <w:r>
                   <w:rPr>
@@ -1399,7 +1539,7 @@
                     <w:noProof/>
                     <w:webHidden/>
                   </w:rPr>
-                  <w:t>4</w:t>
+                  <w:t>6</w:t>
                 </w:r>
                 <w:r>
                   <w:rPr>
@@ -1422,7 +1562,7 @@
                   <w:lang w:eastAsia="en-GB"/>
                 </w:rPr>
               </w:pPr>
-              <w:hyperlink w:anchor="_Toc195799420" w:history="1">
+              <w:hyperlink w:anchor="_Toc197532753" w:history="1">
                 <w:r>
                   <w:rPr>
                     <w:rStyle w:val="Hyperlink"/>
@@ -1449,7 +1589,7 @@
                     <w:noProof/>
                     <w:webHidden/>
                   </w:rPr>
-                  <w:instrText xml:space="preserve"> PAGEREF _Toc195799420 \h </w:instrText>
+                  <w:instrText xml:space="preserve"> PAGEREF _Toc197532753 \h </w:instrText>
                 </w:r>
                 <w:r>
                   <w:rPr>
@@ -1469,7 +1609,7 @@
                     <w:noProof/>
                     <w:webHidden/>
                   </w:rPr>
-                  <w:t>5</w:t>
+                  <w:t>7</w:t>
                 </w:r>
                 <w:r>
                   <w:rPr>
@@ -1492,7 +1632,7 @@
                   <w:lang w:eastAsia="en-GB"/>
                 </w:rPr>
               </w:pPr>
-              <w:hyperlink w:anchor="_Toc195799421" w:history="1">
+              <w:hyperlink w:anchor="_Toc197532754" w:history="1">
                 <w:r>
                   <w:rPr>
                     <w:rStyle w:val="Hyperlink"/>
@@ -1519,7 +1659,7 @@
                     <w:noProof/>
                     <w:webHidden/>
                   </w:rPr>
-                  <w:instrText xml:space="preserve"> PAGEREF _Toc195799421 \h </w:instrText>
+                  <w:instrText xml:space="preserve"> PAGEREF _Toc197532754 \h </w:instrText>
                 </w:r>
                 <w:r>
                   <w:rPr>
@@ -1539,7 +1679,7 @@
                     <w:noProof/>
                     <w:webHidden/>
                   </w:rPr>
-                  <w:t>5</w:t>
+                  <w:t>7</w:t>
                 </w:r>
                 <w:r>
                   <w:rPr>
@@ -1562,7 +1702,7 @@
                   <w:lang w:eastAsia="en-GB"/>
                 </w:rPr>
               </w:pPr>
-              <w:hyperlink w:anchor="_Toc195799422" w:history="1">
+              <w:hyperlink w:anchor="_Toc197532755" w:history="1">
                 <w:r>
                   <w:rPr>
                     <w:rStyle w:val="Hyperlink"/>
@@ -1589,7 +1729,7 @@
                     <w:noProof/>
                     <w:webHidden/>
                   </w:rPr>
-                  <w:instrText xml:space="preserve"> PAGEREF _Toc195799422 \h </w:instrText>
+                  <w:instrText xml:space="preserve"> PAGEREF _Toc197532755 \h </w:instrText>
                 </w:r>
                 <w:r>
                   <w:rPr>
@@ -1609,7 +1749,7 @@
                     <w:noProof/>
                     <w:webHidden/>
                   </w:rPr>
-                  <w:t>5</w:t>
+                  <w:t>7</w:t>
                 </w:r>
                 <w:r>
                   <w:rPr>
@@ -1632,7 +1772,7 @@
                   <w:lang w:eastAsia="en-GB"/>
                 </w:rPr>
               </w:pPr>
-              <w:hyperlink w:anchor="_Toc195799423" w:history="1">
+              <w:hyperlink w:anchor="_Toc197532756" w:history="1">
                 <w:r>
                   <w:rPr>
                     <w:rStyle w:val="Hyperlink"/>
@@ -1659,7 +1799,7 @@
                     <w:noProof/>
                     <w:webHidden/>
                   </w:rPr>
-                  <w:instrText xml:space="preserve"> PAGEREF _Toc195799423 \h </w:instrText>
+                  <w:instrText xml:space="preserve"> PAGEREF _Toc197532756 \h </w:instrText>
                 </w:r>
                 <w:r>
                   <w:rPr>
@@ -1679,7 +1819,7 @@
                     <w:noProof/>
                     <w:webHidden/>
                   </w:rPr>
-                  <w:t>5</w:t>
+                  <w:t>8</w:t>
                 </w:r>
                 <w:r>
                   <w:rPr>
@@ -1702,7 +1842,7 @@
                   <w:lang w:eastAsia="en-GB"/>
                 </w:rPr>
               </w:pPr>
-              <w:hyperlink w:anchor="_Toc195799424" w:history="1">
+              <w:hyperlink w:anchor="_Toc197532757" w:history="1">
                 <w:r>
                   <w:rPr>
                     <w:rStyle w:val="Hyperlink"/>
@@ -1729,7 +1869,7 @@
                     <w:noProof/>
                     <w:webHidden/>
                   </w:rPr>
-                  <w:instrText xml:space="preserve"> PAGEREF _Toc195799424 \h </w:instrText>
+                  <w:instrText xml:space="preserve"> PAGEREF _Toc197532757 \h </w:instrText>
                 </w:r>
                 <w:r>
                   <w:rPr>
@@ -1749,7 +1889,7 @@
                     <w:noProof/>
                     <w:webHidden/>
                   </w:rPr>
-                  <w:t>6</w:t>
+                  <w:t>8</w:t>
                 </w:r>
                 <w:r>
                   <w:rPr>
@@ -1772,7 +1912,7 @@
                   <w:lang w:eastAsia="en-GB"/>
                 </w:rPr>
               </w:pPr>
-              <w:hyperlink w:anchor="_Toc195799425" w:history="1">
+              <w:hyperlink w:anchor="_Toc197532758" w:history="1">
                 <w:r>
                   <w:rPr>
                     <w:rStyle w:val="Hyperlink"/>
@@ -1799,7 +1939,7 @@
                     <w:noProof/>
                     <w:webHidden/>
                   </w:rPr>
-                  <w:instrText xml:space="preserve"> PAGEREF _Toc195799425 \h </w:instrText>
+                  <w:instrText xml:space="preserve"> PAGEREF _Toc197532758 \h </w:instrText>
                 </w:r>
                 <w:r>
                   <w:rPr>
@@ -1819,7 +1959,7 @@
                     <w:noProof/>
                     <w:webHidden/>
                   </w:rPr>
-                  <w:t>6</w:t>
+                  <w:t>8</w:t>
                 </w:r>
                 <w:r>
                   <w:rPr>
@@ -1842,7 +1982,7 @@
                   <w:lang w:eastAsia="en-GB"/>
                 </w:rPr>
               </w:pPr>
-              <w:hyperlink w:anchor="_Toc195799426" w:history="1">
+              <w:hyperlink w:anchor="_Toc197532759" w:history="1">
                 <w:r>
                   <w:rPr>
                     <w:rStyle w:val="Hyperlink"/>
@@ -1869,7 +2009,7 @@
                     <w:noProof/>
                     <w:webHidden/>
                   </w:rPr>
-                  <w:instrText xml:space="preserve"> PAGEREF _Toc195799426 \h </w:instrText>
+                  <w:instrText xml:space="preserve"> PAGEREF _Toc197532759 \h </w:instrText>
                 </w:r>
                 <w:r>
                   <w:rPr>
@@ -1889,7 +2029,7 @@
                     <w:noProof/>
                     <w:webHidden/>
                   </w:rPr>
-                  <w:t>6</w:t>
+                  <w:t>8</w:t>
                 </w:r>
                 <w:r>
                   <w:rPr>
@@ -1912,7 +2052,7 @@
                   <w:lang w:eastAsia="en-GB"/>
                 </w:rPr>
               </w:pPr>
-              <w:hyperlink w:anchor="_Toc195799427" w:history="1">
+              <w:hyperlink w:anchor="_Toc197532760" w:history="1">
                 <w:r>
                   <w:rPr>
                     <w:rStyle w:val="Hyperlink"/>
@@ -1939,7 +2079,7 @@
                     <w:noProof/>
                     <w:webHidden/>
                   </w:rPr>
-                  <w:instrText xml:space="preserve"> PAGEREF _Toc195799427 \h </w:instrText>
+                  <w:instrText xml:space="preserve"> PAGEREF _Toc197532760 \h </w:instrText>
                 </w:r>
                 <w:r>
                   <w:rPr>
@@ -1959,7 +2099,7 @@
                     <w:noProof/>
                     <w:webHidden/>
                   </w:rPr>
-                  <w:t>6</w:t>
+                  <w:t>8</w:t>
                 </w:r>
                 <w:r>
                   <w:rPr>
@@ -1982,7 +2122,7 @@
                   <w:lang w:eastAsia="en-GB"/>
                 </w:rPr>
               </w:pPr>
-              <w:hyperlink w:anchor="_Toc195799428" w:history="1">
+              <w:hyperlink w:anchor="_Toc197532761" w:history="1">
                 <w:r>
                   <w:rPr>
                     <w:rStyle w:val="Hyperlink"/>
@@ -2009,7 +2149,7 @@
                     <w:noProof/>
                     <w:webHidden/>
                   </w:rPr>
-                  <w:instrText xml:space="preserve"> PAGEREF _Toc195799428 \h </w:instrText>
+                  <w:instrText xml:space="preserve"> PAGEREF _Toc197532761 \h </w:instrText>
                 </w:r>
                 <w:r>
                   <w:rPr>
@@ -2029,7 +2169,147 @@
                     <w:noProof/>
                     <w:webHidden/>
                   </w:rPr>
-                  <w:t>6</w:t>
+                  <w:t>9</w:t>
+                </w:r>
+                <w:r>
+                  <w:rPr>
+                    <w:noProof/>
+                    <w:webHidden/>
+                  </w:rPr>
+                  <w:fldChar w:fldCharType="end"/>
+                </w:r>
+              </w:hyperlink>
+            </w:p>
+            <w:p>
+              <w:pPr>
+                <w:pStyle w:val="TOC3"/>
+                <w:tabs>
+                  <w:tab w:val="right" w:leader="dot" w:pos="9016"/>
+                </w:tabs>
+                <w:rPr>
+                  <w:rFonts w:eastAsiaTheme="minorEastAsia"/>
+                  <w:noProof/>
+                  <w:lang w:eastAsia="en-GB"/>
+                </w:rPr>
+              </w:pPr>
+              <w:hyperlink w:anchor="_Toc197532762" w:history="1">
+                <w:r>
+                  <w:rPr>
+                    <w:rStyle w:val="Hyperlink"/>
+                    <w:noProof/>
+                  </w:rPr>
+                  <w:t>Characters</w:t>
+                </w:r>
+                <w:r>
+                  <w:rPr>
+                    <w:noProof/>
+                    <w:webHidden/>
+                  </w:rPr>
+                  <w:tab/>
+                </w:r>
+                <w:r>
+                  <w:rPr>
+                    <w:noProof/>
+                    <w:webHidden/>
+                  </w:rPr>
+                  <w:fldChar w:fldCharType="begin"/>
+                </w:r>
+                <w:r>
+                  <w:rPr>
+                    <w:noProof/>
+                    <w:webHidden/>
+                  </w:rPr>
+                  <w:instrText xml:space="preserve"> PAGEREF _Toc197532762 \h </w:instrText>
+                </w:r>
+                <w:r>
+                  <w:rPr>
+                    <w:noProof/>
+                    <w:webHidden/>
+                  </w:rPr>
+                </w:r>
+                <w:r>
+                  <w:rPr>
+                    <w:noProof/>
+                    <w:webHidden/>
+                  </w:rPr>
+                  <w:fldChar w:fldCharType="separate"/>
+                </w:r>
+                <w:r>
+                  <w:rPr>
+                    <w:noProof/>
+                    <w:webHidden/>
+                  </w:rPr>
+                  <w:t>9</w:t>
+                </w:r>
+                <w:r>
+                  <w:rPr>
+                    <w:noProof/>
+                    <w:webHidden/>
+                  </w:rPr>
+                  <w:fldChar w:fldCharType="end"/>
+                </w:r>
+              </w:hyperlink>
+            </w:p>
+            <w:p>
+              <w:pPr>
+                <w:pStyle w:val="TOC3"/>
+                <w:tabs>
+                  <w:tab w:val="right" w:leader="dot" w:pos="9016"/>
+                </w:tabs>
+                <w:rPr>
+                  <w:rFonts w:eastAsiaTheme="minorEastAsia"/>
+                  <w:noProof/>
+                  <w:lang w:eastAsia="en-GB"/>
+                </w:rPr>
+              </w:pPr>
+              <w:hyperlink w:anchor="_Toc197532763" w:history="1">
+                <w:r>
+                  <w:rPr>
+                    <w:rStyle w:val="Hyperlink"/>
+                    <w:noProof/>
+                  </w:rPr>
+                  <w:t>Weapons</w:t>
+                </w:r>
+                <w:r>
+                  <w:rPr>
+                    <w:noProof/>
+                    <w:webHidden/>
+                  </w:rPr>
+                  <w:tab/>
+                </w:r>
+                <w:r>
+                  <w:rPr>
+                    <w:noProof/>
+                    <w:webHidden/>
+                  </w:rPr>
+                  <w:fldChar w:fldCharType="begin"/>
+                </w:r>
+                <w:r>
+                  <w:rPr>
+                    <w:noProof/>
+                    <w:webHidden/>
+                  </w:rPr>
+                  <w:instrText xml:space="preserve"> PAGEREF _Toc197532763 \h </w:instrText>
+                </w:r>
+                <w:r>
+                  <w:rPr>
+                    <w:noProof/>
+                    <w:webHidden/>
+                  </w:rPr>
+                </w:r>
+                <w:r>
+                  <w:rPr>
+                    <w:noProof/>
+                    <w:webHidden/>
+                  </w:rPr>
+                  <w:fldChar w:fldCharType="separate"/>
+                </w:r>
+                <w:r>
+                  <w:rPr>
+                    <w:noProof/>
+                    <w:webHidden/>
+                  </w:rPr>
+                  <w:t>9</w:t>
                 </w:r>
                 <w:r>
                   <w:rPr>
@@ -2052,7 +2332,7 @@
                   <w:lang w:eastAsia="en-GB"/>
                 </w:rPr>
               </w:pPr>
-              <w:hyperlink w:anchor="_Toc195799429" w:history="1">
+              <w:hyperlink w:anchor="_Toc197532764" w:history="1">
                 <w:r>
                   <w:rPr>
                     <w:rStyle w:val="Hyperlink"/>
@@ -2079,7 +2359,7 @@
                     <w:noProof/>
                     <w:webHidden/>
                   </w:rPr>
-                  <w:instrText xml:space="preserve"> PAGEREF _Toc195799429 \h </w:instrText>
+                  <w:instrText xml:space="preserve"> PAGEREF _Toc197532764 \h </w:instrText>
                 </w:r>
                 <w:r>
                   <w:rPr>
@@ -2099,7 +2379,7 @@
                     <w:noProof/>
                     <w:webHidden/>
                   </w:rPr>
-                  <w:t>6</w:t>
+                  <w:t>9</w:t>
                 </w:r>
                 <w:r>
                   <w:rPr>
@@ -2122,7 +2402,7 @@
                   <w:lang w:eastAsia="en-GB"/>
                 </w:rPr>
               </w:pPr>
-              <w:hyperlink w:anchor="_Toc195799430" w:history="1">
+              <w:hyperlink w:anchor="_Toc197532765" w:history="1">
                 <w:r>
                   <w:rPr>
                     <w:rStyle w:val="Hyperlink"/>
@@ -2149,7 +2429,7 @@
                     <w:noProof/>
                     <w:webHidden/>
                   </w:rPr>
-                  <w:instrText xml:space="preserve"> PAGEREF _Toc195799430 \h </w:instrText>
+                  <w:instrText xml:space="preserve"> PAGEREF _Toc197532765 \h </w:instrText>
                 </w:r>
                 <w:r>
                   <w:rPr>
@@ -2169,7 +2449,7 @@
                     <w:noProof/>
                     <w:webHidden/>
                   </w:rPr>
-                  <w:t>6</w:t>
+                  <w:t>9</w:t>
                 </w:r>
                 <w:r>
                   <w:rPr>
@@ -2192,13 +2472,13 @@
                   <w:lang w:eastAsia="en-GB"/>
                 </w:rPr>
               </w:pPr>
-              <w:hyperlink w:anchor="_Toc195799431" w:history="1">
+              <w:hyperlink w:anchor="_Toc197532766" w:history="1">
                 <w:r>
                   <w:rPr>
                     <w:rStyle w:val="Hyperlink"/>
                     <w:noProof/>
                   </w:rPr>
-                  <w:t>Camera Trickery</w:t>
+                  <w:t>Cameras</w:t>
                 </w:r>
                 <w:r>
                   <w:rPr>
@@ -2219,7 +2499,7 @@
                     <w:noProof/>
                     <w:webHidden/>
                   </w:rPr>
-                  <w:instrText xml:space="preserve"> PAGEREF _Toc195799431 \h </w:instrText>
+                  <w:instrText xml:space="preserve"> PAGEREF _Toc197532766 \h </w:instrText>
                 </w:r>
                 <w:r>
                   <w:rPr>
@@ -2239,7 +2519,7 @@
                     <w:noProof/>
                     <w:webHidden/>
                   </w:rPr>
-                  <w:t>6</w:t>
+                  <w:t>9</w:t>
                 </w:r>
                 <w:r>
                   <w:rPr>
@@ -2262,13 +2542,13 @@
                   <w:lang w:eastAsia="en-GB"/>
                 </w:rPr>
               </w:pPr>
-              <w:hyperlink w:anchor="_Toc195799432" w:history="1">
+              <w:hyperlink w:anchor="_Toc197532767" w:history="1">
                 <w:r>
                   <w:rPr>
                     <w:rStyle w:val="Hyperlink"/>
                     <w:noProof/>
                   </w:rPr>
-                  <w:t>Shader Magic</w:t>
+                  <w:t>Shaders</w:t>
                 </w:r>
                 <w:r>
                   <w:rPr>
@@ -2289,7 +2569,7 @@
                     <w:noProof/>
                     <w:webHidden/>
                   </w:rPr>
-                  <w:instrText xml:space="preserve"> PAGEREF _Toc195799432 \h </w:instrText>
+                  <w:instrText xml:space="preserve"> PAGEREF _Toc197532767 \h </w:instrText>
                 </w:r>
                 <w:r>
                   <w:rPr>
@@ -2309,7 +2589,7 @@
                     <w:noProof/>
                     <w:webHidden/>
                   </w:rPr>
-                  <w:t>6</w:t>
+                  <w:t>9</w:t>
                 </w:r>
                 <w:r>
                   <w:rPr>
@@ -2343,7 +2623,7 @@
       <w:pPr>
         <w:pStyle w:val="Heading1"/>
       </w:pPr>
-      <w:bookmarkStart w:id="0" w:name="_Toc195799408"/>
+      <w:bookmarkStart w:id="0" w:name="_Toc197532739"/>
       <w:r>
         <w:t>Aims of the project</w:t>
       </w:r>
@@ -2354,7 +2634,13 @@
         <w:t>As outlined by the project definition, this is intended to be a multi-faceted project and will take place in two programs primarily: Blender for Rigging and 3D Animation</w:t>
       </w:r>
       <w:r>
-        <w:t xml:space="preserve"> and Unity 6000.0.32f1 as the game engine.</w:t>
+        <w:t xml:space="preserve"> and Unity </w:t>
+      </w:r>
+      <w:r>
+        <w:t>2022.3.29f1</w:t>
+      </w:r>
+      <w:r>
+        <w:t xml:space="preserve"> as the game engine.</w:t>
       </w:r>
       <w:r>
         <w:t xml:space="preserve"> This Framework would, in theory, provide an avenue for non-programmers to implement most kinds of weapons through heavy parameterisation. Animators will be able to easily work closely with/independently of the programmer to implement these weapons due to a streamlined pipeline and a convenient and efficient system for assigning animations to weapons.</w:t>
@@ -2378,7 +2664,7 @@
       <w:pPr>
         <w:pStyle w:val="Heading1"/>
       </w:pPr>
-      <w:bookmarkStart w:id="1" w:name="_Toc195799409"/>
+      <w:bookmarkStart w:id="1" w:name="_Toc197532740"/>
       <w:r>
         <w:t>Planned Features</w:t>
       </w:r>
@@ -2388,7 +2674,7 @@
       <w:pPr>
         <w:pStyle w:val="Heading2"/>
       </w:pPr>
-      <w:bookmarkStart w:id="2" w:name="_Toc195799410"/>
+      <w:bookmarkStart w:id="2" w:name="_Toc197532741"/>
       <w:r>
         <w:t>Weapon Implementation</w:t>
       </w:r>
@@ -2398,7 +2684,7 @@
       <w:pPr>
         <w:pStyle w:val="Heading3"/>
       </w:pPr>
-      <w:bookmarkStart w:id="3" w:name="_Toc195799411"/>
+      <w:bookmarkStart w:id="3" w:name="_Toc197532742"/>
       <w:r>
         <w:t>Firearms</w:t>
       </w:r>
@@ -2463,7 +2749,7 @@
       <w:pPr>
         <w:pStyle w:val="Heading3"/>
       </w:pPr>
-      <w:bookmarkStart w:id="4" w:name="_Toc195799412"/>
+      <w:bookmarkStart w:id="4" w:name="_Toc197532743"/>
       <w:r>
         <w:t>Melee</w:t>
       </w:r>
@@ -2482,7 +2768,7 @@
       <w:pPr>
         <w:pStyle w:val="Heading1"/>
       </w:pPr>
-      <w:bookmarkStart w:id="5" w:name="_Toc195799413"/>
+      <w:bookmarkStart w:id="5" w:name="_Toc197532744"/>
       <w:r>
         <w:t>Raycast Commands &amp; Bullet Scheduling</w:t>
       </w:r>
@@ -2529,7 +2815,7 @@
       <w:pPr>
         <w:pStyle w:val="Heading3"/>
       </w:pPr>
-      <w:bookmarkStart w:id="6" w:name="_Toc195799414"/>
+      <w:bookmarkStart w:id="6" w:name="_Toc197532745"/>
       <w:r>
         <w:t>Test Conditions</w:t>
       </w:r>
@@ -2577,7 +2863,7 @@
                     <pic:cNvPicPr/>
                   </pic:nvPicPr>
                   <pic:blipFill>
-                    <a:blip r:embed="rId6"/>
+                    <a:blip r:embed="rId7"/>
                     <a:stretch>
                       <a:fillRect/>
                     </a:stretch>
@@ -2602,7 +2888,7 @@
       <w:pPr>
         <w:pStyle w:val="Heading1"/>
       </w:pPr>
-      <w:bookmarkStart w:id="7" w:name="_Toc195799415"/>
+      <w:bookmarkStart w:id="7" w:name="_Toc197532746"/>
       <w:r>
         <w:t>Ranged Weapon Implementation</w:t>
       </w:r>
@@ -2610,49 +2896,416 @@
     </w:p>
     <w:p>
       <w:pPr>
+        <w:pStyle w:val="Heading2"/>
+      </w:pPr>
+      <w:bookmarkStart w:id="8" w:name="_Toc197532747"/>
+      <w:r>
+        <w:t>Hitscan</w:t>
+      </w:r>
+      <w:bookmarkEnd w:id="8"/>
+    </w:p>
+    <w:p>
+      <w:r>
+        <w:t>Hitscan “bullets” (hereby called Rays) are achieved via a multi-step system.</w:t>
+      </w:r>
+    </w:p>
+    <w:p>
+      <w:pPr>
+        <w:pStyle w:val="ListParagraph"/>
+        <w:numPr>
+          <w:ilvl w:val="0"/>
+          <w:numId w:val="3"/>
+        </w:numPr>
+      </w:pPr>
+      <w:r>
+        <w:t>An entity attempts to fire a Hitscan weapon. This runs through the core weapon logic, and arrives at the point in the script where we “schedule a bullet”</w:t>
+      </w:r>
+    </w:p>
+    <w:p>
+      <w:pPr>
+        <w:pStyle w:val="ListParagraph"/>
+        <w:numPr>
+          <w:ilvl w:val="0"/>
+          <w:numId w:val="3"/>
+        </w:numPr>
+      </w:pPr>
+      <w:r>
+        <w:t xml:space="preserve">The Hitscan weapon calls Schedule Bullet on the Bullet Scheduler (hereby called the Scheduler) </w:t>
+      </w:r>
+      <w:r>
+        <w:t xml:space="preserve">once for each fire iteration, </w:t>
+      </w:r>
+      <w:r>
+        <w:t>and passes the following information: Start point, direction, max distance, base distance, the owning weapon, and the “tracer” – the visualisation object for the Ray.</w:t>
+      </w:r>
+    </w:p>
+    <w:p>
+      <w:pPr>
+        <w:pStyle w:val="ListParagraph"/>
+        <w:numPr>
+          <w:ilvl w:val="0"/>
+          <w:numId w:val="3"/>
+        </w:numPr>
+      </w:pPr>
+      <w:r>
+        <w:t>The Scheduler queues that bullet by creating a RaycastData struct from the provided information. It also checks if the owning weapon has a tracer prefab and creates one at the start point. The new RaycastData is then added to a 2D array of RaycastData structs and increments the number of expected raycasts on the next simulation step (hereby called Ticks).</w:t>
+      </w:r>
+    </w:p>
+    <w:p>
+      <w:pPr>
+        <w:pStyle w:val="ListParagraph"/>
+        <w:numPr>
+          <w:ilvl w:val="0"/>
+          <w:numId w:val="3"/>
+        </w:numPr>
+      </w:pPr>
+      <w:r>
+        <w:t>On the next tick, the Scheduler simulates all the queued Rays using Unity’s Raycast Batching system, Raycast Commands. This simulates all the queued Rays on another thread and returns the information to the main thread.</w:t>
+      </w:r>
+    </w:p>
+    <w:p>
+      <w:pPr>
+        <w:pStyle w:val="ListParagraph"/>
+        <w:numPr>
+          <w:ilvl w:val="0"/>
+          <w:numId w:val="3"/>
+        </w:numPr>
+      </w:pPr>
+      <w:r>
+        <w:t>The Scheduler then processes the information and iterates through all the Raycast Hits returned in 4 steps</w:t>
+      </w:r>
+    </w:p>
+    <w:p>
+      <w:pPr>
+        <w:pStyle w:val="ListParagraph"/>
+        <w:numPr>
+          <w:ilvl w:val="1"/>
+          <w:numId w:val="3"/>
+        </w:numPr>
+      </w:pPr>
+      <w:r>
+        <w:t>If the ray hit something, we move the tracer to that point if it exists. If not, we increment a value to indicate how many hits are unwritten and continue to the next element in the array. If we encounter two unwritten hits, we finish executing the checks, as we have likely reached the end of the valid hits.</w:t>
+      </w:r>
+    </w:p>
+    <w:p>
+      <w:pPr>
+        <w:pStyle w:val="ListParagraph"/>
+        <w:numPr>
+          <w:ilvl w:val="1"/>
+          <w:numId w:val="3"/>
+        </w:numPr>
+      </w:pPr>
+      <w:r>
+        <w:t>Cache the collider and store a reference to the current Raycast Data and the Raycast Hit, to avoid constantly accessing multiple arrays via index.</w:t>
+      </w:r>
+    </w:p>
+    <w:p>
+      <w:pPr>
+        <w:pStyle w:val="ListParagraph"/>
+        <w:numPr>
+          <w:ilvl w:val="2"/>
+          <w:numId w:val="3"/>
+        </w:numPr>
+      </w:pPr>
+      <w:r>
+        <w:t>If the Raycast Data’s owner is null, we ignore this iteration and move onto the next one.</w:t>
+      </w:r>
+    </w:p>
+    <w:p>
+      <w:pPr>
+        <w:pStyle w:val="ListParagraph"/>
+        <w:numPr>
+          <w:ilvl w:val="1"/>
+          <w:numId w:val="3"/>
+        </w:numPr>
+      </w:pPr>
+      <w:r>
+        <w:t>Calculate the damage dealt based on the distance the projectile has travelled, using BaseWeapon.DamageDealt()</w:t>
+      </w:r>
+    </w:p>
+    <w:p>
+      <w:pPr>
+        <w:pStyle w:val="ListParagraph"/>
+        <w:numPr>
+          <w:ilvl w:val="1"/>
+          <w:numId w:val="3"/>
+        </w:numPr>
+      </w:pPr>
+      <w:r>
+        <w:t>Create and/or add the damage, hit point and hit force to an existing ColliderHitData (stored in a dictionary using the collider hit as a key).</w:t>
+      </w:r>
+    </w:p>
+    <w:p>
+      <w:pPr>
+        <w:pStyle w:val="ListParagraph"/>
+        <w:numPr>
+          <w:ilvl w:val="1"/>
+          <w:numId w:val="3"/>
+        </w:numPr>
+      </w:pPr>
+      <w:r>
+        <w:lastRenderedPageBreak/>
+        <w:t>Check if the Ray can penetrate through or ricochet from the collider we hit and schedule another bullet from the hit point if either is possible.</w:t>
+      </w:r>
+    </w:p>
+    <w:p>
+      <w:pPr>
+        <w:pStyle w:val="ListParagraph"/>
+        <w:numPr>
+          <w:ilvl w:val="2"/>
+          <w:numId w:val="3"/>
+        </w:numPr>
+      </w:pPr>
+      <w:r>
+        <w:t>If the Ray penetrates, we keep the same direction, multiply the remaining range by a Penetration Range Loss multiplier, and schedule the bullet again using the existing data.</w:t>
+      </w:r>
+    </w:p>
+    <w:p>
+      <w:pPr>
+        <w:pStyle w:val="ListParagraph"/>
+        <w:numPr>
+          <w:ilvl w:val="2"/>
+          <w:numId w:val="3"/>
+        </w:numPr>
+      </w:pPr>
+      <w:r>
+        <w:t>If the Ray ricochets, we similarly reschedule the bullet for the next Tick, but reflect the angle based on the surface normal.</w:t>
+      </w:r>
+    </w:p>
+    <w:p>
+      <w:pPr>
+        <w:pStyle w:val="ListParagraph"/>
+        <w:numPr>
+          <w:ilvl w:val="2"/>
+          <w:numId w:val="3"/>
+        </w:numPr>
+      </w:pPr>
+      <w:r>
+        <w:t>If a bullet will not travel any further, we tell the Tracer object that the bullet terminates there. If a bullet will travel further, we tell the Tracer that it can continue moving.</w:t>
+      </w:r>
+    </w:p>
+    <w:p>
+      <w:pPr>
+        <w:pStyle w:val="ListParagraph"/>
+        <w:numPr>
+          <w:ilvl w:val="1"/>
+          <w:numId w:val="3"/>
+        </w:numPr>
+      </w:pPr>
+      <w:r>
+        <w:t>Iterates through each collider that was hit this Tick, checks for a rigidbody and applies forces if one exists, and checks for a damageable and applies damage if one exists on this collider.</w:t>
+      </w:r>
+    </w:p>
+    <w:p>
+      <w:pPr>
+        <w:pStyle w:val="ListParagraph"/>
+        <w:numPr>
+          <w:ilvl w:val="1"/>
+          <w:numId w:val="3"/>
+        </w:numPr>
+      </w:pPr>
+      <w:r>
+        <w:t>Clears the colliders hit this tick, disposes of the raycast commands and the returned hits (to prevent memory leaks) and prints the time in milliseconds that this process took to complete.</w:t>
+      </w:r>
+    </w:p>
+    <w:p>
+      <w:pPr>
+        <w:pStyle w:val="Heading2"/>
+      </w:pPr>
+      <w:bookmarkStart w:id="9" w:name="_Toc197532748"/>
+      <w:r>
+        <w:t>Projectiles</w:t>
+      </w:r>
+      <w:bookmarkEnd w:id="9"/>
+    </w:p>
+    <w:p>
+      <w:r>
+        <w:t>Projectiles are not implemented in the prototype submission, though a shell exists for them to be implemented, with an object pool for them to draw from. All projectiles must have a</w:t>
+      </w:r>
+      <w:r>
+        <w:t xml:space="preserve"> child of the abstract Base</w:t>
+      </w:r>
+      <w:r>
+        <w:t>Projectile component present on their prefab for a ProjectileWeapon to fire them, due to a part of the object pooling process and as a sensible design choice.</w:t>
+      </w:r>
+    </w:p>
+    <w:p>
+      <w:r>
+        <w:t>Similarly to Hitscan weapons, projectile weapons follow the core weapon logic until the point at which the weapon fires. From this point, the following occurs:</w:t>
+      </w:r>
+    </w:p>
+    <w:p>
+      <w:pPr>
+        <w:pStyle w:val="ListParagraph"/>
+        <w:numPr>
+          <w:ilvl w:val="0"/>
+          <w:numId w:val="4"/>
+        </w:numPr>
+      </w:pPr>
+      <w:r>
+        <w:t>The projectile weapon attempts to pull a projectile from the object pool for each fire iteration.</w:t>
+      </w:r>
+    </w:p>
+    <w:p>
+      <w:pPr>
+        <w:pStyle w:val="ListParagraph"/>
+        <w:numPr>
+          <w:ilvl w:val="0"/>
+          <w:numId w:val="4"/>
+        </w:numPr>
+      </w:pPr>
+      <w:r>
+        <w:t>The object pool will either create a new projectile or reactivate an existing one, and then call its Initialise methods – one for initialising from pool, and one for initialising from the weapon (to pass a reference for the projectile weapon to the projectile for later use)</w:t>
+      </w:r>
+    </w:p>
+    <w:p>
+      <w:pPr>
+        <w:pStyle w:val="ListParagraph"/>
+        <w:numPr>
+          <w:ilvl w:val="0"/>
+          <w:numId w:val="4"/>
+        </w:numPr>
+      </w:pPr>
+      <w:r>
+        <w:t>The projectile’s velocity is then set to its forward direction multiplied by the speed it flies at, and the rigidbody’s Use Gravity field is set if the projectile should use normal gravity.</w:t>
+      </w:r>
+    </w:p>
+    <w:p>
+      <w:pPr>
+        <w:pStyle w:val="ListParagraph"/>
+        <w:numPr>
+          <w:ilvl w:val="0"/>
+          <w:numId w:val="4"/>
+        </w:numPr>
+      </w:pPr>
+      <w:r>
+        <w:t>While moving, if the projectile does NOT use normal gravity, a force equal to the scene gravity vector multiplied by the gravity multiplier is then applied to the object.</w:t>
+      </w:r>
+    </w:p>
+    <w:p>
+      <w:pPr>
+        <w:pStyle w:val="ListParagraph"/>
+        <w:numPr>
+          <w:ilvl w:val="0"/>
+          <w:numId w:val="4"/>
+        </w:numPr>
+      </w:pPr>
+      <w:r>
+        <w:t xml:space="preserve">If an object hits something, it will check if it has bounces remaining. If it does, it will decrement the bounce counter and continue moving. If it does not, it will trigger the projectile’s hit event at that point. What occurs after this is dependent </w:t>
+      </w:r>
+      <w:r>
+        <w:lastRenderedPageBreak/>
+        <w:t xml:space="preserve">on the </w:t>
+      </w:r>
+      <w:r>
+        <w:t>implementation of the inheriting class.</w:t>
+      </w:r>
+      <w:r>
+        <w:t xml:space="preserve"> </w:t>
+      </w:r>
+      <w:r>
+        <w:t>This may be anything from an explosion to an object being placed at this point, and the projectile being returned to the pool.</w:t>
+      </w:r>
+    </w:p>
+    <w:p>
+      <w:r>
+        <w:t xml:space="preserve"> </w:t>
+      </w:r>
+    </w:p>
+    <w:p>
+      <w:pPr>
         <w:pStyle w:val="Heading1"/>
       </w:pPr>
-      <w:bookmarkStart w:id="8" w:name="_Toc195799416"/>
+      <w:bookmarkStart w:id="10" w:name="_Toc197532749"/>
       <w:r>
         <w:t>Melee Weapon Implementation</w:t>
       </w:r>
-      <w:bookmarkEnd w:id="8"/>
+      <w:bookmarkEnd w:id="10"/>
+    </w:p>
+    <w:p>
+      <w:r>
+        <w:t xml:space="preserve">Currently, melee weapons are not implemented at the time of submitting the prototype project. They are planned to be implemented for the final submission. </w:t>
+      </w:r>
+    </w:p>
+    <w:p>
+      <w:r>
+        <w:t>Currently, there is an “intended function” for melee weapons.</w:t>
+      </w:r>
+    </w:p>
+    <w:p>
+      <w:r>
+        <w:t>While Hitscan weapons use a Ray, and projectile weapons use a collider on a physics body with continuous collision detection, melee weapons cannot benefit quite so simply from these setups. Instead, a Melee weapon will use a series of “hitboxes” –</w:t>
+      </w:r>
+      <w:r>
+        <w:t xml:space="preserve"> box colliders that will be checked in every frame during a melee weapon’s attack, referred to in code as a Trace.</w:t>
+      </w:r>
+    </w:p>
+    <w:p>
+      <w:r>
+        <w:t xml:space="preserve">Melee weapons will be reliant on animations for their function and therefore can be more prone to missed hits than a ranged weapon could be. </w:t>
+      </w:r>
+      <w:r>
+        <w:t>To compensate for this, Traces will be performed by melee weapons. While tracing, melee weapons will cache their previous position &amp; rotation and then perform a box cast between the cached positions and the current positions of the hitboxes.</w:t>
+      </w:r>
+      <w:r>
+        <w:t xml:space="preserve"> Anything hit in these traces will be damaged and then cached to prevent them being hit again until either the trace ends, or the </w:t>
+      </w:r>
+      <w:r>
+        <w:t>trace cache is cleared – both of which can be done via animation events.</w:t>
+      </w:r>
+    </w:p>
+    <w:p>
+      <w:r>
+        <w:t xml:space="preserve">While the majority of other animation-driven gameplay is done via Unity’s State Machine Behaviours on Animation States, animation-driven gameplay will be handled via Animation Events stored within the animation clips. While this means it can be harder to debug attack traces not starting/ending correctly, this approach allows each melee weapon to have unique behaviours for each attack animation and reduces reliance on hard-coded events. </w:t>
+      </w:r>
+      <w:r>
+        <w:t>It also allows each weapon to have different behaviour altogether based on their own scripts – a shield and baton would allow the player to block, while a sword might grant a dashing attack.</w:t>
+      </w:r>
     </w:p>
     <w:p>
       <w:pPr>
         <w:pStyle w:val="Heading1"/>
       </w:pPr>
-      <w:bookmarkStart w:id="9" w:name="_Toc195799417"/>
+      <w:bookmarkStart w:id="11" w:name="_Toc197532750"/>
       <w:r>
         <w:t>Damageable Entities</w:t>
       </w:r>
-      <w:bookmarkEnd w:id="9"/>
+      <w:bookmarkEnd w:id="11"/>
+    </w:p>
+    <w:p>
+      <w:r>
+        <w:t xml:space="preserve">Everything that needs to take damage will either have a Damageable component or one that derives from Damageable. This script is simple; the script handles receiving health events/changes to health, regeneration after a short period of time (if enabled) and has an Immune flag, which prevents negative health events (taking damage) from occurring. This script also supplies a Delegate with a HitEvent parameter, allowing for other scripts </w:t>
+      </w:r>
+      <w:r>
+        <w:lastRenderedPageBreak/>
+        <w:t xml:space="preserve">to listen for health events, and a method “Damageable Died” which should be called when health reaches zero.  </w:t>
+      </w:r>
     </w:p>
     <w:p>
       <w:pPr>
         <w:pStyle w:val="Heading1"/>
       </w:pPr>
-      <w:bookmarkStart w:id="10" w:name="_Toc195799418"/>
+      <w:bookmarkStart w:id="12" w:name="_Toc197532751"/>
       <w:r>
         <w:t>Animation</w:t>
       </w:r>
-      <w:bookmarkEnd w:id="10"/>
+      <w:bookmarkEnd w:id="12"/>
     </w:p>
     <w:p>
       <w:pPr>
         <w:pStyle w:val="Heading2"/>
       </w:pPr>
-      <w:bookmarkStart w:id="11" w:name="_Toc195799419"/>
+      <w:bookmarkStart w:id="13" w:name="_Toc197532752"/>
       <w:r>
         <w:t>Research</w:t>
       </w:r>
-      <w:bookmarkEnd w:id="11"/>
+      <w:bookmarkEnd w:id="13"/>
     </w:p>
     <w:p>
       <w:r>
         <w:t xml:space="preserve">The first-person shooters I play (The Finals &amp; Call of Duty, primarily) are my biggest influences when it comes to animation. I have extensively watched multiple showreels by </w:t>
       </w:r>
-      <w:hyperlink r:id="rId7" w:history="1">
+      <w:hyperlink r:id="rId8" w:history="1">
         <w:r>
           <w:rPr>
             <w:rStyle w:val="Hyperlink"/>
@@ -2661,9 +3314,12 @@
         </w:r>
       </w:hyperlink>
       <w:r>
+        <w:t xml:space="preserve"> (worked on COD Modern Warfare 2019)</w:t>
+      </w:r>
+      <w:r>
         <w:t xml:space="preserve">, </w:t>
       </w:r>
-      <w:hyperlink r:id="rId8" w:history="1">
+      <w:hyperlink r:id="rId9" w:history="1">
         <w:r>
           <w:rPr>
             <w:rStyle w:val="Hyperlink"/>
@@ -2672,9 +3328,15 @@
         </w:r>
       </w:hyperlink>
       <w:r>
-        <w:t xml:space="preserve"> and </w:t>
-      </w:r>
-      <w:hyperlink r:id="rId9" w:history="1">
+        <w:t xml:space="preserve"> </w:t>
+      </w:r>
+      <w:r>
+        <w:t xml:space="preserve">(Spectre Divide) </w:t>
+      </w:r>
+      <w:r>
+        <w:t xml:space="preserve">and </w:t>
+      </w:r>
+      <w:hyperlink r:id="rId10" w:history="1">
         <w:r>
           <w:rPr>
             <w:rStyle w:val="Hyperlink"/>
@@ -2683,6 +3345,9 @@
         </w:r>
       </w:hyperlink>
       <w:r>
+        <w:t xml:space="preserve"> (Unknown projects)</w:t>
+      </w:r>
+      <w:r>
         <w:t xml:space="preserve">, among many others on YouTube, as well as studied the motions of many weapons in my favourite games whilst I play. I have noticed that “micro-movements” and little flourishes, as well as subtle shake and wobble on the camera, can help bring animations to life. </w:t>
       </w:r>
     </w:p>
@@ -2714,7 +3379,7 @@
       <w:r>
         <w:t xml:space="preserve">In recent years, the quality and detail of animations has skyrocketed in video games. While I doubt this skill has been magically locked away, since Pixar’s animators were doing some incredible things in the early 2000s, we’ve only really tapped this newer style of animation in the past seven or eight years. Compare these two videos from Activision’s </w:t>
       </w:r>
-      <w:hyperlink r:id="rId10" w:history="1">
+      <w:hyperlink r:id="rId11" w:history="1">
         <w:r>
           <w:rPr>
             <w:rStyle w:val="Hyperlink"/>
@@ -2725,7 +3390,7 @@
       <w:r>
         <w:t xml:space="preserve"> and </w:t>
       </w:r>
-      <w:hyperlink r:id="rId11" w:history="1">
+      <w:hyperlink r:id="rId12" w:history="1">
         <w:r>
           <w:rPr>
             <w:rStyle w:val="Hyperlink"/>
@@ -2739,11 +3404,7 @@
     </w:p>
     <w:p>
       <w:r>
-        <w:t xml:space="preserve">The animations in Black Ops II are, for the most part, quite similar between the same “class” of weapons. Apart from the KAP-40 machine pistol and Executioner revolver, the first few weapons in the Black Ops II showcase have very similar animations. When </w:t>
-      </w:r>
-      <w:r>
-        <w:lastRenderedPageBreak/>
-        <w:t>equipping the “Fast Hands” perk, which speeds up reloads, the same animations play, just slightly faster.</w:t>
+        <w:t>The animations in Black Ops II are, for the most part, quite similar between the same “class” of weapons. Apart from the KAP-40 machine pistol and Executioner revolver, the first few weapons in the Black Ops II showcase have very similar animations. When equipping the “Fast Hands” perk, which speeds up reloads, the same animations play, just slightly faster.</w:t>
       </w:r>
     </w:p>
     <w:p>
@@ -2773,7 +3434,11 @@
         <w:t xml:space="preserve"> have</w:t>
       </w:r>
       <w:r>
-        <w:t xml:space="preserve"> more detailed and intricate animation, is simply a byproduct of increased processing power? Perhaps the animators </w:t>
+        <w:t xml:space="preserve"> more detailed and intricate </w:t>
+      </w:r>
+      <w:r>
+        <w:lastRenderedPageBreak/>
+        <w:t xml:space="preserve">animation, is simply a byproduct of increased processing power? Perhaps the animators </w:t>
       </w:r>
       <w:r>
         <w:t xml:space="preserve">also </w:t>
@@ -2801,17 +3466,17 @@
       <w:pPr>
         <w:pStyle w:val="Heading2"/>
       </w:pPr>
-      <w:bookmarkStart w:id="12" w:name="_Toc195799420"/>
+      <w:bookmarkStart w:id="14" w:name="_Toc197532753"/>
       <w:r>
         <w:t>Design</w:t>
       </w:r>
-      <w:bookmarkEnd w:id="12"/>
+      <w:bookmarkEnd w:id="14"/>
     </w:p>
     <w:p>
       <w:r>
         <w:t xml:space="preserve">The most important part of animating a character is the rig. Having watched videos on the animation for The Finals, </w:t>
       </w:r>
-      <w:hyperlink r:id="rId12" w:history="1">
+      <w:hyperlink r:id="rId13" w:history="1">
         <w:r>
           <w:rPr>
             <w:rStyle w:val="Hyperlink"/>
@@ -2832,11 +3497,11 @@
       <w:pPr>
         <w:pStyle w:val="Heading3"/>
       </w:pPr>
-      <w:bookmarkStart w:id="13" w:name="_Toc195799421"/>
+      <w:bookmarkStart w:id="15" w:name="_Toc197532754"/>
       <w:r>
         <w:t>Lower Body</w:t>
       </w:r>
-      <w:bookmarkEnd w:id="13"/>
+      <w:bookmarkEnd w:id="15"/>
     </w:p>
     <w:p>
       <w:r>
@@ -2847,11 +3512,11 @@
       <w:pPr>
         <w:pStyle w:val="Heading3"/>
       </w:pPr>
-      <w:bookmarkStart w:id="14" w:name="_Toc195799422"/>
+      <w:bookmarkStart w:id="16" w:name="_Toc197532755"/>
       <w:r>
         <w:t>Upper Body</w:t>
       </w:r>
-      <w:bookmarkEnd w:id="14"/>
+      <w:bookmarkEnd w:id="16"/>
     </w:p>
     <w:p>
       <w:r>
@@ -2862,11 +3527,11 @@
       <w:pPr>
         <w:pStyle w:val="Heading3"/>
       </w:pPr>
-      <w:bookmarkStart w:id="15" w:name="_Toc195799423"/>
+      <w:bookmarkStart w:id="17" w:name="_Toc197532756"/>
       <w:r>
         <w:t>Weapon Target</w:t>
       </w:r>
-      <w:bookmarkEnd w:id="15"/>
+      <w:bookmarkEnd w:id="17"/>
     </w:p>
     <w:p>
       <w:r>
@@ -2882,11 +3547,12 @@
       <w:pPr>
         <w:pStyle w:val="Heading3"/>
       </w:pPr>
-      <w:bookmarkStart w:id="16" w:name="_Toc195799424"/>
-      <w:r>
+      <w:bookmarkStart w:id="18" w:name="_Toc197532757"/>
+      <w:r>
+        <w:lastRenderedPageBreak/>
         <w:t>Weapon Rigs</w:t>
       </w:r>
-      <w:bookmarkEnd w:id="16"/>
+      <w:bookmarkEnd w:id="18"/>
     </w:p>
     <w:p>
       <w:r>
@@ -2907,14 +3573,14 @@
       <w:pPr>
         <w:pStyle w:val="Heading2"/>
       </w:pPr>
-      <w:bookmarkStart w:id="17" w:name="_Toc195799425"/>
+      <w:bookmarkStart w:id="19" w:name="_Toc197532758"/>
       <w:r>
         <w:t>Import</w:t>
       </w:r>
       <w:r>
         <w:t xml:space="preserve"> Pipeline</w:t>
       </w:r>
-      <w:bookmarkEnd w:id="17"/>
+      <w:bookmarkEnd w:id="19"/>
     </w:p>
     <w:p>
       <w:r>
@@ -2925,37 +3591,48 @@
       <w:pPr>
         <w:pStyle w:val="Heading3"/>
       </w:pPr>
-      <w:bookmarkStart w:id="18" w:name="_Toc195799426"/>
+      <w:bookmarkStart w:id="20" w:name="_Toc197532759"/>
       <w:r>
         <w:t>Character Animations</w:t>
       </w:r>
-      <w:bookmarkEnd w:id="18"/>
+      <w:bookmarkEnd w:id="20"/>
     </w:p>
     <w:p>
       <w:r>
         <w:t>The character animations are stripped of “excess” bones using an avatar mask. The lower body bones and IK targets are removed from the animation clips with this mask. Each animation is then split inside Unity using frame numbers from Blender. The clips then require “cleaning” – removing keyframes for scale on all bones and removing unnecessary keyframes for bones that only move/only rotate.</w:t>
       </w:r>
+      <w:r>
+        <w:t xml:space="preserve"> These files are placed in a folder alongside the weapon they are for.</w:t>
+      </w:r>
     </w:p>
     <w:p>
       <w:pPr>
         <w:pStyle w:val="Heading3"/>
       </w:pPr>
-      <w:bookmarkStart w:id="19" w:name="_Toc195799427"/>
+      <w:bookmarkStart w:id="21" w:name="_Toc197532760"/>
       <w:r>
         <w:t>Weapon Animations</w:t>
       </w:r>
-      <w:bookmarkEnd w:id="19"/>
+      <w:bookmarkEnd w:id="21"/>
+    </w:p>
+    <w:p>
+      <w:r>
+        <w:t xml:space="preserve">When importing the weapon animations, they often have unnecessary keyframes for their position and rotation from the export from blender. </w:t>
+      </w:r>
+      <w:r>
+        <w:t>Those keys, along with all scale keyframes and any unnecessary position/rotation keys, are removed to reduce file size and improve performance at runtime by only animating some properties. These animations are then placed in a folder alongside the weapon and its parameter objects.</w:t>
+      </w:r>
     </w:p>
     <w:p/>
     <w:p>
       <w:pPr>
         <w:pStyle w:val="Heading2"/>
       </w:pPr>
-      <w:bookmarkStart w:id="20" w:name="_Toc195799428"/>
+      <w:bookmarkStart w:id="22" w:name="_Toc197532761"/>
       <w:r>
         <w:t>Implementation</w:t>
       </w:r>
-      <w:bookmarkEnd w:id="20"/>
+      <w:bookmarkEnd w:id="22"/>
     </w:p>
     <w:p>
       <w:r>
@@ -2966,22 +3643,27 @@
       <w:pPr>
         <w:pStyle w:val="Heading3"/>
       </w:pPr>
+      <w:bookmarkStart w:id="23" w:name="_Toc197532762"/>
       <w:r>
         <w:t>Characters</w:t>
       </w:r>
-    </w:p>
-    <w:p>
-      <w:r>
-        <w:t xml:space="preserve">Characters employ an avatar mask limited to the upper body and its IK targets. Using an avatar mask prevents the engine from evaluating bones that are not in that in the mask </w:t>
-      </w:r>
+      <w:bookmarkEnd w:id="23"/>
+    </w:p>
+    <w:p>
+      <w:r>
+        <w:t>Characters employ an avatar mask limited to the upper body and its IK targets. Using an avatar mask prevents the engine from evaluating bones that are not in that in the mask and therefore improves performance slightly. Characters use a custom full body IK setup that is almost identical to the rig used in Blender to ensure a near-perfect recreation of the animations in the source files.</w:t>
+      </w:r>
+    </w:p>
+    <w:p>
       <w:r>
         <w:lastRenderedPageBreak/>
-        <w:t>and therefore improves performance slightly. Characters use a custom full body IK setup that is almost identical to the rig used in Blender to ensure a near-perfect recreation of the animations in the source files.</w:t>
-      </w:r>
-    </w:p>
-    <w:p>
-      <w:r>
-        <w:t xml:space="preserve">Currently, the character itself does not manage animation events, and instead calls methods on the weapon currently being used, despite both the character and weapons having </w:t>
+        <w:t>Currently, the character itself does not</w:t>
+      </w:r>
+      <w:r>
+        <w:t xml:space="preserve"> handle playing the animations itself and</w:t>
+      </w:r>
+      <w:r>
+        <w:t xml:space="preserve"> instead calls methods on the weapon currently being used, despite both the character and weapons having </w:t>
       </w:r>
       <w:r>
         <w:t>the same Weapon Animator component.</w:t>
@@ -2994,51 +3676,83 @@
       <w:pPr>
         <w:pStyle w:val="Heading3"/>
       </w:pPr>
+      <w:bookmarkStart w:id="24" w:name="_Toc197532763"/>
       <w:r>
         <w:t>Weapons</w:t>
       </w:r>
+      <w:bookmarkEnd w:id="24"/>
+    </w:p>
+    <w:p>
+      <w:r>
+        <w:t xml:space="preserve">Weapons also have a Weapon Animator script, but with some different functionality </w:t>
+      </w:r>
+      <w:r>
+        <w:t>using the isWeapon flag.</w:t>
+      </w:r>
+      <w:r>
+        <w:t xml:space="preserve"> While characters </w:t>
+      </w:r>
+      <w:r>
+        <w:t>change their animations every time the character changes weapons, weapons must override their animator controller only once when initialised. They also have a set of methods that change animator parameters</w:t>
+      </w:r>
+      <w:r>
+        <w:t xml:space="preserve"> on both the weapon and the character</w:t>
+      </w:r>
+      <w:r>
+        <w:t>.</w:t>
+      </w:r>
     </w:p>
     <w:p/>
-    <w:p/>
     <w:p>
       <w:pPr>
         <w:pStyle w:val="Heading1"/>
       </w:pPr>
-      <w:bookmarkStart w:id="21" w:name="_Toc195799429"/>
+      <w:bookmarkStart w:id="25" w:name="_Toc197532764"/>
       <w:r>
         <w:t>Character Controller Interoperability</w:t>
       </w:r>
-      <w:bookmarkEnd w:id="21"/>
+      <w:bookmarkEnd w:id="25"/>
+    </w:p>
+    <w:p>
+      <w:r>
+        <w:t>The project began with a character controller that I had already written.</w:t>
+      </w:r>
     </w:p>
     <w:p>
       <w:pPr>
         <w:pStyle w:val="Heading1"/>
       </w:pPr>
-      <w:bookmarkStart w:id="22" w:name="_Toc195799430"/>
+      <w:bookmarkStart w:id="26" w:name="_Toc197532765"/>
       <w:r>
         <w:t>Rendering Wizardry</w:t>
       </w:r>
-      <w:bookmarkEnd w:id="22"/>
+      <w:bookmarkEnd w:id="26"/>
     </w:p>
     <w:p>
       <w:pPr>
         <w:pStyle w:val="Heading2"/>
       </w:pPr>
-      <w:bookmarkStart w:id="23" w:name="_Toc195799431"/>
-      <w:r>
-        <w:t>Camera Trickery</w:t>
-      </w:r>
-      <w:bookmarkEnd w:id="23"/>
+      <w:bookmarkStart w:id="27" w:name="_Toc197532766"/>
+      <w:r>
+        <w:t>Camera</w:t>
+      </w:r>
+      <w:r>
+        <w:t>s</w:t>
+      </w:r>
+      <w:bookmarkEnd w:id="27"/>
     </w:p>
     <w:p>
       <w:pPr>
         <w:pStyle w:val="Heading2"/>
       </w:pPr>
-      <w:bookmarkStart w:id="24" w:name="_Toc195799432"/>
-      <w:r>
-        <w:t>Shader Magic</w:t>
-      </w:r>
-      <w:bookmarkEnd w:id="24"/>
+      <w:bookmarkStart w:id="28" w:name="_Toc197532767"/>
+      <w:r>
+        <w:t>Shader</w:t>
+      </w:r>
+      <w:r>
+        <w:t>s</w:t>
+      </w:r>
+      <w:bookmarkEnd w:id="28"/>
     </w:p>
     <w:sectPr>
       <w:pgSz w:w="11906" w:h="16838"/>
@@ -3050,6 +3764,537 @@
     </w:sectPr>
   </w:body>
 </w:document>
+</file>
+
+<file path=word/numbering.xml><?xml version="1.0" encoding="utf-8"?>
+<w:numbering xmlns:wpc="http://schemas.microsoft.com/office/word/2010/wordprocessingCanvas" xmlns:cx="http://schemas.microsoft.com/office/drawing/2014/chartex" xmlns:cx1="http://schemas.microsoft.com/office/drawing/2015/9/8/chartex" xmlns:cx2="http://schemas.microsoft.com/office/drawing/2015/10/21/chartex" xmlns:cx3="http://schemas.microsoft.com/office/drawing/2016/5/9/chartex" xmlns:cx4="http://schemas.microsoft.com/office/drawing/2016/5/10/chartex" xmlns:cx5="http://schemas.microsoft.com/office/drawing/2016/5/11/chartex" xmlns:cx6="http://schemas.microsoft.com/office/drawing/2016/5/12/chartex" xmlns:cx7="http://schemas.microsoft.com/office/drawing/2016/5/13/chartex" xmlns:cx8="http://schemas.microsoft.com/office/drawing/2016/5/14/chartex" xmlns:mc="http://schemas.openxmlformats.org/markup-compatibility/2006" xmlns:aink="http://schemas.microsoft.com/office/drawing/2016/ink" xmlns:am3d="http://schemas.microsoft.com/office/drawing/2017/model3d" xmlns:o="urn:schemas-microsoft-com:office:office" xmlns:oel="http://schemas.microsoft.com/office/2019/extlst" xmlns:r="http://schemas.openxmlformats.org/officeDocument/2006/relationships" xmlns:m="http://schemas.openxmlformats.org/officeDocument/2006/math" xmlns:v="urn:schemas-microsoft-com:vml" xmlns:wp14="http://schemas.microsoft.com/office/word/2010/wordprocessingDrawing" xmlns:wp="http://schemas.openxmlformats.org/drawingml/2006/wordprocessingDrawing" xmlns:w10="urn:schemas-microsoft-com:office:word" xmlns:w="http://schemas.openxmlformats.org/wordprocessingml/2006/main" xmlns:w14="http://schemas.microsoft.com/office/word/2010/wordml" xmlns:w15="http://schemas.microsoft.com/office/word/2012/wordml" xmlns:w16cex="http://schemas.microsoft.com/office/word/2018/wordml/cex" xmlns:w16cid="http://schemas.microsoft.com/office/word/2016/wordml/cid" xmlns:w16="http://schemas.microsoft.com/office/word/2018/wordml" xmlns:w16du="http://schemas.microsoft.com/office/word/2023/wordml/word16du" xmlns:w16sdtdh="http://schemas.microsoft.com/office/word/2020/wordml/sdtdatahash" xmlns:w16sdtfl="http://schemas.microsoft.com/office/word/2024/wordml/sdtformatlock" xmlns:w16se="http://schemas.microsoft.com/office/word/2015/wordml/symex" xmlns:wpg="http://schemas.microsoft.com/office/word/2010/wordprocessingGroup" xmlns:wpi="http://schemas.microsoft.com/office/word/2010/wordprocessingInk" xmlns:wne="http://schemas.microsoft.com/office/word/2006/wordml" xmlns:wps="http://schemas.microsoft.com/office/word/2010/wordprocessingShape" mc:Ignorable="w14 w15 w16se w16cid w16 w16cex w16sdtdh w16sdtfl w16du wp14">
+  <w:abstractNum w:abstractNumId="0" w15:restartNumberingAfterBreak="0">
+    <w:nsid w:val="037014A4"/>
+    <w:multiLevelType w:val="hybridMultilevel"/>
+    <w:tmpl w:val="2820B2AA"/>
+    <w:lvl w:ilvl="0" w:tplc="0809000F">
+      <w:start w:val="1"/>
+      <w:numFmt w:val="decimal"/>
+      <w:lvlText w:val="%1."/>
+      <w:lvlJc w:val="left"/>
+      <w:pPr>
+        <w:ind w:left="720" w:hanging="360"/>
+      </w:pPr>
+    </w:lvl>
+    <w:lvl w:ilvl="1" w:tplc="08090019" w:tentative="1">
+      <w:start w:val="1"/>
+      <w:numFmt w:val="lowerLetter"/>
+      <w:lvlText w:val="%2."/>
+      <w:lvlJc w:val="left"/>
+      <w:pPr>
+        <w:ind w:left="1440" w:hanging="360"/>
+      </w:pPr>
+    </w:lvl>
+    <w:lvl w:ilvl="2" w:tplc="0809001B" w:tentative="1">
+      <w:start w:val="1"/>
+      <w:numFmt w:val="lowerRoman"/>
+      <w:lvlText w:val="%3."/>
+      <w:lvlJc w:val="right"/>
+      <w:pPr>
+        <w:ind w:left="2160" w:hanging="180"/>
+      </w:pPr>
+    </w:lvl>
+    <w:lvl w:ilvl="3" w:tplc="0809000F" w:tentative="1">
+      <w:start w:val="1"/>
+      <w:numFmt w:val="decimal"/>
+      <w:lvlText w:val="%4."/>
+      <w:lvlJc w:val="left"/>
+      <w:pPr>
+        <w:ind w:left="2880" w:hanging="360"/>
+      </w:pPr>
+    </w:lvl>
+    <w:lvl w:ilvl="4" w:tplc="08090019" w:tentative="1">
+      <w:start w:val="1"/>
+      <w:numFmt w:val="lowerLetter"/>
+      <w:lvlText w:val="%5."/>
+      <w:lvlJc w:val="left"/>
+      <w:pPr>
+        <w:ind w:left="3600" w:hanging="360"/>
+      </w:pPr>
+    </w:lvl>
+    <w:lvl w:ilvl="5" w:tplc="0809001B" w:tentative="1">
+      <w:start w:val="1"/>
+      <w:numFmt w:val="lowerRoman"/>
+      <w:lvlText w:val="%6."/>
+      <w:lvlJc w:val="right"/>
+      <w:pPr>
+        <w:ind w:left="4320" w:hanging="180"/>
+      </w:pPr>
+    </w:lvl>
+    <w:lvl w:ilvl="6" w:tplc="0809000F" w:tentative="1">
+      <w:start w:val="1"/>
+      <w:numFmt w:val="decimal"/>
+      <w:lvlText w:val="%7."/>
+      <w:lvlJc w:val="left"/>
+      <w:pPr>
+        <w:ind w:left="5040" w:hanging="360"/>
+      </w:pPr>
+    </w:lvl>
+    <w:lvl w:ilvl="7" w:tplc="08090019" w:tentative="1">
+      <w:start w:val="1"/>
+      <w:numFmt w:val="lowerLetter"/>
+      <w:lvlText w:val="%8."/>
+      <w:lvlJc w:val="left"/>
+      <w:pPr>
+        <w:ind w:left="5760" w:hanging="360"/>
+      </w:pPr>
+    </w:lvl>
+    <w:lvl w:ilvl="8" w:tplc="0809001B" w:tentative="1">
+      <w:start w:val="1"/>
+      <w:numFmt w:val="lowerRoman"/>
+      <w:lvlText w:val="%9."/>
+      <w:lvlJc w:val="right"/>
+      <w:pPr>
+        <w:ind w:left="6480" w:hanging="180"/>
+      </w:pPr>
+    </w:lvl>
+  </w:abstractNum>
+  <w:abstractNum w:abstractNumId="1" w15:restartNumberingAfterBreak="0">
+    <w:nsid w:val="2E7A30C2"/>
+    <w:multiLevelType w:val="hybridMultilevel"/>
+    <w:tmpl w:val="721E85D0"/>
+    <w:lvl w:ilvl="0" w:tplc="0809000F">
+      <w:start w:val="1"/>
+      <w:numFmt w:val="decimal"/>
+      <w:lvlText w:val="%1."/>
+      <w:lvlJc w:val="left"/>
+      <w:pPr>
+        <w:ind w:left="720" w:hanging="360"/>
+      </w:pPr>
+    </w:lvl>
+    <w:lvl w:ilvl="1" w:tplc="08090019">
+      <w:start w:val="1"/>
+      <w:numFmt w:val="lowerLetter"/>
+      <w:lvlText w:val="%2."/>
+      <w:lvlJc w:val="left"/>
+      <w:pPr>
+        <w:ind w:left="1440" w:hanging="360"/>
+      </w:pPr>
+    </w:lvl>
+    <w:lvl w:ilvl="2" w:tplc="0809001B">
+      <w:start w:val="1"/>
+      <w:numFmt w:val="lowerRoman"/>
+      <w:lvlText w:val="%3."/>
+      <w:lvlJc w:val="right"/>
+      <w:pPr>
+        <w:ind w:left="2160" w:hanging="180"/>
+      </w:pPr>
+    </w:lvl>
+    <w:lvl w:ilvl="3" w:tplc="0809000F" w:tentative="1">
+      <w:start w:val="1"/>
+      <w:numFmt w:val="decimal"/>
+      <w:lvlText w:val="%4."/>
+      <w:lvlJc w:val="left"/>
+      <w:pPr>
+        <w:ind w:left="2880" w:hanging="360"/>
+      </w:pPr>
+    </w:lvl>
+    <w:lvl w:ilvl="4" w:tplc="08090019" w:tentative="1">
+      <w:start w:val="1"/>
+      <w:numFmt w:val="lowerLetter"/>
+      <w:lvlText w:val="%5."/>
+      <w:lvlJc w:val="left"/>
+      <w:pPr>
+        <w:ind w:left="3600" w:hanging="360"/>
+      </w:pPr>
+    </w:lvl>
+    <w:lvl w:ilvl="5" w:tplc="0809001B" w:tentative="1">
+      <w:start w:val="1"/>
+      <w:numFmt w:val="lowerRoman"/>
+      <w:lvlText w:val="%6."/>
+      <w:lvlJc w:val="right"/>
+      <w:pPr>
+        <w:ind w:left="4320" w:hanging="180"/>
+      </w:pPr>
+    </w:lvl>
+    <w:lvl w:ilvl="6" w:tplc="0809000F" w:tentative="1">
+      <w:start w:val="1"/>
+      <w:numFmt w:val="decimal"/>
+      <w:lvlText w:val="%7."/>
+      <w:lvlJc w:val="left"/>
+      <w:pPr>
+        <w:ind w:left="5040" w:hanging="360"/>
+      </w:pPr>
+    </w:lvl>
+    <w:lvl w:ilvl="7" w:tplc="08090019" w:tentative="1">
+      <w:start w:val="1"/>
+      <w:numFmt w:val="lowerLetter"/>
+      <w:lvlText w:val="%8."/>
+      <w:lvlJc w:val="left"/>
+      <w:pPr>
+        <w:ind w:left="5760" w:hanging="360"/>
+      </w:pPr>
+    </w:lvl>
+    <w:lvl w:ilvl="8" w:tplc="0809001B" w:tentative="1">
+      <w:start w:val="1"/>
+      <w:numFmt w:val="lowerRoman"/>
+      <w:lvlText w:val="%9."/>
+      <w:lvlJc w:val="right"/>
+      <w:pPr>
+        <w:ind w:left="6480" w:hanging="180"/>
+      </w:pPr>
+    </w:lvl>
+  </w:abstractNum>
+  <w:abstractNum w:abstractNumId="2" w15:restartNumberingAfterBreak="0">
+    <w:nsid w:val="42A86699"/>
+    <w:multiLevelType w:val="hybridMultilevel"/>
+    <w:tmpl w:val="22F0A9A8"/>
+    <w:lvl w:ilvl="0" w:tplc="08090001">
+      <w:start w:val="1"/>
+      <w:numFmt w:val="bullet"/>
+      <w:lvlText w:val=""/>
+      <w:lvlJc w:val="left"/>
+      <w:pPr>
+        <w:ind w:left="720" w:hanging="360"/>
+      </w:pPr>
+      <w:rPr>
+        <w:rFonts w:ascii="Symbol" w:hAnsi="Symbol" w:hint="default"/>
+      </w:rPr>
+    </w:lvl>
+    <w:lvl w:ilvl="1" w:tplc="08090003" w:tentative="1">
+      <w:start w:val="1"/>
+      <w:numFmt w:val="bullet"/>
+      <w:lvlText w:val="o"/>
+      <w:lvlJc w:val="left"/>
+      <w:pPr>
+        <w:ind w:left="1440" w:hanging="360"/>
+      </w:pPr>
+      <w:rPr>
+        <w:rFonts w:ascii="Courier New" w:hAnsi="Courier New" w:cs="Courier New" w:hint="default"/>
+      </w:rPr>
+    </w:lvl>
+    <w:lvl w:ilvl="2" w:tplc="08090005" w:tentative="1">
+      <w:start w:val="1"/>
+      <w:numFmt w:val="bullet"/>
+      <w:lvlText w:val=""/>
+      <w:lvlJc w:val="left"/>
+      <w:pPr>
+        <w:ind w:left="2160" w:hanging="360"/>
+      </w:pPr>
+      <w:rPr>
+        <w:rFonts w:ascii="Wingdings" w:hAnsi="Wingdings" w:hint="default"/>
+      </w:rPr>
+    </w:lvl>
+    <w:lvl w:ilvl="3" w:tplc="08090001" w:tentative="1">
+      <w:start w:val="1"/>
+      <w:numFmt w:val="bullet"/>
+      <w:lvlText w:val=""/>
+      <w:lvlJc w:val="left"/>
+      <w:pPr>
+        <w:ind w:left="2880" w:hanging="360"/>
+      </w:pPr>
+      <w:rPr>
+        <w:rFonts w:ascii="Symbol" w:hAnsi="Symbol" w:hint="default"/>
+      </w:rPr>
+    </w:lvl>
+    <w:lvl w:ilvl="4" w:tplc="08090003" w:tentative="1">
+      <w:start w:val="1"/>
+      <w:numFmt w:val="bullet"/>
+      <w:lvlText w:val="o"/>
+      <w:lvlJc w:val="left"/>
+      <w:pPr>
+        <w:ind w:left="3600" w:hanging="360"/>
+      </w:pPr>
+      <w:rPr>
+        <w:rFonts w:ascii="Courier New" w:hAnsi="Courier New" w:cs="Courier New" w:hint="default"/>
+      </w:rPr>
+    </w:lvl>
+    <w:lvl w:ilvl="5" w:tplc="08090005" w:tentative="1">
+      <w:start w:val="1"/>
+      <w:numFmt w:val="bullet"/>
+      <w:lvlText w:val=""/>
+      <w:lvlJc w:val="left"/>
+      <w:pPr>
+        <w:ind w:left="4320" w:hanging="360"/>
+      </w:pPr>
+      <w:rPr>
+        <w:rFonts w:ascii="Wingdings" w:hAnsi="Wingdings" w:hint="default"/>
+      </w:rPr>
+    </w:lvl>
+    <w:lvl w:ilvl="6" w:tplc="08090001" w:tentative="1">
+      <w:start w:val="1"/>
+      <w:numFmt w:val="bullet"/>
+      <w:lvlText w:val=""/>
+      <w:lvlJc w:val="left"/>
+      <w:pPr>
+        <w:ind w:left="5040" w:hanging="360"/>
+      </w:pPr>
+      <w:rPr>
+        <w:rFonts w:ascii="Symbol" w:hAnsi="Symbol" w:hint="default"/>
+      </w:rPr>
+    </w:lvl>
+    <w:lvl w:ilvl="7" w:tplc="08090003" w:tentative="1">
+      <w:start w:val="1"/>
+      <w:numFmt w:val="bullet"/>
+      <w:lvlText w:val="o"/>
+      <w:lvlJc w:val="left"/>
+      <w:pPr>
+        <w:ind w:left="5760" w:hanging="360"/>
+      </w:pPr>
+      <w:rPr>
+        <w:rFonts w:ascii="Courier New" w:hAnsi="Courier New" w:cs="Courier New" w:hint="default"/>
+      </w:rPr>
+    </w:lvl>
+    <w:lvl w:ilvl="8" w:tplc="08090005" w:tentative="1">
+      <w:start w:val="1"/>
+      <w:numFmt w:val="bullet"/>
+      <w:lvlText w:val=""/>
+      <w:lvlJc w:val="left"/>
+      <w:pPr>
+        <w:ind w:left="6480" w:hanging="360"/>
+      </w:pPr>
+      <w:rPr>
+        <w:rFonts w:ascii="Wingdings" w:hAnsi="Wingdings" w:hint="default"/>
+      </w:rPr>
+    </w:lvl>
+  </w:abstractNum>
+  <w:abstractNum w:abstractNumId="3" w15:restartNumberingAfterBreak="0">
+    <w:nsid w:val="5486711A"/>
+    <w:multiLevelType w:val="hybridMultilevel"/>
+    <w:tmpl w:val="9FB8D9C8"/>
+    <w:lvl w:ilvl="0" w:tplc="08090001">
+      <w:start w:val="1"/>
+      <w:numFmt w:val="bullet"/>
+      <w:lvlText w:val=""/>
+      <w:lvlJc w:val="left"/>
+      <w:pPr>
+        <w:ind w:left="720" w:hanging="360"/>
+      </w:pPr>
+      <w:rPr>
+        <w:rFonts w:ascii="Symbol" w:hAnsi="Symbol" w:hint="default"/>
+      </w:rPr>
+    </w:lvl>
+    <w:lvl w:ilvl="1" w:tplc="08090003" w:tentative="1">
+      <w:start w:val="1"/>
+      <w:numFmt w:val="bullet"/>
+      <w:lvlText w:val="o"/>
+      <w:lvlJc w:val="left"/>
+      <w:pPr>
+        <w:ind w:left="1440" w:hanging="360"/>
+      </w:pPr>
+      <w:rPr>
+        <w:rFonts w:ascii="Courier New" w:hAnsi="Courier New" w:cs="Courier New" w:hint="default"/>
+      </w:rPr>
+    </w:lvl>
+    <w:lvl w:ilvl="2" w:tplc="08090005" w:tentative="1">
+      <w:start w:val="1"/>
+      <w:numFmt w:val="bullet"/>
+      <w:lvlText w:val=""/>
+      <w:lvlJc w:val="left"/>
+      <w:pPr>
+        <w:ind w:left="2160" w:hanging="360"/>
+      </w:pPr>
+      <w:rPr>
+        <w:rFonts w:ascii="Wingdings" w:hAnsi="Wingdings" w:hint="default"/>
+      </w:rPr>
+    </w:lvl>
+    <w:lvl w:ilvl="3" w:tplc="08090001" w:tentative="1">
+      <w:start w:val="1"/>
+      <w:numFmt w:val="bullet"/>
+      <w:lvlText w:val=""/>
+      <w:lvlJc w:val="left"/>
+      <w:pPr>
+        <w:ind w:left="2880" w:hanging="360"/>
+      </w:pPr>
+      <w:rPr>
+        <w:rFonts w:ascii="Symbol" w:hAnsi="Symbol" w:hint="default"/>
+      </w:rPr>
+    </w:lvl>
+    <w:lvl w:ilvl="4" w:tplc="08090003" w:tentative="1">
+      <w:start w:val="1"/>
+      <w:numFmt w:val="bullet"/>
+      <w:lvlText w:val="o"/>
+      <w:lvlJc w:val="left"/>
+      <w:pPr>
+        <w:ind w:left="3600" w:hanging="360"/>
+      </w:pPr>
+      <w:rPr>
+        <w:rFonts w:ascii="Courier New" w:hAnsi="Courier New" w:cs="Courier New" w:hint="default"/>
+      </w:rPr>
+    </w:lvl>
+    <w:lvl w:ilvl="5" w:tplc="08090005" w:tentative="1">
+      <w:start w:val="1"/>
+      <w:numFmt w:val="bullet"/>
+      <w:lvlText w:val=""/>
+      <w:lvlJc w:val="left"/>
+      <w:pPr>
+        <w:ind w:left="4320" w:hanging="360"/>
+      </w:pPr>
+      <w:rPr>
+        <w:rFonts w:ascii="Wingdings" w:hAnsi="Wingdings" w:hint="default"/>
+      </w:rPr>
+    </w:lvl>
+    <w:lvl w:ilvl="6" w:tplc="08090001" w:tentative="1">
+      <w:start w:val="1"/>
+      <w:numFmt w:val="bullet"/>
+      <w:lvlText w:val=""/>
+      <w:lvlJc w:val="left"/>
+      <w:pPr>
+        <w:ind w:left="5040" w:hanging="360"/>
+      </w:pPr>
+      <w:rPr>
+        <w:rFonts w:ascii="Symbol" w:hAnsi="Symbol" w:hint="default"/>
+      </w:rPr>
+    </w:lvl>
+    <w:lvl w:ilvl="7" w:tplc="08090003" w:tentative="1">
+      <w:start w:val="1"/>
+      <w:numFmt w:val="bullet"/>
+      <w:lvlText w:val="o"/>
+      <w:lvlJc w:val="left"/>
+      <w:pPr>
+        <w:ind w:left="5760" w:hanging="360"/>
+      </w:pPr>
+      <w:rPr>
+        <w:rFonts w:ascii="Courier New" w:hAnsi="Courier New" w:cs="Courier New" w:hint="default"/>
+      </w:rPr>
+    </w:lvl>
+    <w:lvl w:ilvl="8" w:tplc="08090005" w:tentative="1">
+      <w:start w:val="1"/>
+      <w:numFmt w:val="bullet"/>
+      <w:lvlText w:val=""/>
+      <w:lvlJc w:val="left"/>
+      <w:pPr>
+        <w:ind w:left="6480" w:hanging="360"/>
+      </w:pPr>
+      <w:rPr>
+        <w:rFonts w:ascii="Wingdings" w:hAnsi="Wingdings" w:hint="default"/>
+      </w:rPr>
+    </w:lvl>
+  </w:abstractNum>
+  <w:abstractNum w:abstractNumId="4" w15:restartNumberingAfterBreak="0">
+    <w:nsid w:val="61472559"/>
+    <w:multiLevelType w:val="hybridMultilevel"/>
+    <w:tmpl w:val="E8B60F52"/>
+    <w:lvl w:ilvl="0" w:tplc="08090001">
+      <w:start w:val="1"/>
+      <w:numFmt w:val="bullet"/>
+      <w:lvlText w:val=""/>
+      <w:lvlJc w:val="left"/>
+      <w:pPr>
+        <w:ind w:left="720" w:hanging="360"/>
+      </w:pPr>
+      <w:rPr>
+        <w:rFonts w:ascii="Symbol" w:hAnsi="Symbol" w:hint="default"/>
+      </w:rPr>
+    </w:lvl>
+    <w:lvl w:ilvl="1" w:tplc="08090003" w:tentative="1">
+      <w:start w:val="1"/>
+      <w:numFmt w:val="bullet"/>
+      <w:lvlText w:val="o"/>
+      <w:lvlJc w:val="left"/>
+      <w:pPr>
+        <w:ind w:left="1440" w:hanging="360"/>
+      </w:pPr>
+      <w:rPr>
+        <w:rFonts w:ascii="Courier New" w:hAnsi="Courier New" w:cs="Courier New" w:hint="default"/>
+      </w:rPr>
+    </w:lvl>
+    <w:lvl w:ilvl="2" w:tplc="08090005" w:tentative="1">
+      <w:start w:val="1"/>
+      <w:numFmt w:val="bullet"/>
+      <w:lvlText w:val=""/>
+      <w:lvlJc w:val="left"/>
+      <w:pPr>
+        <w:ind w:left="2160" w:hanging="360"/>
+      </w:pPr>
+      <w:rPr>
+        <w:rFonts w:ascii="Wingdings" w:hAnsi="Wingdings" w:hint="default"/>
+      </w:rPr>
+    </w:lvl>
+    <w:lvl w:ilvl="3" w:tplc="08090001" w:tentative="1">
+      <w:start w:val="1"/>
+      <w:numFmt w:val="bullet"/>
+      <w:lvlText w:val=""/>
+      <w:lvlJc w:val="left"/>
+      <w:pPr>
+        <w:ind w:left="2880" w:hanging="360"/>
+      </w:pPr>
+      <w:rPr>
+        <w:rFonts w:ascii="Symbol" w:hAnsi="Symbol" w:hint="default"/>
+      </w:rPr>
+    </w:lvl>
+    <w:lvl w:ilvl="4" w:tplc="08090003" w:tentative="1">
+      <w:start w:val="1"/>
+      <w:numFmt w:val="bullet"/>
+      <w:lvlText w:val="o"/>
+      <w:lvlJc w:val="left"/>
+      <w:pPr>
+        <w:ind w:left="3600" w:hanging="360"/>
+      </w:pPr>
+      <w:rPr>
+        <w:rFonts w:ascii="Courier New" w:hAnsi="Courier New" w:cs="Courier New" w:hint="default"/>
+      </w:rPr>
+    </w:lvl>
+    <w:lvl w:ilvl="5" w:tplc="08090005" w:tentative="1">
+      <w:start w:val="1"/>
+      <w:numFmt w:val="bullet"/>
+      <w:lvlText w:val=""/>
+      <w:lvlJc w:val="left"/>
+      <w:pPr>
+        <w:ind w:left="4320" w:hanging="360"/>
+      </w:pPr>
+      <w:rPr>
+        <w:rFonts w:ascii="Wingdings" w:hAnsi="Wingdings" w:hint="default"/>
+      </w:rPr>
+    </w:lvl>
+    <w:lvl w:ilvl="6" w:tplc="08090001" w:tentative="1">
+      <w:start w:val="1"/>
+      <w:numFmt w:val="bullet"/>
+      <w:lvlText w:val=""/>
+      <w:lvlJc w:val="left"/>
+      <w:pPr>
+        <w:ind w:left="5040" w:hanging="360"/>
+      </w:pPr>
+      <w:rPr>
+        <w:rFonts w:ascii="Symbol" w:hAnsi="Symbol" w:hint="default"/>
+      </w:rPr>
+    </w:lvl>
+    <w:lvl w:ilvl="7" w:tplc="08090003" w:tentative="1">
+      <w:start w:val="1"/>
+      <w:numFmt w:val="bullet"/>
+      <w:lvlText w:val="o"/>
+      <w:lvlJc w:val="left"/>
+      <w:pPr>
+        <w:ind w:left="5760" w:hanging="360"/>
+      </w:pPr>
+      <w:rPr>
+        <w:rFonts w:ascii="Courier New" w:hAnsi="Courier New" w:cs="Courier New" w:hint="default"/>
+      </w:rPr>
+    </w:lvl>
+    <w:lvl w:ilvl="8" w:tplc="08090005" w:tentative="1">
+      <w:start w:val="1"/>
+      <w:numFmt w:val="bullet"/>
+      <w:lvlText w:val=""/>
+      <w:lvlJc w:val="left"/>
+      <w:pPr>
+        <w:ind w:left="6480" w:hanging="360"/>
+      </w:pPr>
+      <w:rPr>
+        <w:rFonts w:ascii="Wingdings" w:hAnsi="Wingdings" w:hint="default"/>
+      </w:rPr>
+    </w:lvl>
+  </w:abstractNum>
+  <w:num w:numId="1" w16cid:durableId="960067283">
+    <w:abstractNumId w:val="3"/>
+  </w:num>
+  <w:num w:numId="2" w16cid:durableId="990644379">
+    <w:abstractNumId w:val="4"/>
+  </w:num>
+  <w:num w:numId="3" w16cid:durableId="519121650">
+    <w:abstractNumId w:val="1"/>
+  </w:num>
+  <w:num w:numId="4" w16cid:durableId="2063825567">
+    <w:abstractNumId w:val="0"/>
+  </w:num>
+  <w:num w:numId="5" w16cid:durableId="1854682483">
+    <w:abstractNumId w:val="2"/>
+  </w:num>
+</w:numbering>
 </file>
 
 <file path=word/styles.xml><?xml version="1.0" encoding="utf-8"?>

</xml_diff>

<commit_message>
Projectiles and animation fixes
so tired
</commit_message>
<xml_diff>
--- a/DesignDocument.docx
+++ b/DesignDocument.docx
@@ -582,7 +582,7 @@
               <w:r>
                 <w:fldChar w:fldCharType="separate"/>
               </w:r>
-              <w:hyperlink w:anchor="_Toc197532739" w:history="1">
+              <w:hyperlink w:anchor="_Toc197638773" w:history="1">
                 <w:r>
                   <w:rPr>
                     <w:rStyle w:val="Hyperlink"/>
@@ -609,7 +609,7 @@
                     <w:noProof/>
                     <w:webHidden/>
                   </w:rPr>
-                  <w:instrText xml:space="preserve"> PAGEREF _Toc197532739 \h </w:instrText>
+                  <w:instrText xml:space="preserve"> PAGEREF _Toc197638773 \h </w:instrText>
                 </w:r>
                 <w:r>
                   <w:rPr>
@@ -652,7 +652,7 @@
                   <w:lang w:eastAsia="en-GB"/>
                 </w:rPr>
               </w:pPr>
-              <w:hyperlink w:anchor="_Toc197532740" w:history="1">
+              <w:hyperlink w:anchor="_Toc197638774" w:history="1">
                 <w:r>
                   <w:rPr>
                     <w:rStyle w:val="Hyperlink"/>
@@ -679,7 +679,7 @@
                     <w:noProof/>
                     <w:webHidden/>
                   </w:rPr>
-                  <w:instrText xml:space="preserve"> PAGEREF _Toc197532740 \h </w:instrText>
+                  <w:instrText xml:space="preserve"> PAGEREF _Toc197638774 \h </w:instrText>
                 </w:r>
                 <w:r>
                   <w:rPr>
@@ -722,7 +722,7 @@
                   <w:lang w:eastAsia="en-GB"/>
                 </w:rPr>
               </w:pPr>
-              <w:hyperlink w:anchor="_Toc197532741" w:history="1">
+              <w:hyperlink w:anchor="_Toc197638775" w:history="1">
                 <w:r>
                   <w:rPr>
                     <w:rStyle w:val="Hyperlink"/>
@@ -749,7 +749,7 @@
                     <w:noProof/>
                     <w:webHidden/>
                   </w:rPr>
-                  <w:instrText xml:space="preserve"> PAGEREF _Toc197532741 \h </w:instrText>
+                  <w:instrText xml:space="preserve"> PAGEREF _Toc197638775 \h </w:instrText>
                 </w:r>
                 <w:r>
                   <w:rPr>
@@ -792,7 +792,7 @@
                   <w:lang w:eastAsia="en-GB"/>
                 </w:rPr>
               </w:pPr>
-              <w:hyperlink w:anchor="_Toc197532742" w:history="1">
+              <w:hyperlink w:anchor="_Toc197638776" w:history="1">
                 <w:r>
                   <w:rPr>
                     <w:rStyle w:val="Hyperlink"/>
@@ -819,7 +819,7 @@
                     <w:noProof/>
                     <w:webHidden/>
                   </w:rPr>
-                  <w:instrText xml:space="preserve"> PAGEREF _Toc197532742 \h </w:instrText>
+                  <w:instrText xml:space="preserve"> PAGEREF _Toc197638776 \h </w:instrText>
                 </w:r>
                 <w:r>
                   <w:rPr>
@@ -862,7 +862,7 @@
                   <w:lang w:eastAsia="en-GB"/>
                 </w:rPr>
               </w:pPr>
-              <w:hyperlink w:anchor="_Toc197532743" w:history="1">
+              <w:hyperlink w:anchor="_Toc197638777" w:history="1">
                 <w:r>
                   <w:rPr>
                     <w:rStyle w:val="Hyperlink"/>
@@ -889,7 +889,7 @@
                     <w:noProof/>
                     <w:webHidden/>
                   </w:rPr>
-                  <w:instrText xml:space="preserve"> PAGEREF _Toc197532743 \h </w:instrText>
+                  <w:instrText xml:space="preserve"> PAGEREF _Toc197638777 \h </w:instrText>
                 </w:r>
                 <w:r>
                   <w:rPr>
@@ -909,7 +909,7 @@
                     <w:noProof/>
                     <w:webHidden/>
                   </w:rPr>
-                  <w:t>2</w:t>
+                  <w:t>3</w:t>
                 </w:r>
                 <w:r>
                   <w:rPr>
@@ -932,7 +932,7 @@
                   <w:lang w:eastAsia="en-GB"/>
                 </w:rPr>
               </w:pPr>
-              <w:hyperlink w:anchor="_Toc197532744" w:history="1">
+              <w:hyperlink w:anchor="_Toc197638778" w:history="1">
                 <w:r>
                   <w:rPr>
                     <w:rStyle w:val="Hyperlink"/>
@@ -959,7 +959,7 @@
                     <w:noProof/>
                     <w:webHidden/>
                   </w:rPr>
-                  <w:instrText xml:space="preserve"> PAGEREF _Toc197532744 \h </w:instrText>
+                  <w:instrText xml:space="preserve"> PAGEREF _Toc197638778 \h </w:instrText>
                 </w:r>
                 <w:r>
                   <w:rPr>
@@ -1002,7 +1002,7 @@
                   <w:lang w:eastAsia="en-GB"/>
                 </w:rPr>
               </w:pPr>
-              <w:hyperlink w:anchor="_Toc197532745" w:history="1">
+              <w:hyperlink w:anchor="_Toc197638779" w:history="1">
                 <w:r>
                   <w:rPr>
                     <w:rStyle w:val="Hyperlink"/>
@@ -1029,7 +1029,7 @@
                     <w:noProof/>
                     <w:webHidden/>
                   </w:rPr>
-                  <w:instrText xml:space="preserve"> PAGEREF _Toc197532745 \h </w:instrText>
+                  <w:instrText xml:space="preserve"> PAGEREF _Toc197638779 \h </w:instrText>
                 </w:r>
                 <w:r>
                   <w:rPr>
@@ -1072,7 +1072,7 @@
                   <w:lang w:eastAsia="en-GB"/>
                 </w:rPr>
               </w:pPr>
-              <w:hyperlink w:anchor="_Toc197532746" w:history="1">
+              <w:hyperlink w:anchor="_Toc197638780" w:history="1">
                 <w:r>
                   <w:rPr>
                     <w:rStyle w:val="Hyperlink"/>
@@ -1099,7 +1099,7 @@
                     <w:noProof/>
                     <w:webHidden/>
                   </w:rPr>
-                  <w:instrText xml:space="preserve"> PAGEREF _Toc197532746 \h </w:instrText>
+                  <w:instrText xml:space="preserve"> PAGEREF _Toc197638780 \h </w:instrText>
                 </w:r>
                 <w:r>
                   <w:rPr>
@@ -1142,7 +1142,7 @@
                   <w:lang w:eastAsia="en-GB"/>
                 </w:rPr>
               </w:pPr>
-              <w:hyperlink w:anchor="_Toc197532747" w:history="1">
+              <w:hyperlink w:anchor="_Toc197638781" w:history="1">
                 <w:r>
                   <w:rPr>
                     <w:rStyle w:val="Hyperlink"/>
@@ -1169,7 +1169,7 @@
                     <w:noProof/>
                     <w:webHidden/>
                   </w:rPr>
-                  <w:instrText xml:space="preserve"> PAGEREF _Toc197532747 \h </w:instrText>
+                  <w:instrText xml:space="preserve"> PAGEREF _Toc197638781 \h </w:instrText>
                 </w:r>
                 <w:r>
                   <w:rPr>
@@ -1212,7 +1212,7 @@
                   <w:lang w:eastAsia="en-GB"/>
                 </w:rPr>
               </w:pPr>
-              <w:hyperlink w:anchor="_Toc197532748" w:history="1">
+              <w:hyperlink w:anchor="_Toc197638782" w:history="1">
                 <w:r>
                   <w:rPr>
                     <w:rStyle w:val="Hyperlink"/>
@@ -1239,7 +1239,7 @@
                     <w:noProof/>
                     <w:webHidden/>
                   </w:rPr>
-                  <w:instrText xml:space="preserve"> PAGEREF _Toc197532748 \h </w:instrText>
+                  <w:instrText xml:space="preserve"> PAGEREF _Toc197638782 \h </w:instrText>
                 </w:r>
                 <w:r>
                   <w:rPr>
@@ -1282,7 +1282,7 @@
                   <w:lang w:eastAsia="en-GB"/>
                 </w:rPr>
               </w:pPr>
-              <w:hyperlink w:anchor="_Toc197532749" w:history="1">
+              <w:hyperlink w:anchor="_Toc197638783" w:history="1">
                 <w:r>
                   <w:rPr>
                     <w:rStyle w:val="Hyperlink"/>
@@ -1309,7 +1309,7 @@
                     <w:noProof/>
                     <w:webHidden/>
                   </w:rPr>
-                  <w:instrText xml:space="preserve"> PAGEREF _Toc197532749 \h </w:instrText>
+                  <w:instrText xml:space="preserve"> PAGEREF _Toc197638783 \h </w:instrText>
                 </w:r>
                 <w:r>
                   <w:rPr>
@@ -1352,7 +1352,7 @@
                   <w:lang w:eastAsia="en-GB"/>
                 </w:rPr>
               </w:pPr>
-              <w:hyperlink w:anchor="_Toc197532750" w:history="1">
+              <w:hyperlink w:anchor="_Toc197638784" w:history="1">
                 <w:r>
                   <w:rPr>
                     <w:rStyle w:val="Hyperlink"/>
@@ -1379,7 +1379,7 @@
                     <w:noProof/>
                     <w:webHidden/>
                   </w:rPr>
-                  <w:instrText xml:space="preserve"> PAGEREF _Toc197532750 \h </w:instrText>
+                  <w:instrText xml:space="preserve"> PAGEREF _Toc197638784 \h </w:instrText>
                 </w:r>
                 <w:r>
                   <w:rPr>
@@ -1422,7 +1422,7 @@
                   <w:lang w:eastAsia="en-GB"/>
                 </w:rPr>
               </w:pPr>
-              <w:hyperlink w:anchor="_Toc197532751" w:history="1">
+              <w:hyperlink w:anchor="_Toc197638785" w:history="1">
                 <w:r>
                   <w:rPr>
                     <w:rStyle w:val="Hyperlink"/>
@@ -1449,7 +1449,7 @@
                     <w:noProof/>
                     <w:webHidden/>
                   </w:rPr>
-                  <w:instrText xml:space="preserve"> PAGEREF _Toc197532751 \h </w:instrText>
+                  <w:instrText xml:space="preserve"> PAGEREF _Toc197638785 \h </w:instrText>
                 </w:r>
                 <w:r>
                   <w:rPr>
@@ -1469,7 +1469,7 @@
                     <w:noProof/>
                     <w:webHidden/>
                   </w:rPr>
-                  <w:t>6</w:t>
+                  <w:t>7</w:t>
                 </w:r>
                 <w:r>
                   <w:rPr>
@@ -1492,7 +1492,7 @@
                   <w:lang w:eastAsia="en-GB"/>
                 </w:rPr>
               </w:pPr>
-              <w:hyperlink w:anchor="_Toc197532752" w:history="1">
+              <w:hyperlink w:anchor="_Toc197638786" w:history="1">
                 <w:r>
                   <w:rPr>
                     <w:rStyle w:val="Hyperlink"/>
@@ -1519,7 +1519,7 @@
                     <w:noProof/>
                     <w:webHidden/>
                   </w:rPr>
-                  <w:instrText xml:space="preserve"> PAGEREF _Toc197532752 \h </w:instrText>
+                  <w:instrText xml:space="preserve"> PAGEREF _Toc197638786 \h </w:instrText>
                 </w:r>
                 <w:r>
                   <w:rPr>
@@ -1539,7 +1539,7 @@
                     <w:noProof/>
                     <w:webHidden/>
                   </w:rPr>
-                  <w:t>6</w:t>
+                  <w:t>7</w:t>
                 </w:r>
                 <w:r>
                   <w:rPr>
@@ -1562,7 +1562,7 @@
                   <w:lang w:eastAsia="en-GB"/>
                 </w:rPr>
               </w:pPr>
-              <w:hyperlink w:anchor="_Toc197532753" w:history="1">
+              <w:hyperlink w:anchor="_Toc197638787" w:history="1">
                 <w:r>
                   <w:rPr>
                     <w:rStyle w:val="Hyperlink"/>
@@ -1589,7 +1589,7 @@
                     <w:noProof/>
                     <w:webHidden/>
                   </w:rPr>
-                  <w:instrText xml:space="preserve"> PAGEREF _Toc197532753 \h </w:instrText>
+                  <w:instrText xml:space="preserve"> PAGEREF _Toc197638787 \h </w:instrText>
                 </w:r>
                 <w:r>
                   <w:rPr>
@@ -1609,7 +1609,7 @@
                     <w:noProof/>
                     <w:webHidden/>
                   </w:rPr>
-                  <w:t>7</w:t>
+                  <w:t>8</w:t>
                 </w:r>
                 <w:r>
                   <w:rPr>
@@ -1632,7 +1632,7 @@
                   <w:lang w:eastAsia="en-GB"/>
                 </w:rPr>
               </w:pPr>
-              <w:hyperlink w:anchor="_Toc197532754" w:history="1">
+              <w:hyperlink w:anchor="_Toc197638788" w:history="1">
                 <w:r>
                   <w:rPr>
                     <w:rStyle w:val="Hyperlink"/>
@@ -1659,7 +1659,7 @@
                     <w:noProof/>
                     <w:webHidden/>
                   </w:rPr>
-                  <w:instrText xml:space="preserve"> PAGEREF _Toc197532754 \h </w:instrText>
+                  <w:instrText xml:space="preserve"> PAGEREF _Toc197638788 \h </w:instrText>
                 </w:r>
                 <w:r>
                   <w:rPr>
@@ -1679,7 +1679,7 @@
                     <w:noProof/>
                     <w:webHidden/>
                   </w:rPr>
-                  <w:t>7</w:t>
+                  <w:t>8</w:t>
                 </w:r>
                 <w:r>
                   <w:rPr>
@@ -1702,7 +1702,7 @@
                   <w:lang w:eastAsia="en-GB"/>
                 </w:rPr>
               </w:pPr>
-              <w:hyperlink w:anchor="_Toc197532755" w:history="1">
+              <w:hyperlink w:anchor="_Toc197638789" w:history="1">
                 <w:r>
                   <w:rPr>
                     <w:rStyle w:val="Hyperlink"/>
@@ -1729,7 +1729,7 @@
                     <w:noProof/>
                     <w:webHidden/>
                   </w:rPr>
-                  <w:instrText xml:space="preserve"> PAGEREF _Toc197532755 \h </w:instrText>
+                  <w:instrText xml:space="preserve"> PAGEREF _Toc197638789 \h </w:instrText>
                 </w:r>
                 <w:r>
                   <w:rPr>
@@ -1749,7 +1749,7 @@
                     <w:noProof/>
                     <w:webHidden/>
                   </w:rPr>
-                  <w:t>7</w:t>
+                  <w:t>8</w:t>
                 </w:r>
                 <w:r>
                   <w:rPr>
@@ -1772,7 +1772,7 @@
                   <w:lang w:eastAsia="en-GB"/>
                 </w:rPr>
               </w:pPr>
-              <w:hyperlink w:anchor="_Toc197532756" w:history="1">
+              <w:hyperlink w:anchor="_Toc197638790" w:history="1">
                 <w:r>
                   <w:rPr>
                     <w:rStyle w:val="Hyperlink"/>
@@ -1799,7 +1799,7 @@
                     <w:noProof/>
                     <w:webHidden/>
                   </w:rPr>
-                  <w:instrText xml:space="preserve"> PAGEREF _Toc197532756 \h </w:instrText>
+                  <w:instrText xml:space="preserve"> PAGEREF _Toc197638790 \h </w:instrText>
                 </w:r>
                 <w:r>
                   <w:rPr>
@@ -1842,7 +1842,7 @@
                   <w:lang w:eastAsia="en-GB"/>
                 </w:rPr>
               </w:pPr>
-              <w:hyperlink w:anchor="_Toc197532757" w:history="1">
+              <w:hyperlink w:anchor="_Toc197638791" w:history="1">
                 <w:r>
                   <w:rPr>
                     <w:rStyle w:val="Hyperlink"/>
@@ -1869,7 +1869,7 @@
                     <w:noProof/>
                     <w:webHidden/>
                   </w:rPr>
-                  <w:instrText xml:space="preserve"> PAGEREF _Toc197532757 \h </w:instrText>
+                  <w:instrText xml:space="preserve"> PAGEREF _Toc197638791 \h </w:instrText>
                 </w:r>
                 <w:r>
                   <w:rPr>
@@ -1889,7 +1889,7 @@
                     <w:noProof/>
                     <w:webHidden/>
                   </w:rPr>
-                  <w:t>8</w:t>
+                  <w:t>9</w:t>
                 </w:r>
                 <w:r>
                   <w:rPr>
@@ -1912,7 +1912,7 @@
                   <w:lang w:eastAsia="en-GB"/>
                 </w:rPr>
               </w:pPr>
-              <w:hyperlink w:anchor="_Toc197532758" w:history="1">
+              <w:hyperlink w:anchor="_Toc197638792" w:history="1">
                 <w:r>
                   <w:rPr>
                     <w:rStyle w:val="Hyperlink"/>
@@ -1939,7 +1939,7 @@
                     <w:noProof/>
                     <w:webHidden/>
                   </w:rPr>
-                  <w:instrText xml:space="preserve"> PAGEREF _Toc197532758 \h </w:instrText>
+                  <w:instrText xml:space="preserve"> PAGEREF _Toc197638792 \h </w:instrText>
                 </w:r>
                 <w:r>
                   <w:rPr>
@@ -1959,7 +1959,7 @@
                     <w:noProof/>
                     <w:webHidden/>
                   </w:rPr>
-                  <w:t>8</w:t>
+                  <w:t>9</w:t>
                 </w:r>
                 <w:r>
                   <w:rPr>
@@ -1982,7 +1982,7 @@
                   <w:lang w:eastAsia="en-GB"/>
                 </w:rPr>
               </w:pPr>
-              <w:hyperlink w:anchor="_Toc197532759" w:history="1">
+              <w:hyperlink w:anchor="_Toc197638793" w:history="1">
                 <w:r>
                   <w:rPr>
                     <w:rStyle w:val="Hyperlink"/>
@@ -2009,7 +2009,7 @@
                     <w:noProof/>
                     <w:webHidden/>
                   </w:rPr>
-                  <w:instrText xml:space="preserve"> PAGEREF _Toc197532759 \h </w:instrText>
+                  <w:instrText xml:space="preserve"> PAGEREF _Toc197638793 \h </w:instrText>
                 </w:r>
                 <w:r>
                   <w:rPr>
@@ -2029,7 +2029,7 @@
                     <w:noProof/>
                     <w:webHidden/>
                   </w:rPr>
-                  <w:t>8</w:t>
+                  <w:t>9</w:t>
                 </w:r>
                 <w:r>
                   <w:rPr>
@@ -2052,7 +2052,7 @@
                   <w:lang w:eastAsia="en-GB"/>
                 </w:rPr>
               </w:pPr>
-              <w:hyperlink w:anchor="_Toc197532760" w:history="1">
+              <w:hyperlink w:anchor="_Toc197638794" w:history="1">
                 <w:r>
                   <w:rPr>
                     <w:rStyle w:val="Hyperlink"/>
@@ -2079,7 +2079,7 @@
                     <w:noProof/>
                     <w:webHidden/>
                   </w:rPr>
-                  <w:instrText xml:space="preserve"> PAGEREF _Toc197532760 \h </w:instrText>
+                  <w:instrText xml:space="preserve"> PAGEREF _Toc197638794 \h </w:instrText>
                 </w:r>
                 <w:r>
                   <w:rPr>
@@ -2099,7 +2099,7 @@
                     <w:noProof/>
                     <w:webHidden/>
                   </w:rPr>
-                  <w:t>8</w:t>
+                  <w:t>9</w:t>
                 </w:r>
                 <w:r>
                   <w:rPr>
@@ -2122,7 +2122,7 @@
                   <w:lang w:eastAsia="en-GB"/>
                 </w:rPr>
               </w:pPr>
-              <w:hyperlink w:anchor="_Toc197532761" w:history="1">
+              <w:hyperlink w:anchor="_Toc197638795" w:history="1">
                 <w:r>
                   <w:rPr>
                     <w:rStyle w:val="Hyperlink"/>
@@ -2149,7 +2149,7 @@
                     <w:noProof/>
                     <w:webHidden/>
                   </w:rPr>
-                  <w:instrText xml:space="preserve"> PAGEREF _Toc197532761 \h </w:instrText>
+                  <w:instrText xml:space="preserve"> PAGEREF _Toc197638795 \h </w:instrText>
                 </w:r>
                 <w:r>
                   <w:rPr>
@@ -2192,7 +2192,7 @@
                   <w:lang w:eastAsia="en-GB"/>
                 </w:rPr>
               </w:pPr>
-              <w:hyperlink w:anchor="_Toc197532762" w:history="1">
+              <w:hyperlink w:anchor="_Toc197638796" w:history="1">
                 <w:r>
                   <w:rPr>
                     <w:rStyle w:val="Hyperlink"/>
@@ -2219,7 +2219,7 @@
                     <w:noProof/>
                     <w:webHidden/>
                   </w:rPr>
-                  <w:instrText xml:space="preserve"> PAGEREF _Toc197532762 \h </w:instrText>
+                  <w:instrText xml:space="preserve"> PAGEREF _Toc197638796 \h </w:instrText>
                 </w:r>
                 <w:r>
                   <w:rPr>
@@ -2262,7 +2262,7 @@
                   <w:lang w:eastAsia="en-GB"/>
                 </w:rPr>
               </w:pPr>
-              <w:hyperlink w:anchor="_Toc197532763" w:history="1">
+              <w:hyperlink w:anchor="_Toc197638797" w:history="1">
                 <w:r>
                   <w:rPr>
                     <w:rStyle w:val="Hyperlink"/>
@@ -2289,7 +2289,7 @@
                     <w:noProof/>
                     <w:webHidden/>
                   </w:rPr>
-                  <w:instrText xml:space="preserve"> PAGEREF _Toc197532763 \h </w:instrText>
+                  <w:instrText xml:space="preserve"> PAGEREF _Toc197638797 \h </w:instrText>
                 </w:r>
                 <w:r>
                   <w:rPr>
@@ -2309,7 +2309,7 @@
                     <w:noProof/>
                     <w:webHidden/>
                   </w:rPr>
-                  <w:t>9</w:t>
+                  <w:t>10</w:t>
                 </w:r>
                 <w:r>
                   <w:rPr>
@@ -2332,7 +2332,7 @@
                   <w:lang w:eastAsia="en-GB"/>
                 </w:rPr>
               </w:pPr>
-              <w:hyperlink w:anchor="_Toc197532764" w:history="1">
+              <w:hyperlink w:anchor="_Toc197638798" w:history="1">
                 <w:r>
                   <w:rPr>
                     <w:rStyle w:val="Hyperlink"/>
@@ -2359,7 +2359,7 @@
                     <w:noProof/>
                     <w:webHidden/>
                   </w:rPr>
-                  <w:instrText xml:space="preserve"> PAGEREF _Toc197532764 \h </w:instrText>
+                  <w:instrText xml:space="preserve"> PAGEREF _Toc197638798 \h </w:instrText>
                 </w:r>
                 <w:r>
                   <w:rPr>
@@ -2379,7 +2379,217 @@
                     <w:noProof/>
                     <w:webHidden/>
                   </w:rPr>
-                  <w:t>9</w:t>
+                  <w:t>10</w:t>
+                </w:r>
+                <w:r>
+                  <w:rPr>
+                    <w:noProof/>
+                    <w:webHidden/>
+                  </w:rPr>
+                  <w:fldChar w:fldCharType="end"/>
+                </w:r>
+              </w:hyperlink>
+            </w:p>
+            <w:p>
+              <w:pPr>
+                <w:pStyle w:val="TOC2"/>
+                <w:tabs>
+                  <w:tab w:val="right" w:leader="dot" w:pos="9016"/>
+                </w:tabs>
+                <w:rPr>
+                  <w:rFonts w:eastAsiaTheme="minorEastAsia"/>
+                  <w:noProof/>
+                  <w:lang w:eastAsia="en-GB"/>
+                </w:rPr>
+              </w:pPr>
+              <w:hyperlink w:anchor="_Toc197638799" w:history="1">
+                <w:r>
+                  <w:rPr>
+                    <w:rStyle w:val="Hyperlink"/>
+                    <w:noProof/>
+                  </w:rPr>
+                  <w:t>Movement</w:t>
+                </w:r>
+                <w:r>
+                  <w:rPr>
+                    <w:noProof/>
+                    <w:webHidden/>
+                  </w:rPr>
+                  <w:tab/>
+                </w:r>
+                <w:r>
+                  <w:rPr>
+                    <w:noProof/>
+                    <w:webHidden/>
+                  </w:rPr>
+                  <w:fldChar w:fldCharType="begin"/>
+                </w:r>
+                <w:r>
+                  <w:rPr>
+                    <w:noProof/>
+                    <w:webHidden/>
+                  </w:rPr>
+                  <w:instrText xml:space="preserve"> PAGEREF _Toc197638799 \h </w:instrText>
+                </w:r>
+                <w:r>
+                  <w:rPr>
+                    <w:noProof/>
+                    <w:webHidden/>
+                  </w:rPr>
+                </w:r>
+                <w:r>
+                  <w:rPr>
+                    <w:noProof/>
+                    <w:webHidden/>
+                  </w:rPr>
+                  <w:fldChar w:fldCharType="separate"/>
+                </w:r>
+                <w:r>
+                  <w:rPr>
+                    <w:noProof/>
+                    <w:webHidden/>
+                  </w:rPr>
+                  <w:t>10</w:t>
+                </w:r>
+                <w:r>
+                  <w:rPr>
+                    <w:noProof/>
+                    <w:webHidden/>
+                  </w:rPr>
+                  <w:fldChar w:fldCharType="end"/>
+                </w:r>
+              </w:hyperlink>
+            </w:p>
+            <w:p>
+              <w:pPr>
+                <w:pStyle w:val="TOC2"/>
+                <w:tabs>
+                  <w:tab w:val="right" w:leader="dot" w:pos="9016"/>
+                </w:tabs>
+                <w:rPr>
+                  <w:rFonts w:eastAsiaTheme="minorEastAsia"/>
+                  <w:noProof/>
+                  <w:lang w:eastAsia="en-GB"/>
+                </w:rPr>
+              </w:pPr>
+              <w:hyperlink w:anchor="_Toc197638800" w:history="1">
+                <w:r>
+                  <w:rPr>
+                    <w:rStyle w:val="Hyperlink"/>
+                    <w:noProof/>
+                  </w:rPr>
+                  <w:t>Aiming</w:t>
+                </w:r>
+                <w:r>
+                  <w:rPr>
+                    <w:noProof/>
+                    <w:webHidden/>
+                  </w:rPr>
+                  <w:tab/>
+                </w:r>
+                <w:r>
+                  <w:rPr>
+                    <w:noProof/>
+                    <w:webHidden/>
+                  </w:rPr>
+                  <w:fldChar w:fldCharType="begin"/>
+                </w:r>
+                <w:r>
+                  <w:rPr>
+                    <w:noProof/>
+                    <w:webHidden/>
+                  </w:rPr>
+                  <w:instrText xml:space="preserve"> PAGEREF _Toc197638800 \h </w:instrText>
+                </w:r>
+                <w:r>
+                  <w:rPr>
+                    <w:noProof/>
+                    <w:webHidden/>
+                  </w:rPr>
+                </w:r>
+                <w:r>
+                  <w:rPr>
+                    <w:noProof/>
+                    <w:webHidden/>
+                  </w:rPr>
+                  <w:fldChar w:fldCharType="separate"/>
+                </w:r>
+                <w:r>
+                  <w:rPr>
+                    <w:noProof/>
+                    <w:webHidden/>
+                  </w:rPr>
+                  <w:t>10</w:t>
+                </w:r>
+                <w:r>
+                  <w:rPr>
+                    <w:noProof/>
+                    <w:webHidden/>
+                  </w:rPr>
+                  <w:fldChar w:fldCharType="end"/>
+                </w:r>
+              </w:hyperlink>
+            </w:p>
+            <w:p>
+              <w:pPr>
+                <w:pStyle w:val="TOC2"/>
+                <w:tabs>
+                  <w:tab w:val="right" w:leader="dot" w:pos="9016"/>
+                </w:tabs>
+                <w:rPr>
+                  <w:rFonts w:eastAsiaTheme="minorEastAsia"/>
+                  <w:noProof/>
+                  <w:lang w:eastAsia="en-GB"/>
+                </w:rPr>
+              </w:pPr>
+              <w:hyperlink w:anchor="_Toc197638801" w:history="1">
+                <w:r>
+                  <w:rPr>
+                    <w:rStyle w:val="Hyperlink"/>
+                    <w:noProof/>
+                  </w:rPr>
+                  <w:t>Crouching</w:t>
+                </w:r>
+                <w:r>
+                  <w:rPr>
+                    <w:noProof/>
+                    <w:webHidden/>
+                  </w:rPr>
+                  <w:tab/>
+                </w:r>
+                <w:r>
+                  <w:rPr>
+                    <w:noProof/>
+                    <w:webHidden/>
+                  </w:rPr>
+                  <w:fldChar w:fldCharType="begin"/>
+                </w:r>
+                <w:r>
+                  <w:rPr>
+                    <w:noProof/>
+                    <w:webHidden/>
+                  </w:rPr>
+                  <w:instrText xml:space="preserve"> PAGEREF _Toc197638801 \h </w:instrText>
+                </w:r>
+                <w:r>
+                  <w:rPr>
+                    <w:noProof/>
+                    <w:webHidden/>
+                  </w:rPr>
+                </w:r>
+                <w:r>
+                  <w:rPr>
+                    <w:noProof/>
+                    <w:webHidden/>
+                  </w:rPr>
+                  <w:fldChar w:fldCharType="separate"/>
+                </w:r>
+                <w:r>
+                  <w:rPr>
+                    <w:noProof/>
+                    <w:webHidden/>
+                  </w:rPr>
+                  <w:t>10</w:t>
                 </w:r>
                 <w:r>
                   <w:rPr>
@@ -2402,7 +2612,7 @@
                   <w:lang w:eastAsia="en-GB"/>
                 </w:rPr>
               </w:pPr>
-              <w:hyperlink w:anchor="_Toc197532765" w:history="1">
+              <w:hyperlink w:anchor="_Toc197638802" w:history="1">
                 <w:r>
                   <w:rPr>
                     <w:rStyle w:val="Hyperlink"/>
@@ -2429,7 +2639,7 @@
                     <w:noProof/>
                     <w:webHidden/>
                   </w:rPr>
-                  <w:instrText xml:space="preserve"> PAGEREF _Toc197532765 \h </w:instrText>
+                  <w:instrText xml:space="preserve"> PAGEREF _Toc197638802 \h </w:instrText>
                 </w:r>
                 <w:r>
                   <w:rPr>
@@ -2449,7 +2659,7 @@
                     <w:noProof/>
                     <w:webHidden/>
                   </w:rPr>
-                  <w:t>9</w:t>
+                  <w:t>11</w:t>
                 </w:r>
                 <w:r>
                   <w:rPr>
@@ -2472,13 +2682,13 @@
                   <w:lang w:eastAsia="en-GB"/>
                 </w:rPr>
               </w:pPr>
-              <w:hyperlink w:anchor="_Toc197532766" w:history="1">
+              <w:hyperlink w:anchor="_Toc197638803" w:history="1">
                 <w:r>
                   <w:rPr>
                     <w:rStyle w:val="Hyperlink"/>
                     <w:noProof/>
                   </w:rPr>
-                  <w:t>Cameras</w:t>
+                  <w:t>URP Features</w:t>
                 </w:r>
                 <w:r>
                   <w:rPr>
@@ -2499,7 +2709,7 @@
                     <w:noProof/>
                     <w:webHidden/>
                   </w:rPr>
-                  <w:instrText xml:space="preserve"> PAGEREF _Toc197532766 \h </w:instrText>
+                  <w:instrText xml:space="preserve"> PAGEREF _Toc197638803 \h </w:instrText>
                 </w:r>
                 <w:r>
                   <w:rPr>
@@ -2519,7 +2729,7 @@
                     <w:noProof/>
                     <w:webHidden/>
                   </w:rPr>
-                  <w:t>9</w:t>
+                  <w:t>11</w:t>
                 </w:r>
                 <w:r>
                   <w:rPr>
@@ -2532,7 +2742,7 @@
             </w:p>
             <w:p>
               <w:pPr>
-                <w:pStyle w:val="TOC2"/>
+                <w:pStyle w:val="TOC3"/>
                 <w:tabs>
                   <w:tab w:val="right" w:leader="dot" w:pos="9016"/>
                 </w:tabs>
@@ -2542,13 +2752,13 @@
                   <w:lang w:eastAsia="en-GB"/>
                 </w:rPr>
               </w:pPr>
-              <w:hyperlink w:anchor="_Toc197532767" w:history="1">
+              <w:hyperlink w:anchor="_Toc197638804" w:history="1">
                 <w:r>
                   <w:rPr>
                     <w:rStyle w:val="Hyperlink"/>
                     <w:noProof/>
                   </w:rPr>
-                  <w:t>Shaders</w:t>
+                  <w:t>Render Features</w:t>
                 </w:r>
                 <w:r>
                   <w:rPr>
@@ -2569,7 +2779,7 @@
                     <w:noProof/>
                     <w:webHidden/>
                   </w:rPr>
-                  <w:instrText xml:space="preserve"> PAGEREF _Toc197532767 \h </w:instrText>
+                  <w:instrText xml:space="preserve"> PAGEREF _Toc197638804 \h </w:instrText>
                 </w:r>
                 <w:r>
                   <w:rPr>
@@ -2589,7 +2799,77 @@
                     <w:noProof/>
                     <w:webHidden/>
                   </w:rPr>
-                  <w:t>9</w:t>
+                  <w:t>11</w:t>
+                </w:r>
+                <w:r>
+                  <w:rPr>
+                    <w:noProof/>
+                    <w:webHidden/>
+                  </w:rPr>
+                  <w:fldChar w:fldCharType="end"/>
+                </w:r>
+              </w:hyperlink>
+            </w:p>
+            <w:p>
+              <w:pPr>
+                <w:pStyle w:val="TOC3"/>
+                <w:tabs>
+                  <w:tab w:val="right" w:leader="dot" w:pos="9016"/>
+                </w:tabs>
+                <w:rPr>
+                  <w:rFonts w:eastAsiaTheme="minorEastAsia"/>
+                  <w:noProof/>
+                  <w:lang w:eastAsia="en-GB"/>
+                </w:rPr>
+              </w:pPr>
+              <w:hyperlink w:anchor="_Toc197638805" w:history="1">
+                <w:r>
+                  <w:rPr>
+                    <w:rStyle w:val="Hyperlink"/>
+                    <w:noProof/>
+                  </w:rPr>
+                  <w:t>Camera Stacking</w:t>
+                </w:r>
+                <w:r>
+                  <w:rPr>
+                    <w:noProof/>
+                    <w:webHidden/>
+                  </w:rPr>
+                  <w:tab/>
+                </w:r>
+                <w:r>
+                  <w:rPr>
+                    <w:noProof/>
+                    <w:webHidden/>
+                  </w:rPr>
+                  <w:fldChar w:fldCharType="begin"/>
+                </w:r>
+                <w:r>
+                  <w:rPr>
+                    <w:noProof/>
+                    <w:webHidden/>
+                  </w:rPr>
+                  <w:instrText xml:space="preserve"> PAGEREF _Toc197638805 \h </w:instrText>
+                </w:r>
+                <w:r>
+                  <w:rPr>
+                    <w:noProof/>
+                    <w:webHidden/>
+                  </w:rPr>
+                </w:r>
+                <w:r>
+                  <w:rPr>
+                    <w:noProof/>
+                    <w:webHidden/>
+                  </w:rPr>
+                  <w:fldChar w:fldCharType="separate"/>
+                </w:r>
+                <w:r>
+                  <w:rPr>
+                    <w:noProof/>
+                    <w:webHidden/>
+                  </w:rPr>
+                  <w:t>11</w:t>
                 </w:r>
                 <w:r>
                   <w:rPr>
@@ -2611,11 +2891,6 @@
             </w:p>
           </w:sdtContent>
         </w:sdt>
-        <w:p>
-          <w:r>
-            <w:br w:type="page"/>
-          </w:r>
-        </w:p>
         <w:p/>
       </w:sdtContent>
     </w:sdt>
@@ -2623,7 +2898,7 @@
       <w:pPr>
         <w:pStyle w:val="Heading1"/>
       </w:pPr>
-      <w:bookmarkStart w:id="0" w:name="_Toc197532739"/>
+      <w:bookmarkStart w:id="0" w:name="_Toc197638773"/>
       <w:r>
         <w:t>Aims of the project</w:t>
       </w:r>
@@ -2664,7 +2939,7 @@
       <w:pPr>
         <w:pStyle w:val="Heading1"/>
       </w:pPr>
-      <w:bookmarkStart w:id="1" w:name="_Toc197532740"/>
+      <w:bookmarkStart w:id="1" w:name="_Toc197638774"/>
       <w:r>
         <w:t>Planned Features</w:t>
       </w:r>
@@ -2674,7 +2949,7 @@
       <w:pPr>
         <w:pStyle w:val="Heading2"/>
       </w:pPr>
-      <w:bookmarkStart w:id="2" w:name="_Toc197532741"/>
+      <w:bookmarkStart w:id="2" w:name="_Toc197638775"/>
       <w:r>
         <w:t>Weapon Implementation</w:t>
       </w:r>
@@ -2684,7 +2959,7 @@
       <w:pPr>
         <w:pStyle w:val="Heading3"/>
       </w:pPr>
-      <w:bookmarkStart w:id="3" w:name="_Toc197532742"/>
+      <w:bookmarkStart w:id="3" w:name="_Toc197638776"/>
       <w:r>
         <w:t>Firearms</w:t>
       </w:r>
@@ -2717,7 +2992,15 @@
     </w:p>
     <w:p>
       <w:r>
-        <w:t xml:space="preserve">Hitscan Firearms will fire an imaginary “ray” called a “raycast.” This ray checks along the path </w:t>
+        <w:t>Hitscan Firearms will fire an imaginary “ray” called a “</w:t>
+      </w:r>
+      <w:proofErr w:type="spellStart"/>
+      <w:r>
+        <w:t>raycast</w:t>
+      </w:r>
+      <w:proofErr w:type="spellEnd"/>
+      <w:r>
+        <w:t xml:space="preserve">.” This ray checks along the path </w:t>
       </w:r>
       <w:r>
         <w:t>from the origin of the attack to an endpoint</w:t>
@@ -2736,39 +3019,60 @@
     </w:p>
     <w:p>
       <w:r>
-        <w:t xml:space="preserve">Projectile Firearms will fire a rigidbody projectile (an object with physics). These projectiles will react to other objects in the game world, will be able to bounce </w:t>
+        <w:t xml:space="preserve">Projectile Firearms will fire a </w:t>
+      </w:r>
+      <w:proofErr w:type="spellStart"/>
+      <w:r>
+        <w:t>rigidbody</w:t>
+      </w:r>
+      <w:proofErr w:type="spellEnd"/>
+      <w:r>
+        <w:t xml:space="preserve"> projectile (an object with physics). These projectiles will react to other objects in the game world, will be able to bounce </w:t>
       </w:r>
       <w:r>
         <w:t>off</w:t>
       </w:r>
       <w:r>
-        <w:t xml:space="preserve"> walls, and can be affected by anything that might affect any rigidbodies in the scene.</w:t>
+        <w:t xml:space="preserve"> walls, and can be affected by anything that might affect any </w:t>
+      </w:r>
+      <w:proofErr w:type="spellStart"/>
+      <w:r>
+        <w:t>rigidbodies</w:t>
+      </w:r>
+      <w:proofErr w:type="spellEnd"/>
+      <w:r>
+        <w:t xml:space="preserve"> in the scene.</w:t>
       </w:r>
     </w:p>
     <w:p>
       <w:pPr>
         <w:pStyle w:val="Heading3"/>
       </w:pPr>
-      <w:bookmarkStart w:id="4" w:name="_Toc197532743"/>
-      <w:r>
+      <w:bookmarkStart w:id="4" w:name="_Toc197638777"/>
+      <w:r>
+        <w:lastRenderedPageBreak/>
         <w:t>Melee</w:t>
       </w:r>
       <w:bookmarkEnd w:id="4"/>
     </w:p>
     <w:p>
       <w:r>
-        <w:t xml:space="preserve">Melee weapons will trace between two points each fixed timestep by storing their last position and performing a linecast between those two points, ensuring that no targets </w:t>
-      </w:r>
-      <w:r>
-        <w:lastRenderedPageBreak/>
-        <w:t>are missed between strikes. To ensure that targets are not missed due to being too close, the system will also cast outwards from the player to the end of the weapon along the path of the strike. Anything that can be damage will be cached and ignored by further traces until the attack has ended.</w:t>
+        <w:t xml:space="preserve">Melee weapons will trace between two points each fixed timestep by storing their last position and performing a </w:t>
+      </w:r>
+      <w:proofErr w:type="spellStart"/>
+      <w:r>
+        <w:t>linecast</w:t>
+      </w:r>
+      <w:proofErr w:type="spellEnd"/>
+      <w:r>
+        <w:t xml:space="preserve"> between those two points, ensuring that no targets are missed between strikes. To ensure that targets are not missed due to being too close, the system will also cast outwards from the player to the end of the weapon along the path of the strike. Anything that can be damage will be cached and ignored by further traces until the attack has ended.</w:t>
       </w:r>
     </w:p>
     <w:p>
       <w:pPr>
         <w:pStyle w:val="Heading1"/>
       </w:pPr>
-      <w:bookmarkStart w:id="5" w:name="_Toc197532744"/>
+      <w:bookmarkStart w:id="5" w:name="_Toc197638778"/>
       <w:r>
         <w:t>Raycast Commands &amp; Bullet Scheduling</w:t>
       </w:r>
@@ -2788,12 +3092,44 @@
         <w:t>.</w:t>
       </w:r>
       <w:r>
-        <w:t xml:space="preserve"> There is also an additional performance impact from the normalisation of the fire vector, since RaycastCommands will not accept a vector that is not normalised.</w:t>
-      </w:r>
-    </w:p>
-    <w:p>
-      <w:r>
-        <w:t>In its first iteration, the system used two lists of a BulletData struct, used to determine some information about the “bullets.” A Native Array of RaycastCommands and RaycastHits is currently used to store the information needed by the Raycast batch.</w:t>
+        <w:t xml:space="preserve"> There is also an additional performance impact from the normalisation of the fire vector, since </w:t>
+      </w:r>
+      <w:proofErr w:type="spellStart"/>
+      <w:r>
+        <w:t>RaycastCommands</w:t>
+      </w:r>
+      <w:proofErr w:type="spellEnd"/>
+      <w:r>
+        <w:t xml:space="preserve"> will not accept a vector that is not normalised.</w:t>
+      </w:r>
+    </w:p>
+    <w:p>
+      <w:r>
+        <w:t xml:space="preserve">In its first iteration, the system used two lists of a </w:t>
+      </w:r>
+      <w:proofErr w:type="spellStart"/>
+      <w:r>
+        <w:t>BulletData</w:t>
+      </w:r>
+      <w:proofErr w:type="spellEnd"/>
+      <w:r>
+        <w:t xml:space="preserve"> struct, used to determine some information about the “bullets.” A Native Array of </w:t>
+      </w:r>
+      <w:proofErr w:type="spellStart"/>
+      <w:r>
+        <w:t>RaycastCommands</w:t>
+      </w:r>
+      <w:proofErr w:type="spellEnd"/>
+      <w:r>
+        <w:t xml:space="preserve"> and </w:t>
+      </w:r>
+      <w:proofErr w:type="spellStart"/>
+      <w:r>
+        <w:t>RaycastHits</w:t>
+      </w:r>
+      <w:proofErr w:type="spellEnd"/>
+      <w:r>
+        <w:t xml:space="preserve"> is currently used to store the information needed by the Raycast batch.</w:t>
       </w:r>
     </w:p>
     <w:p>
@@ -2815,7 +3151,7 @@
       <w:pPr>
         <w:pStyle w:val="Heading3"/>
       </w:pPr>
-      <w:bookmarkStart w:id="6" w:name="_Toc197532745"/>
+      <w:bookmarkStart w:id="6" w:name="_Toc197638779"/>
       <w:r>
         <w:t>Test Conditions</w:t>
       </w:r>
@@ -2823,17 +3159,49 @@
     </w:p>
     <w:p>
       <w:r>
-        <w:t>In the scene, there is a camera for rendering, the Input Manager that the player uses, a Rigidbody with a hinge joint placed in front of the test weapon, and the test weapon itself.</w:t>
-      </w:r>
-    </w:p>
-    <w:p>
-      <w:r>
-        <w:t>The test weapon fires a variable number of raycasts every frame, with an optional divergence. The divergence is a maximum measure, divided by 2, of how perpendicular the fire vector can be to the forward vector of the weapon.</w:t>
-      </w:r>
-    </w:p>
-    <w:p>
-      <w:r>
-        <w:t xml:space="preserve">When a raycast hits the Rigidbody in the scene, it applies a force at the point the ray hits, pushing the object around in a circle. </w:t>
+        <w:t xml:space="preserve">In the scene, there is a camera for rendering, the Input Manager that the player uses, a </w:t>
+      </w:r>
+      <w:proofErr w:type="spellStart"/>
+      <w:r>
+        <w:t>Rigidbody</w:t>
+      </w:r>
+      <w:proofErr w:type="spellEnd"/>
+      <w:r>
+        <w:t xml:space="preserve"> with a hinge joint placed in front of the test weapon, and the test weapon itself.</w:t>
+      </w:r>
+    </w:p>
+    <w:p>
+      <w:r>
+        <w:t xml:space="preserve">The test weapon fires a variable number of </w:t>
+      </w:r>
+      <w:proofErr w:type="spellStart"/>
+      <w:r>
+        <w:t>raycasts</w:t>
+      </w:r>
+      <w:proofErr w:type="spellEnd"/>
+      <w:r>
+        <w:t xml:space="preserve"> every frame, with an optional divergence. The divergence is a maximum measure, divided by 2, of how perpendicular the fire vector can be to the forward vector of the weapon.</w:t>
+      </w:r>
+    </w:p>
+    <w:p>
+      <w:r>
+        <w:t xml:space="preserve">When a </w:t>
+      </w:r>
+      <w:proofErr w:type="spellStart"/>
+      <w:r>
+        <w:t>raycast</w:t>
+      </w:r>
+      <w:proofErr w:type="spellEnd"/>
+      <w:r>
+        <w:t xml:space="preserve"> hits the </w:t>
+      </w:r>
+      <w:proofErr w:type="spellStart"/>
+      <w:r>
+        <w:t>Rigidbody</w:t>
+      </w:r>
+      <w:proofErr w:type="spellEnd"/>
+      <w:r>
+        <w:t xml:space="preserve"> in the scene, it applies a force at the point the ray hits, pushing the object around in a circle. </w:t>
       </w:r>
     </w:p>
     <w:p>
@@ -2863,7 +3231,7 @@
                     <pic:cNvPicPr/>
                   </pic:nvPicPr>
                   <pic:blipFill>
-                    <a:blip r:embed="rId7"/>
+                    <a:blip r:embed="rId9"/>
                     <a:stretch>
                       <a:fillRect/>
                     </a:stretch>
@@ -2888,7 +3256,7 @@
       <w:pPr>
         <w:pStyle w:val="Heading1"/>
       </w:pPr>
-      <w:bookmarkStart w:id="7" w:name="_Toc197532746"/>
+      <w:bookmarkStart w:id="7" w:name="_Toc197638780"/>
       <w:r>
         <w:t>Ranged Weapon Implementation</w:t>
       </w:r>
@@ -2898,7 +3266,7 @@
       <w:pPr>
         <w:pStyle w:val="Heading2"/>
       </w:pPr>
-      <w:bookmarkStart w:id="8" w:name="_Toc197532747"/>
+      <w:bookmarkStart w:id="8" w:name="_Toc197638781"/>
       <w:r>
         <w:t>Hitscan</w:t>
       </w:r>
@@ -2948,7 +3316,39 @@
         </w:numPr>
       </w:pPr>
       <w:r>
-        <w:t>The Scheduler queues that bullet by creating a RaycastData struct from the provided information. It also checks if the owning weapon has a tracer prefab and creates one at the start point. The new RaycastData is then added to a 2D array of RaycastData structs and increments the number of expected raycasts on the next simulation step (hereby called Ticks).</w:t>
+        <w:t xml:space="preserve">The Scheduler queues that bullet by creating a </w:t>
+      </w:r>
+      <w:proofErr w:type="spellStart"/>
+      <w:r>
+        <w:t>RaycastData</w:t>
+      </w:r>
+      <w:proofErr w:type="spellEnd"/>
+      <w:r>
+        <w:t xml:space="preserve"> struct from the provided information. It also checks if the owning weapon has a tracer prefab and creates one at the start point. The new </w:t>
+      </w:r>
+      <w:proofErr w:type="spellStart"/>
+      <w:r>
+        <w:t>RaycastData</w:t>
+      </w:r>
+      <w:proofErr w:type="spellEnd"/>
+      <w:r>
+        <w:t xml:space="preserve"> is then added to a 2D array of </w:t>
+      </w:r>
+      <w:proofErr w:type="spellStart"/>
+      <w:r>
+        <w:t>RaycastData</w:t>
+      </w:r>
+      <w:proofErr w:type="spellEnd"/>
+      <w:r>
+        <w:t xml:space="preserve"> structs and increments the number of expected </w:t>
+      </w:r>
+      <w:proofErr w:type="spellStart"/>
+      <w:r>
+        <w:t>raycasts</w:t>
+      </w:r>
+      <w:proofErr w:type="spellEnd"/>
+      <w:r>
+        <w:t xml:space="preserve"> on the next simulation step (hereby called Ticks).</w:t>
       </w:r>
     </w:p>
     <w:p>
@@ -3020,7 +3420,15 @@
         </w:numPr>
       </w:pPr>
       <w:r>
-        <w:t>Calculate the damage dealt based on the distance the projectile has travelled, using BaseWeapon.DamageDealt()</w:t>
+        <w:t xml:space="preserve">Calculate the damage dealt based on the distance the projectile has travelled, using </w:t>
+      </w:r>
+      <w:proofErr w:type="spellStart"/>
+      <w:r>
+        <w:t>BaseWeapon.DamageDealt</w:t>
+      </w:r>
+      <w:proofErr w:type="spellEnd"/>
+      <w:r>
+        <w:t>()</w:t>
       </w:r>
     </w:p>
     <w:p>
@@ -3032,7 +3440,15 @@
         </w:numPr>
       </w:pPr>
       <w:r>
-        <w:t>Create and/or add the damage, hit point and hit force to an existing ColliderHitData (stored in a dictionary using the collider hit as a key).</w:t>
+        <w:t xml:space="preserve">Create and/or add the damage, hit point and hit force to an existing </w:t>
+      </w:r>
+      <w:proofErr w:type="spellStart"/>
+      <w:r>
+        <w:t>ColliderHitData</w:t>
+      </w:r>
+      <w:proofErr w:type="spellEnd"/>
+      <w:r>
+        <w:t xml:space="preserve"> (stored in a dictionary using the collider hit as a key).</w:t>
       </w:r>
     </w:p>
     <w:p>
@@ -3093,7 +3509,15 @@
         </w:numPr>
       </w:pPr>
       <w:r>
-        <w:t>Iterates through each collider that was hit this Tick, checks for a rigidbody and applies forces if one exists, and checks for a damageable and applies damage if one exists on this collider.</w:t>
+        <w:t xml:space="preserve">Iterates through each collider that was hit this Tick, checks for a </w:t>
+      </w:r>
+      <w:proofErr w:type="spellStart"/>
+      <w:r>
+        <w:t>rigidbody</w:t>
+      </w:r>
+      <w:proofErr w:type="spellEnd"/>
+      <w:r>
+        <w:t xml:space="preserve"> and applies forces if one exists, and checks for a damageable and applies damage if one exists on this collider.</w:t>
       </w:r>
     </w:p>
     <w:p>
@@ -3105,14 +3529,22 @@
         </w:numPr>
       </w:pPr>
       <w:r>
-        <w:t>Clears the colliders hit this tick, disposes of the raycast commands and the returned hits (to prevent memory leaks) and prints the time in milliseconds that this process took to complete.</w:t>
+        <w:t xml:space="preserve">Clears the colliders hit this tick, disposes of the </w:t>
+      </w:r>
+      <w:proofErr w:type="spellStart"/>
+      <w:r>
+        <w:t>raycast</w:t>
+      </w:r>
+      <w:proofErr w:type="spellEnd"/>
+      <w:r>
+        <w:t xml:space="preserve"> commands and the returned hits (to prevent memory leaks) and prints the time in milliseconds that this process took to complete.</w:t>
       </w:r>
     </w:p>
     <w:p>
       <w:pPr>
         <w:pStyle w:val="Heading2"/>
       </w:pPr>
-      <w:bookmarkStart w:id="9" w:name="_Toc197532748"/>
+      <w:bookmarkStart w:id="9" w:name="_Toc197638782"/>
       <w:r>
         <w:t>Projectiles</w:t>
       </w:r>
@@ -3123,10 +3555,26 @@
         <w:t>Projectiles are not implemented in the prototype submission, though a shell exists for them to be implemented, with an object pool for them to draw from. All projectiles must have a</w:t>
       </w:r>
       <w:r>
-        <w:t xml:space="preserve"> child of the abstract Base</w:t>
-      </w:r>
-      <w:r>
-        <w:t>Projectile component present on their prefab for a ProjectileWeapon to fire them, due to a part of the object pooling process and as a sensible design choice.</w:t>
+        <w:t xml:space="preserve"> child of the abstract </w:t>
+      </w:r>
+      <w:proofErr w:type="spellStart"/>
+      <w:r>
+        <w:t>Base</w:t>
+      </w:r>
+      <w:r>
+        <w:t>Projectile</w:t>
+      </w:r>
+      <w:proofErr w:type="spellEnd"/>
+      <w:r>
+        <w:t xml:space="preserve"> component present on their prefab for a </w:t>
+      </w:r>
+      <w:proofErr w:type="spellStart"/>
+      <w:r>
+        <w:t>ProjectileWeapon</w:t>
+      </w:r>
+      <w:proofErr w:type="spellEnd"/>
+      <w:r>
+        <w:t xml:space="preserve"> to fire them, due to a part of the object pooling process and as a sensible design choice.</w:t>
       </w:r>
     </w:p>
     <w:p>
@@ -3167,7 +3615,15 @@
         </w:numPr>
       </w:pPr>
       <w:r>
-        <w:t>The projectile’s velocity is then set to its forward direction multiplied by the speed it flies at, and the rigidbody’s Use Gravity field is set if the projectile should use normal gravity.</w:t>
+        <w:t xml:space="preserve">The projectile’s velocity is then set to its forward direction multiplied by the speed it flies at, and the </w:t>
+      </w:r>
+      <w:proofErr w:type="spellStart"/>
+      <w:r>
+        <w:t>rigidbody’s</w:t>
+      </w:r>
+      <w:proofErr w:type="spellEnd"/>
+      <w:r>
+        <w:t xml:space="preserve"> Use Gravity field is set if the projectile should use normal gravity.</w:t>
       </w:r>
     </w:p>
     <w:p>
@@ -3216,7 +3672,7 @@
       <w:pPr>
         <w:pStyle w:val="Heading1"/>
       </w:pPr>
-      <w:bookmarkStart w:id="10" w:name="_Toc197532749"/>
+      <w:bookmarkStart w:id="10" w:name="_Toc197638783"/>
       <w:r>
         <w:t>Melee Weapon Implementation</w:t>
       </w:r>
@@ -3266,7 +3722,7 @@
       <w:pPr>
         <w:pStyle w:val="Heading1"/>
       </w:pPr>
-      <w:bookmarkStart w:id="11" w:name="_Toc197532750"/>
+      <w:bookmarkStart w:id="11" w:name="_Toc197638784"/>
       <w:r>
         <w:t>Damageable Entities</w:t>
       </w:r>
@@ -3274,7 +3730,15 @@
     </w:p>
     <w:p>
       <w:r>
-        <w:t xml:space="preserve">Everything that needs to take damage will either have a Damageable component or one that derives from Damageable. This script is simple; the script handles receiving health events/changes to health, regeneration after a short period of time (if enabled) and has an Immune flag, which prevents negative health events (taking damage) from occurring. This script also supplies a Delegate with a HitEvent parameter, allowing for other scripts </w:t>
+        <w:t xml:space="preserve">Everything that needs to take damage will either have a Damageable component or one that derives from Damageable. This script is simple; the script handles receiving health events/changes to health, regeneration after a short period of time (if enabled) and has an Immune flag, which prevents negative health events (taking damage) from occurring. This script also supplies a Delegate with a </w:t>
+      </w:r>
+      <w:proofErr w:type="spellStart"/>
+      <w:r>
+        <w:t>HitEvent</w:t>
+      </w:r>
+      <w:proofErr w:type="spellEnd"/>
+      <w:r>
+        <w:t xml:space="preserve"> parameter, allowing for other scripts </w:t>
       </w:r>
       <w:r>
         <w:lastRenderedPageBreak/>
@@ -3285,7 +3749,7 @@
       <w:pPr>
         <w:pStyle w:val="Heading1"/>
       </w:pPr>
-      <w:bookmarkStart w:id="12" w:name="_Toc197532751"/>
+      <w:bookmarkStart w:id="12" w:name="_Toc197638785"/>
       <w:r>
         <w:t>Animation</w:t>
       </w:r>
@@ -3295,7 +3759,7 @@
       <w:pPr>
         <w:pStyle w:val="Heading2"/>
       </w:pPr>
-      <w:bookmarkStart w:id="13" w:name="_Toc197532752"/>
+      <w:bookmarkStart w:id="13" w:name="_Toc197638786"/>
       <w:r>
         <w:t>Research</w:t>
       </w:r>
@@ -3305,7 +3769,7 @@
       <w:r>
         <w:t xml:space="preserve">The first-person shooters I play (The Finals &amp; Call of Duty, primarily) are my biggest influences when it comes to animation. I have extensively watched multiple showreels by </w:t>
       </w:r>
-      <w:hyperlink r:id="rId8" w:history="1">
+      <w:hyperlink r:id="rId10" w:history="1">
         <w:r>
           <w:rPr>
             <w:rStyle w:val="Hyperlink"/>
@@ -3319,7 +3783,7 @@
       <w:r>
         <w:t xml:space="preserve">, </w:t>
       </w:r>
-      <w:hyperlink r:id="rId9" w:history="1">
+      <w:hyperlink r:id="rId11" w:history="1">
         <w:r>
           <w:rPr>
             <w:rStyle w:val="Hyperlink"/>
@@ -3336,13 +3800,15 @@
       <w:r>
         <w:t xml:space="preserve">and </w:t>
       </w:r>
-      <w:hyperlink r:id="rId10" w:history="1">
+      <w:hyperlink r:id="rId12" w:history="1">
+        <w:proofErr w:type="spellStart"/>
         <w:r>
           <w:rPr>
             <w:rStyle w:val="Hyperlink"/>
           </w:rPr>
           <w:t>LayzuhCatz</w:t>
         </w:r>
+        <w:proofErr w:type="spellEnd"/>
       </w:hyperlink>
       <w:r>
         <w:t xml:space="preserve"> (Unknown projects)</w:t>
@@ -3379,7 +3845,7 @@
       <w:r>
         <w:t xml:space="preserve">In recent years, the quality and detail of animations has skyrocketed in video games. While I doubt this skill has been magically locked away, since Pixar’s animators were doing some incredible things in the early 2000s, we’ve only really tapped this newer style of animation in the past seven or eight years. Compare these two videos from Activision’s </w:t>
       </w:r>
-      <w:hyperlink r:id="rId11" w:history="1">
+      <w:hyperlink r:id="rId13" w:history="1">
         <w:r>
           <w:rPr>
             <w:rStyle w:val="Hyperlink"/>
@@ -3390,7 +3856,7 @@
       <w:r>
         <w:t xml:space="preserve"> and </w:t>
       </w:r>
-      <w:hyperlink r:id="rId12" w:history="1">
+      <w:hyperlink r:id="rId14" w:history="1">
         <w:r>
           <w:rPr>
             <w:rStyle w:val="Hyperlink"/>
@@ -3466,7 +3932,7 @@
       <w:pPr>
         <w:pStyle w:val="Heading2"/>
       </w:pPr>
-      <w:bookmarkStart w:id="14" w:name="_Toc197532753"/>
+      <w:bookmarkStart w:id="14" w:name="_Toc197638787"/>
       <w:r>
         <w:t>Design</w:t>
       </w:r>
@@ -3476,7 +3942,7 @@
       <w:r>
         <w:t xml:space="preserve">The most important part of animating a character is the rig. Having watched videos on the animation for The Finals, </w:t>
       </w:r>
-      <w:hyperlink r:id="rId13" w:history="1">
+      <w:hyperlink r:id="rId15" w:history="1">
         <w:r>
           <w:rPr>
             <w:rStyle w:val="Hyperlink"/>
@@ -3497,7 +3963,7 @@
       <w:pPr>
         <w:pStyle w:val="Heading3"/>
       </w:pPr>
-      <w:bookmarkStart w:id="15" w:name="_Toc197532754"/>
+      <w:bookmarkStart w:id="15" w:name="_Toc197638788"/>
       <w:r>
         <w:t>Lower Body</w:t>
       </w:r>
@@ -3512,7 +3978,7 @@
       <w:pPr>
         <w:pStyle w:val="Heading3"/>
       </w:pPr>
-      <w:bookmarkStart w:id="16" w:name="_Toc197532755"/>
+      <w:bookmarkStart w:id="16" w:name="_Toc197638789"/>
       <w:r>
         <w:t>Upper Body</w:t>
       </w:r>
@@ -3527,7 +3993,7 @@
       <w:pPr>
         <w:pStyle w:val="Heading3"/>
       </w:pPr>
-      <w:bookmarkStart w:id="17" w:name="_Toc197532756"/>
+      <w:bookmarkStart w:id="17" w:name="_Toc197638790"/>
       <w:r>
         <w:t>Weapon Target</w:t>
       </w:r>
@@ -3547,7 +4013,7 @@
       <w:pPr>
         <w:pStyle w:val="Heading3"/>
       </w:pPr>
-      <w:bookmarkStart w:id="18" w:name="_Toc197532757"/>
+      <w:bookmarkStart w:id="18" w:name="_Toc197638791"/>
       <w:r>
         <w:lastRenderedPageBreak/>
         <w:t>Weapon Rigs</w:t>
@@ -3573,7 +4039,7 @@
       <w:pPr>
         <w:pStyle w:val="Heading2"/>
       </w:pPr>
-      <w:bookmarkStart w:id="19" w:name="_Toc197532758"/>
+      <w:bookmarkStart w:id="19" w:name="_Toc197638792"/>
       <w:r>
         <w:t>Import</w:t>
       </w:r>
@@ -3591,7 +4057,7 @@
       <w:pPr>
         <w:pStyle w:val="Heading3"/>
       </w:pPr>
-      <w:bookmarkStart w:id="20" w:name="_Toc197532759"/>
+      <w:bookmarkStart w:id="20" w:name="_Toc197638793"/>
       <w:r>
         <w:t>Character Animations</w:t>
       </w:r>
@@ -3609,7 +4075,7 @@
       <w:pPr>
         <w:pStyle w:val="Heading3"/>
       </w:pPr>
-      <w:bookmarkStart w:id="21" w:name="_Toc197532760"/>
+      <w:bookmarkStart w:id="21" w:name="_Toc197638794"/>
       <w:r>
         <w:t>Weapon Animations</w:t>
       </w:r>
@@ -3628,7 +4094,7 @@
       <w:pPr>
         <w:pStyle w:val="Heading2"/>
       </w:pPr>
-      <w:bookmarkStart w:id="22" w:name="_Toc197532761"/>
+      <w:bookmarkStart w:id="22" w:name="_Toc197638795"/>
       <w:r>
         <w:t>Implementation</w:t>
       </w:r>
@@ -3643,7 +4109,7 @@
       <w:pPr>
         <w:pStyle w:val="Heading3"/>
       </w:pPr>
-      <w:bookmarkStart w:id="23" w:name="_Toc197532762"/>
+      <w:bookmarkStart w:id="23" w:name="_Toc197638796"/>
       <w:r>
         <w:t>Characters</w:t>
       </w:r>
@@ -3676,7 +4142,7 @@
       <w:pPr>
         <w:pStyle w:val="Heading3"/>
       </w:pPr>
-      <w:bookmarkStart w:id="24" w:name="_Toc197532763"/>
+      <w:bookmarkStart w:id="24" w:name="_Toc197638797"/>
       <w:r>
         <w:t>Weapons</w:t>
       </w:r>
@@ -3687,7 +4153,15 @@
         <w:t xml:space="preserve">Weapons also have a Weapon Animator script, but with some different functionality </w:t>
       </w:r>
       <w:r>
-        <w:t>using the isWeapon flag.</w:t>
+        <w:t xml:space="preserve">using the </w:t>
+      </w:r>
+      <w:proofErr w:type="spellStart"/>
+      <w:r>
+        <w:t>isWeapon</w:t>
+      </w:r>
+      <w:proofErr w:type="spellEnd"/>
+      <w:r>
+        <w:t xml:space="preserve"> flag.</w:t>
       </w:r>
       <w:r>
         <w:t xml:space="preserve"> While characters </w:t>
@@ -3707,7 +4181,7 @@
       <w:pPr>
         <w:pStyle w:val="Heading1"/>
       </w:pPr>
-      <w:bookmarkStart w:id="25" w:name="_Toc197532764"/>
+      <w:bookmarkStart w:id="25" w:name="_Toc197638798"/>
       <w:r>
         <w:t>Character Controller Interoperability</w:t>
       </w:r>
@@ -3715,46 +4189,234 @@
     </w:p>
     <w:p>
       <w:r>
-        <w:t>The project began with a character controller that I had already written.</w:t>
+        <w:t>The project began with a character controller that I had already written</w:t>
+      </w:r>
+      <w:r>
+        <w:t xml:space="preserve">, though several modifications have already been made to this character controller to improve on compatibility. Almost all variables on the </w:t>
+      </w:r>
+      <w:proofErr w:type="spellStart"/>
+      <w:r>
+        <w:t>Rigidbody</w:t>
+      </w:r>
+      <w:proofErr w:type="spellEnd"/>
+      <w:r>
+        <w:t xml:space="preserve"> Player Motor script are internally accessible to allow the </w:t>
+      </w:r>
+      <w:r>
+        <w:t>Player Weapon Controller</w:t>
+      </w:r>
+      <w:r>
+        <w:t xml:space="preserve"> (Inheriting from the Weapon Controller) to read as much information from this script as possible. </w:t>
+      </w:r>
+    </w:p>
+    <w:p>
+      <w:pPr>
+        <w:pStyle w:val="Heading2"/>
+      </w:pPr>
+      <w:bookmarkStart w:id="26" w:name="_Toc197638799"/>
+      <w:r>
+        <w:t>Movement</w:t>
+      </w:r>
+      <w:bookmarkEnd w:id="26"/>
+    </w:p>
+    <w:p>
+      <w:r>
+        <w:t>The RBPM (</w:t>
+      </w:r>
+      <w:proofErr w:type="spellStart"/>
+      <w:r>
+        <w:t>Rigidbody</w:t>
+      </w:r>
+      <w:proofErr w:type="spellEnd"/>
+      <w:r>
+        <w:t xml:space="preserve"> Player Motor) handles all the player’s movement and rotation, while exposing some data on the aim rotation (previous, delta and current rotation) for later use in weapon sway.</w:t>
+      </w:r>
+    </w:p>
+    <w:p>
+      <w:pPr>
+        <w:pStyle w:val="Heading2"/>
+      </w:pPr>
+      <w:bookmarkStart w:id="27" w:name="_Toc197638800"/>
+      <w:r>
+        <w:t>Aiming</w:t>
+      </w:r>
+      <w:bookmarkEnd w:id="27"/>
+    </w:p>
+    <w:p>
+      <w:r>
+        <w:t xml:space="preserve">While holding down right click or left trigger (usual first-person shooter controls for aiming), the player’s view zooms in on both the </w:t>
+      </w:r>
+      <w:proofErr w:type="spellStart"/>
+      <w:r>
+        <w:t>viewmodel</w:t>
+      </w:r>
+      <w:proofErr w:type="spellEnd"/>
+      <w:r>
+        <w:t xml:space="preserve"> and </w:t>
+      </w:r>
+      <w:proofErr w:type="spellStart"/>
+      <w:r>
+        <w:t>worldmodel</w:t>
+      </w:r>
+      <w:proofErr w:type="spellEnd"/>
+      <w:r>
+        <w:t xml:space="preserve"> (more on this in the next section). Initially, the RBPM handled this aiming, until I realised the Player Weapon Controller needed to perform the aiming calculations, so it could pull information from the weapon. </w:t>
+      </w:r>
+    </w:p>
+    <w:p>
+      <w:pPr>
+        <w:pStyle w:val="Heading2"/>
+      </w:pPr>
+      <w:bookmarkStart w:id="28" w:name="_Toc197638801"/>
+      <w:r>
+        <w:t>Crouching</w:t>
+      </w:r>
+      <w:bookmarkEnd w:id="28"/>
+    </w:p>
+    <w:p>
+      <w:r>
+        <w:t xml:space="preserve">Crouching is handled by the </w:t>
+      </w:r>
+      <w:proofErr w:type="gramStart"/>
+      <w:r>
+        <w:t>RBPM</w:t>
+      </w:r>
+      <w:proofErr w:type="gramEnd"/>
+      <w:r>
+        <w:t xml:space="preserve"> and the Player Weapon Controller reads a variable called Current Crouch Lerp to influence ranged weapons’ spread factor while not aiming.</w:t>
       </w:r>
     </w:p>
     <w:p>
       <w:pPr>
         <w:pStyle w:val="Heading1"/>
       </w:pPr>
-      <w:bookmarkStart w:id="26" w:name="_Toc197532765"/>
-      <w:r>
+      <w:bookmarkStart w:id="29" w:name="_Toc197638802"/>
+      <w:r>
+        <w:lastRenderedPageBreak/>
         <w:t>Rendering Wizardry</w:t>
       </w:r>
-      <w:bookmarkEnd w:id="26"/>
+      <w:bookmarkEnd w:id="29"/>
+    </w:p>
+    <w:p>
+      <w:r>
+        <w:t xml:space="preserve">To achieve a </w:t>
+      </w:r>
+      <w:proofErr w:type="spellStart"/>
+      <w:r>
+        <w:t>viewmodel</w:t>
+      </w:r>
+      <w:proofErr w:type="spellEnd"/>
+      <w:r>
+        <w:t>/</w:t>
+      </w:r>
+      <w:proofErr w:type="spellStart"/>
+      <w:r>
+        <w:t>worldmodel</w:t>
+      </w:r>
+      <w:proofErr w:type="spellEnd"/>
+      <w:r>
+        <w:t xml:space="preserve"> setup in this project, I make heavy use of features specific to Unity’s Universal Render Pipeline: Render Features and Camera Stacking. </w:t>
+      </w:r>
     </w:p>
     <w:p>
       <w:pPr>
         <w:pStyle w:val="Heading2"/>
       </w:pPr>
-      <w:bookmarkStart w:id="27" w:name="_Toc197532766"/>
-      <w:r>
-        <w:t>Camera</w:t>
-      </w:r>
-      <w:r>
-        <w:t>s</w:t>
-      </w:r>
-      <w:bookmarkEnd w:id="27"/>
-    </w:p>
-    <w:p>
-      <w:pPr>
-        <w:pStyle w:val="Heading2"/>
-      </w:pPr>
-      <w:bookmarkStart w:id="28" w:name="_Toc197532767"/>
-      <w:r>
-        <w:t>Shader</w:t>
-      </w:r>
-      <w:r>
-        <w:t>s</w:t>
-      </w:r>
-      <w:bookmarkEnd w:id="28"/>
+      <w:bookmarkStart w:id="30" w:name="_Toc197638803"/>
+      <w:r>
+        <w:t>URP Features</w:t>
+      </w:r>
+      <w:bookmarkEnd w:id="30"/>
+    </w:p>
+    <w:p>
+      <w:r>
+        <w:t xml:space="preserve">As an unfortunate result of the project’s setup, it is only compatible with Unity’s URP (universal render pipeline). While there’s no specific setup that forces the use of the URP, it would require modification (or at least hacky workarounds with rendering) to achieve </w:t>
+      </w:r>
+      <w:r>
+        <w:t>a similar result.</w:t>
+      </w:r>
+    </w:p>
+    <w:p>
+      <w:pPr>
+        <w:pStyle w:val="Heading3"/>
+      </w:pPr>
+      <w:bookmarkStart w:id="31" w:name="_Toc197638804"/>
+      <w:r>
+        <w:t>Render Features</w:t>
+      </w:r>
+      <w:bookmarkEnd w:id="31"/>
+    </w:p>
+    <w:p>
+      <w:r>
+        <w:t>Render Features are additional things that can be added to a Renderer in Unity’s URP, ranging from Screen Space Ambient Occlusion to modifying the final render. This project makes use of the Render Objects feature</w:t>
+      </w:r>
+      <w:r>
+        <w:t xml:space="preserve"> which renders opaques separately on the transparent queue to force them to only render shadows. Two of these are used, one of each of the two separate Renderers. The </w:t>
+      </w:r>
+      <w:proofErr w:type="spellStart"/>
+      <w:r>
+        <w:t>viewmodel</w:t>
+      </w:r>
+      <w:proofErr w:type="spellEnd"/>
+      <w:r>
+        <w:t xml:space="preserve"> camera renders the world shadow-only and the world camera renders the </w:t>
+      </w:r>
+      <w:proofErr w:type="spellStart"/>
+      <w:r>
+        <w:t>viewmodel</w:t>
+      </w:r>
+      <w:proofErr w:type="spellEnd"/>
+      <w:r>
+        <w:t xml:space="preserve"> as shadow only. </w:t>
+      </w:r>
+    </w:p>
+    <w:p>
+      <w:r>
+        <w:t>Additionally, there is a Fullscreen Shader Pass material created via the Shader Graph, which functions as an expanded post processing shader, used for altering the screen (mostly by altering viewport UVs) when the player is low on health.</w:t>
+      </w:r>
+    </w:p>
+    <w:p>
+      <w:pPr>
+        <w:pStyle w:val="Heading3"/>
+      </w:pPr>
+      <w:bookmarkStart w:id="32" w:name="_Toc197638805"/>
+      <w:r>
+        <w:t>Camera Stacking</w:t>
+      </w:r>
+      <w:bookmarkEnd w:id="32"/>
+    </w:p>
+    <w:p>
+      <w:r>
+        <w:t>Camera Stacking is a feature only available in the URP’s Forward and Forward+ path, the only difference of which is per-object light limits not being present in Forward+. It overlays multiple cameras, rendering them directly on top of each other. Unity performs several optimisations (that they neglect to mention in the documentation) to reduce overdraw. This allows the setup to maintain a similar frame rate to a single-camera render setup.</w:t>
+      </w:r>
+    </w:p>
+    <w:p>
+      <w:r>
+        <w:t xml:space="preserve">Camera Stacking allows independent FOV between the world and </w:t>
+      </w:r>
+      <w:proofErr w:type="spellStart"/>
+      <w:r>
+        <w:t>viewmodel</w:t>
+      </w:r>
+      <w:proofErr w:type="spellEnd"/>
+      <w:r>
+        <w:t xml:space="preserve"> to create the typical FPS view, whilst also rendering the </w:t>
+      </w:r>
+      <w:proofErr w:type="spellStart"/>
+      <w:r>
+        <w:t>viewmodel</w:t>
+      </w:r>
+      <w:proofErr w:type="spellEnd"/>
+      <w:r>
+        <w:t xml:space="preserve"> in front of everything else in the world. </w:t>
+      </w:r>
+      <w:r>
+        <w:t xml:space="preserve">The Player Weapon Controller changes the FOV of both cameras independently when aiming a ranged weapon. This introduces another issue, in that some objects cannot be rendered in the world in the editor and can make debugging or animating a little more difficult. </w:t>
+      </w:r>
     </w:p>
     <w:sectPr>
+      <w:headerReference w:type="default" r:id="rId16"/>
+      <w:footerReference w:type="default" r:id="rId17"/>
       <w:pgSz w:w="11906" w:h="16838"/>
       <w:pgMar w:top="1440" w:right="1440" w:bottom="1440" w:left="1440" w:header="708" w:footer="708" w:gutter="0"/>
       <w:pgNumType w:start="0"/>
@@ -3764,6 +4426,226 @@
     </w:sectPr>
   </w:body>
 </w:document>
+</file>
+
+<file path=word/endnotes.xml><?xml version="1.0" encoding="utf-8"?>
+<w:endnotes xmlns:wpc="http://schemas.microsoft.com/office/word/2010/wordprocessingCanvas" xmlns:cx="http://schemas.microsoft.com/office/drawing/2014/chartex" xmlns:cx1="http://schemas.microsoft.com/office/drawing/2015/9/8/chartex" xmlns:cx2="http://schemas.microsoft.com/office/drawing/2015/10/21/chartex" xmlns:cx3="http://schemas.microsoft.com/office/drawing/2016/5/9/chartex" xmlns:cx4="http://schemas.microsoft.com/office/drawing/2016/5/10/chartex" xmlns:cx5="http://schemas.microsoft.com/office/drawing/2016/5/11/chartex" xmlns:cx6="http://schemas.microsoft.com/office/drawing/2016/5/12/chartex" xmlns:cx7="http://schemas.microsoft.com/office/drawing/2016/5/13/chartex" xmlns:cx8="http://schemas.microsoft.com/office/drawing/2016/5/14/chartex" xmlns:mc="http://schemas.openxmlformats.org/markup-compatibility/2006" xmlns:aink="http://schemas.microsoft.com/office/drawing/2016/ink" xmlns:am3d="http://schemas.microsoft.com/office/drawing/2017/model3d" xmlns:o="urn:schemas-microsoft-com:office:office" xmlns:oel="http://schemas.microsoft.com/office/2019/extlst" xmlns:r="http://schemas.openxmlformats.org/officeDocument/2006/relationships" xmlns:m="http://schemas.openxmlformats.org/officeDocument/2006/math" xmlns:v="urn:schemas-microsoft-com:vml" xmlns:wp14="http://schemas.microsoft.com/office/word/2010/wordprocessingDrawing" xmlns:wp="http://schemas.openxmlformats.org/drawingml/2006/wordprocessingDrawing" xmlns:w10="urn:schemas-microsoft-com:office:word" xmlns:w="http://schemas.openxmlformats.org/wordprocessingml/2006/main" xmlns:w14="http://schemas.microsoft.com/office/word/2010/wordml" xmlns:w15="http://schemas.microsoft.com/office/word/2012/wordml" xmlns:w16cex="http://schemas.microsoft.com/office/word/2018/wordml/cex" xmlns:w16cid="http://schemas.microsoft.com/office/word/2016/wordml/cid" xmlns:w16="http://schemas.microsoft.com/office/word/2018/wordml" xmlns:w16du="http://schemas.microsoft.com/office/word/2023/wordml/word16du" xmlns:w16sdtdh="http://schemas.microsoft.com/office/word/2020/wordml/sdtdatahash" xmlns:w16sdtfl="http://schemas.microsoft.com/office/word/2024/wordml/sdtformatlock" xmlns:w16se="http://schemas.microsoft.com/office/word/2015/wordml/symex" xmlns:wpg="http://schemas.microsoft.com/office/word/2010/wordprocessingGroup" xmlns:wpi="http://schemas.microsoft.com/office/word/2010/wordprocessingInk" xmlns:wne="http://schemas.microsoft.com/office/word/2006/wordml" xmlns:wps="http://schemas.microsoft.com/office/word/2010/wordprocessingShape" mc:Ignorable="w14 w15 w16se w16cid w16 w16cex w16sdtdh w16sdtfl w16du wp14">
+  <w:endnote w:type="separator" w:id="-1">
+    <w:p>
+      <w:pPr>
+        <w:spacing w:after="0" w:line="240" w:lineRule="auto"/>
+      </w:pPr>
+      <w:r>
+        <w:separator/>
+      </w:r>
+    </w:p>
+  </w:endnote>
+  <w:endnote w:type="continuationSeparator" w:id="0">
+    <w:p>
+      <w:pPr>
+        <w:spacing w:after="0" w:line="240" w:lineRule="auto"/>
+      </w:pPr>
+      <w:r>
+        <w:continuationSeparator/>
+      </w:r>
+    </w:p>
+  </w:endnote>
+</w:endnotes>
+</file>
+
+<file path=word/footer1.xml><?xml version="1.0" encoding="utf-8"?>
+<w:ftr xmlns:wpc="http://schemas.microsoft.com/office/word/2010/wordprocessingCanvas" xmlns:cx="http://schemas.microsoft.com/office/drawing/2014/chartex" xmlns:cx1="http://schemas.microsoft.com/office/drawing/2015/9/8/chartex" xmlns:cx2="http://schemas.microsoft.com/office/drawing/2015/10/21/chartex" xmlns:cx3="http://schemas.microsoft.com/office/drawing/2016/5/9/chartex" xmlns:cx4="http://schemas.microsoft.com/office/drawing/2016/5/10/chartex" xmlns:cx5="http://schemas.microsoft.com/office/drawing/2016/5/11/chartex" xmlns:cx6="http://schemas.microsoft.com/office/drawing/2016/5/12/chartex" xmlns:cx7="http://schemas.microsoft.com/office/drawing/2016/5/13/chartex" xmlns:cx8="http://schemas.microsoft.com/office/drawing/2016/5/14/chartex" xmlns:mc="http://schemas.openxmlformats.org/markup-compatibility/2006" xmlns:aink="http://schemas.microsoft.com/office/drawing/2016/ink" xmlns:am3d="http://schemas.microsoft.com/office/drawing/2017/model3d" xmlns:o="urn:schemas-microsoft-com:office:office" xmlns:oel="http://schemas.microsoft.com/office/2019/extlst" xmlns:r="http://schemas.openxmlformats.org/officeDocument/2006/relationships" xmlns:m="http://schemas.openxmlformats.org/officeDocument/2006/math" xmlns:v="urn:schemas-microsoft-com:vml" xmlns:wp14="http://schemas.microsoft.com/office/word/2010/wordprocessingDrawing" xmlns:wp="http://schemas.openxmlformats.org/drawingml/2006/wordprocessingDrawing" xmlns:w10="urn:schemas-microsoft-com:office:word" xmlns:w="http://schemas.openxmlformats.org/wordprocessingml/2006/main" xmlns:w14="http://schemas.microsoft.com/office/word/2010/wordml" xmlns:w15="http://schemas.microsoft.com/office/word/2012/wordml" xmlns:w16cex="http://schemas.microsoft.com/office/word/2018/wordml/cex" xmlns:w16cid="http://schemas.microsoft.com/office/word/2016/wordml/cid" xmlns:w16="http://schemas.microsoft.com/office/word/2018/wordml" xmlns:w16du="http://schemas.microsoft.com/office/word/2023/wordml/word16du" xmlns:w16sdtdh="http://schemas.microsoft.com/office/word/2020/wordml/sdtdatahash" xmlns:w16sdtfl="http://schemas.microsoft.com/office/word/2024/wordml/sdtformatlock" xmlns:w16se="http://schemas.microsoft.com/office/word/2015/wordml/symex" xmlns:wpg="http://schemas.microsoft.com/office/word/2010/wordprocessingGroup" xmlns:wpi="http://schemas.microsoft.com/office/word/2010/wordprocessingInk" xmlns:wne="http://schemas.microsoft.com/office/word/2006/wordml" xmlns:wps="http://schemas.microsoft.com/office/word/2010/wordprocessingShape" mc:Ignorable="w14 w15 w16se w16cid w16 w16cex w16sdtdh w16sdtfl w16du wp14">
+  <w:p>
+    <w:pPr>
+      <w:pStyle w:val="Footer"/>
+    </w:pPr>
+    <w:r>
+      <w:rPr>
+        <w:noProof/>
+      </w:rPr>
+      <mc:AlternateContent>
+        <mc:Choice Requires="wps">
+          <w:drawing>
+            <wp:anchor distT="0" distB="0" distL="114300" distR="114300" simplePos="0" relativeHeight="251659264" behindDoc="0" locked="0" layoutInCell="0" allowOverlap="1" wp14:anchorId="6C756C1E" wp14:editId="3809AAA0">
+              <wp:simplePos x="0" y="0"/>
+              <wp:positionH relativeFrom="page">
+                <wp:posOffset>6368902</wp:posOffset>
+              </wp:positionH>
+              <wp:positionV relativeFrom="bottomMargin">
+                <wp:align>top</wp:align>
+              </wp:positionV>
+              <wp:extent cx="819150" cy="433705"/>
+              <wp:effectExtent l="0" t="0" r="0" b="0"/>
+              <wp:wrapNone/>
+              <wp:docPr id="1340062326" name="Rectangle 3"/>
+              <wp:cNvGraphicFramePr>
+                <a:graphicFrameLocks xmlns:a="http://schemas.openxmlformats.org/drawingml/2006/main"/>
+              </wp:cNvGraphicFramePr>
+              <a:graphic xmlns:a="http://schemas.openxmlformats.org/drawingml/2006/main">
+                <a:graphicData uri="http://schemas.microsoft.com/office/word/2010/wordprocessingShape">
+                  <wps:wsp>
+                    <wps:cNvSpPr>
+                      <a:spLocks noChangeArrowheads="1"/>
+                    </wps:cNvSpPr>
+                    <wps:spPr bwMode="auto">
+                      <a:xfrm>
+                        <a:off x="0" y="0"/>
+                        <a:ext cx="819150" cy="433705"/>
+                      </a:xfrm>
+                      <a:prstGeom prst="rect">
+                        <a:avLst/>
+                      </a:prstGeom>
+                      <a:solidFill>
+                        <a:srgbClr val="FFFFFF"/>
+                      </a:solidFill>
+                      <a:ln>
+                        <a:noFill/>
+                      </a:ln>
+                      <a:extLst>
+                        <a:ext uri="{91240B29-F687-4F45-9708-019B960494DF}">
+                          <a14:hiddenLine xmlns:a14="http://schemas.microsoft.com/office/drawing/2010/main" w="9525">
+                            <a:solidFill>
+                              <a:srgbClr val="000000"/>
+                            </a:solidFill>
+                            <a:miter lim="800000"/>
+                            <a:headEnd/>
+                            <a:tailEnd/>
+                          </a14:hiddenLine>
+                        </a:ext>
+                      </a:extLst>
+                    </wps:spPr>
+                    <wps:txbx>
+                      <w:txbxContent>
+                        <w:p>
+                          <w:pPr>
+                            <w:pBdr>
+                              <w:top w:val="single" w:sz="4" w:space="1" w:color="D8D8D8" w:themeColor="background1" w:themeShade="D8"/>
+                            </w:pBdr>
+                            <w:jc w:val="right"/>
+                          </w:pPr>
+                          <w:r>
+                            <w:t xml:space="preserve">Page | </w:t>
+                          </w:r>
+                          <w:r>
+                            <w:fldChar w:fldCharType="begin"/>
+                          </w:r>
+                          <w:r>
+                            <w:instrText>PAGE   \* MERGEFORMAT</w:instrText>
+                          </w:r>
+                          <w:r>
+                            <w:fldChar w:fldCharType="separate"/>
+                          </w:r>
+                          <w:r>
+                            <w:t>2</w:t>
+                          </w:r>
+                          <w:r>
+                            <w:fldChar w:fldCharType="end"/>
+                          </w:r>
+                        </w:p>
+                      </w:txbxContent>
+                    </wps:txbx>
+                    <wps:bodyPr rot="0" vert="horz" wrap="square" lIns="0" tIns="45720" rIns="0" bIns="45720" anchor="t" anchorCtr="0" upright="1">
+                      <a:spAutoFit/>
+                    </wps:bodyPr>
+                  </wps:wsp>
+                </a:graphicData>
+              </a:graphic>
+              <wp14:sizeRelH relativeFrom="leftMargin">
+                <wp14:pctWidth>90000</wp14:pctWidth>
+              </wp14:sizeRelH>
+              <wp14:sizeRelV relativeFrom="page">
+                <wp14:pctHeight>0</wp14:pctHeight>
+              </wp14:sizeRelV>
+            </wp:anchor>
+          </w:drawing>
+        </mc:Choice>
+        <mc:Fallback>
+          <w:pict>
+            <v:rect w14:anchorId="6C756C1E" id="Rectangle 3" o:spid="_x0000_s1028" style="position:absolute;margin-left:501.5pt;margin-top:0;width:64.5pt;height:34.15pt;z-index:251659264;visibility:visible;mso-wrap-style:square;mso-width-percent:900;mso-height-percent:0;mso-wrap-distance-left:9pt;mso-wrap-distance-top:0;mso-wrap-distance-right:9pt;mso-wrap-distance-bottom:0;mso-position-horizontal:absolute;mso-position-horizontal-relative:page;mso-position-vertical:top;mso-position-vertical-relative:bottom-margin-area;mso-width-percent:900;mso-height-percent:0;mso-width-relative:left-margin-area;mso-height-relative:page;v-text-anchor:top" o:gfxdata="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" o:allowincell="f" stroked="f">
+              <v:textbox style="mso-fit-shape-to-text:t" inset="0,,0">
+                <w:txbxContent>
+                  <w:p>
+                    <w:pPr>
+                      <w:pBdr>
+                        <w:top w:val="single" w:sz="4" w:space="1" w:color="D8D8D8" w:themeColor="background1" w:themeShade="D8"/>
+                      </w:pBdr>
+                      <w:jc w:val="right"/>
+                    </w:pPr>
+                    <w:r>
+                      <w:t xml:space="preserve">Page | </w:t>
+                    </w:r>
+                    <w:r>
+                      <w:fldChar w:fldCharType="begin"/>
+                    </w:r>
+                    <w:r>
+                      <w:instrText>PAGE   \* MERGEFORMAT</w:instrText>
+                    </w:r>
+                    <w:r>
+                      <w:fldChar w:fldCharType="separate"/>
+                    </w:r>
+                    <w:r>
+                      <w:t>2</w:t>
+                    </w:r>
+                    <w:r>
+                      <w:fldChar w:fldCharType="end"/>
+                    </w:r>
+                  </w:p>
+                </w:txbxContent>
+              </v:textbox>
+              <w10:wrap anchorx="page" anchory="margin"/>
+            </v:rect>
+          </w:pict>
+        </mc:Fallback>
+      </mc:AlternateContent>
+    </w:r>
+  </w:p>
+</w:ftr>
+</file>
+
+<file path=word/footnotes.xml><?xml version="1.0" encoding="utf-8"?>
+<w:footnotes xmlns:wpc="http://schemas.microsoft.com/office/word/2010/wordprocessingCanvas" xmlns:cx="http://schemas.microsoft.com/office/drawing/2014/chartex" xmlns:cx1="http://schemas.microsoft.com/office/drawing/2015/9/8/chartex" xmlns:cx2="http://schemas.microsoft.com/office/drawing/2015/10/21/chartex" xmlns:cx3="http://schemas.microsoft.com/office/drawing/2016/5/9/chartex" xmlns:cx4="http://schemas.microsoft.com/office/drawing/2016/5/10/chartex" xmlns:cx5="http://schemas.microsoft.com/office/drawing/2016/5/11/chartex" xmlns:cx6="http://schemas.microsoft.com/office/drawing/2016/5/12/chartex" xmlns:cx7="http://schemas.microsoft.com/office/drawing/2016/5/13/chartex" xmlns:cx8="http://schemas.microsoft.com/office/drawing/2016/5/14/chartex" xmlns:mc="http://schemas.openxmlformats.org/markup-compatibility/2006" xmlns:aink="http://schemas.microsoft.com/office/drawing/2016/ink" xmlns:am3d="http://schemas.microsoft.com/office/drawing/2017/model3d" xmlns:o="urn:schemas-microsoft-com:office:office" xmlns:oel="http://schemas.microsoft.com/office/2019/extlst" xmlns:r="http://schemas.openxmlformats.org/officeDocument/2006/relationships" xmlns:m="http://schemas.openxmlformats.org/officeDocument/2006/math" xmlns:v="urn:schemas-microsoft-com:vml" xmlns:wp14="http://schemas.microsoft.com/office/word/2010/wordprocessingDrawing" xmlns:wp="http://schemas.openxmlformats.org/drawingml/2006/wordprocessingDrawing" xmlns:w10="urn:schemas-microsoft-com:office:word" xmlns:w="http://schemas.openxmlformats.org/wordprocessingml/2006/main" xmlns:w14="http://schemas.microsoft.com/office/word/2010/wordml" xmlns:w15="http://schemas.microsoft.com/office/word/2012/wordml" xmlns:w16cex="http://schemas.microsoft.com/office/word/2018/wordml/cex" xmlns:w16cid="http://schemas.microsoft.com/office/word/2016/wordml/cid" xmlns:w16="http://schemas.microsoft.com/office/word/2018/wordml" xmlns:w16du="http://schemas.microsoft.com/office/word/2023/wordml/word16du" xmlns:w16sdtdh="http://schemas.microsoft.com/office/word/2020/wordml/sdtdatahash" xmlns:w16sdtfl="http://schemas.microsoft.com/office/word/2024/wordml/sdtformatlock" xmlns:w16se="http://schemas.microsoft.com/office/word/2015/wordml/symex" xmlns:wpg="http://schemas.microsoft.com/office/word/2010/wordprocessingGroup" xmlns:wpi="http://schemas.microsoft.com/office/word/2010/wordprocessingInk" xmlns:wne="http://schemas.microsoft.com/office/word/2006/wordml" xmlns:wps="http://schemas.microsoft.com/office/word/2010/wordprocessingShape" mc:Ignorable="w14 w15 w16se w16cid w16 w16cex w16sdtdh w16sdtfl w16du wp14">
+  <w:footnote w:type="separator" w:id="-1">
+    <w:p>
+      <w:pPr>
+        <w:spacing w:after="0" w:line="240" w:lineRule="auto"/>
+      </w:pPr>
+      <w:r>
+        <w:separator/>
+      </w:r>
+    </w:p>
+  </w:footnote>
+  <w:footnote w:type="continuationSeparator" w:id="0">
+    <w:p>
+      <w:pPr>
+        <w:spacing w:after="0" w:line="240" w:lineRule="auto"/>
+      </w:pPr>
+      <w:r>
+        <w:continuationSeparator/>
+      </w:r>
+    </w:p>
+  </w:footnote>
+</w:footnotes>
+</file>
+
+<file path=word/header1.xml><?xml version="1.0" encoding="utf-8"?>
+<w:hdr xmlns:wpc="http://schemas.microsoft.com/office/word/2010/wordprocessingCanvas" xmlns:cx="http://schemas.microsoft.com/office/drawing/2014/chartex" xmlns:cx1="http://schemas.microsoft.com/office/drawing/2015/9/8/chartex" xmlns:cx2="http://schemas.microsoft.com/office/drawing/2015/10/21/chartex" xmlns:cx3="http://schemas.microsoft.com/office/drawing/2016/5/9/chartex" xmlns:cx4="http://schemas.microsoft.com/office/drawing/2016/5/10/chartex" xmlns:cx5="http://schemas.microsoft.com/office/drawing/2016/5/11/chartex" xmlns:cx6="http://schemas.microsoft.com/office/drawing/2016/5/12/chartex" xmlns:cx7="http://schemas.microsoft.com/office/drawing/2016/5/13/chartex" xmlns:cx8="http://schemas.microsoft.com/office/drawing/2016/5/14/chartex" xmlns:mc="http://schemas.openxmlformats.org/markup-compatibility/2006" xmlns:aink="http://schemas.microsoft.com/office/drawing/2016/ink" xmlns:am3d="http://schemas.microsoft.com/office/drawing/2017/model3d" xmlns:o="urn:schemas-microsoft-com:office:office" xmlns:oel="http://schemas.microsoft.com/office/2019/extlst" xmlns:r="http://schemas.openxmlformats.org/officeDocument/2006/relationships" xmlns:m="http://schemas.openxmlformats.org/officeDocument/2006/math" xmlns:v="urn:schemas-microsoft-com:vml" xmlns:wp14="http://schemas.microsoft.com/office/word/2010/wordprocessingDrawing" xmlns:wp="http://schemas.openxmlformats.org/drawingml/2006/wordprocessingDrawing" xmlns:w10="urn:schemas-microsoft-com:office:word" xmlns:w="http://schemas.openxmlformats.org/wordprocessingml/2006/main" xmlns:w14="http://schemas.microsoft.com/office/word/2010/wordml" xmlns:w15="http://schemas.microsoft.com/office/word/2012/wordml" xmlns:w16cex="http://schemas.microsoft.com/office/word/2018/wordml/cex" xmlns:w16cid="http://schemas.microsoft.com/office/word/2016/wordml/cid" xmlns:w16="http://schemas.microsoft.com/office/word/2018/wordml" xmlns:w16du="http://schemas.microsoft.com/office/word/2023/wordml/word16du" xmlns:w16sdtdh="http://schemas.microsoft.com/office/word/2020/wordml/sdtdatahash" xmlns:w16sdtfl="http://schemas.microsoft.com/office/word/2024/wordml/sdtformatlock" xmlns:w16se="http://schemas.microsoft.com/office/word/2015/wordml/symex" xmlns:wpg="http://schemas.microsoft.com/office/word/2010/wordprocessingGroup" xmlns:wpi="http://schemas.microsoft.com/office/word/2010/wordprocessingInk" xmlns:wne="http://schemas.microsoft.com/office/word/2006/wordml" xmlns:wps="http://schemas.microsoft.com/office/word/2010/wordprocessingShape" mc:Ignorable="w14 w15 w16se w16cid w16 w16cex w16sdtdh w16sdtfl w16du wp14">
+  <w:sdt>
+    <w:sdtPr>
+      <w:id w:val="1227265013"/>
+      <w:docPartObj>
+        <w:docPartGallery w:val="Page Numbers (Margins)"/>
+        <w:docPartUnique/>
+      </w:docPartObj>
+    </w:sdtPr>
+    <w:sdtContent>
+      <w:p>
+        <w:pPr>
+          <w:pStyle w:val="Header"/>
+        </w:pPr>
+      </w:p>
+    </w:sdtContent>
+  </w:sdt>
+</w:hdr>
 </file>
 
 <file path=word/numbering.xml><?xml version="1.0" encoding="utf-8"?>
@@ -5322,6 +6204,50 @@
       <w:shd w:val="clear" w:color="auto" w:fill="E1DFDD"/>
     </w:rPr>
   </w:style>
+  <w:style w:type="paragraph" w:styleId="Header">
+    <w:name w:val="header"/>
+    <w:basedOn w:val="Normal"/>
+    <w:link w:val="HeaderChar"/>
+    <w:uiPriority w:val="99"/>
+    <w:unhideWhenUsed/>
+    <w:rsid w:val="00965D8E"/>
+    <w:pPr>
+      <w:tabs>
+        <w:tab w:val="center" w:pos="4513"/>
+        <w:tab w:val="right" w:pos="9026"/>
+      </w:tabs>
+      <w:spacing w:after="0" w:line="240" w:lineRule="auto"/>
+    </w:pPr>
+  </w:style>
+  <w:style w:type="character" w:customStyle="1" w:styleId="HeaderChar">
+    <w:name w:val="Header Char"/>
+    <w:basedOn w:val="DefaultParagraphFont"/>
+    <w:link w:val="Header"/>
+    <w:uiPriority w:val="99"/>
+    <w:rsid w:val="00965D8E"/>
+  </w:style>
+  <w:style w:type="paragraph" w:styleId="Footer">
+    <w:name w:val="footer"/>
+    <w:basedOn w:val="Normal"/>
+    <w:link w:val="FooterChar"/>
+    <w:uiPriority w:val="99"/>
+    <w:unhideWhenUsed/>
+    <w:rsid w:val="00965D8E"/>
+    <w:pPr>
+      <w:tabs>
+        <w:tab w:val="center" w:pos="4513"/>
+        <w:tab w:val="right" w:pos="9026"/>
+      </w:tabs>
+      <w:spacing w:after="0" w:line="240" w:lineRule="auto"/>
+    </w:pPr>
+  </w:style>
+  <w:style w:type="character" w:customStyle="1" w:styleId="FooterChar">
+    <w:name w:val="Footer Char"/>
+    <w:basedOn w:val="DefaultParagraphFont"/>
+    <w:link w:val="Footer"/>
+    <w:uiPriority w:val="99"/>
+    <w:rsid w:val="00965D8E"/>
+  </w:style>
 </w:styles>
 </file>
 

</xml_diff>

<commit_message>
Tidied project + minor fixes. new test scene.
</commit_message>
<xml_diff>
--- a/DesignDocument.docx
+++ b/DesignDocument.docx
@@ -4,20 +4,18 @@
   <w:body>
     <w:sdt>
       <w:sdtPr>
+        <w:rPr>
+          <w:rFonts w:asciiTheme="majorHAnsi" w:eastAsiaTheme="majorEastAsia" w:hAnsiTheme="majorHAnsi" w:cstheme="majorBidi"/>
+          <w:color w:val="0F4761" w:themeColor="accent1" w:themeShade="BF"/>
+          <w:sz w:val="40"/>
+          <w:szCs w:val="40"/>
+        </w:rPr>
         <w:id w:val="1710760764"/>
         <w:docPartObj>
           <w:docPartGallery w:val="Cover Pages"/>
           <w:docPartUnique/>
         </w:docPartObj>
       </w:sdtPr>
-      <w:sdtEndPr>
-        <w:rPr>
-          <w:rFonts w:asciiTheme="majorHAnsi" w:eastAsiaTheme="majorEastAsia" w:hAnsiTheme="majorHAnsi" w:cstheme="majorBidi"/>
-          <w:color w:val="0F4761" w:themeColor="accent1" w:themeShade="BF"/>
-          <w:sz w:val="40"/>
-          <w:szCs w:val="40"/>
-        </w:rPr>
-      </w:sdtEndPr>
       <w:sdtContent>
         <w:p/>
         <w:p>
@@ -4040,15 +4038,7 @@
         <w:t xml:space="preserve">Unfortunately, the old framework is incomplete due to the overhaul, though it is still functional. Weapons were split into two types: Projectile and Hitscan, </w:t>
       </w:r>
       <w:r>
-        <w:t xml:space="preserve">with both of those explained further in the document. The differing setups in the weapons created a sense of imbalance in me – Hitscan weapons were almost certainly the better choice in gameplay, as they could hit a target at any distance immediately. Projectile weapons were simulated via </w:t>
-      </w:r>
-      <w:proofErr w:type="spellStart"/>
-      <w:r>
-        <w:t>Rigidbodies</w:t>
-      </w:r>
-      <w:proofErr w:type="spellEnd"/>
-      <w:r>
-        <w:t>, which also introduced extra overhead into the system due to their simulation.</w:t>
+        <w:t>with both of those explained further in the document. The differing setups in the weapons created a sense of imbalance in me – Hitscan weapons were almost certainly the better choice in gameplay, as they could hit a target at any distance immediately. Projectile weapons were simulated via Rigidbodies, which also introduced extra overhead into the system due to their simulation.</w:t>
       </w:r>
     </w:p>
     <w:p>
@@ -4088,47 +4078,16 @@
     </w:p>
     <w:p>
       <w:r>
-        <w:t xml:space="preserve">The first-person shooters I play (The Finals &amp; Call of Duty, primarily) are my biggest influences when it comes to animation. I have extensively watched multiple showreels by </w:t>
-      </w:r>
-      <w:r>
-        <w:t xml:space="preserve">Khoa Le </w:t>
+        <w:t xml:space="preserve">The first-person shooters I play (The Finals &amp; Call of Duty, primarily) are my biggest influences when it comes to animation. I have extensively watched multiple showreels by Khoa Le (viewmodel animator on COD Modern Warfare 2019), </w:t>
+      </w:r>
+      <w:r>
+        <w:t xml:space="preserve">Milton Hjort </w:t>
       </w:r>
       <w:r>
         <w:t>(</w:t>
       </w:r>
-      <w:proofErr w:type="spellStart"/>
-      <w:r>
-        <w:t>viewmodel</w:t>
-      </w:r>
-      <w:proofErr w:type="spellEnd"/>
-      <w:r>
-        <w:t xml:space="preserve"> animator </w:t>
-      </w:r>
-      <w:r>
-        <w:t>on COD Modern Warfare 2019</w:t>
-      </w:r>
-      <w:r>
-        <w:t>)</w:t>
-      </w:r>
-      <w:r>
-        <w:t xml:space="preserve">, </w:t>
-      </w:r>
-      <w:r>
-        <w:t xml:space="preserve">Milton Hjort </w:t>
-      </w:r>
-      <w:r>
-        <w:t>(</w:t>
-      </w:r>
-      <w:r>
-        <w:t xml:space="preserve">A.K.A Hozq, </w:t>
-      </w:r>
-      <w:proofErr w:type="spellStart"/>
-      <w:r>
-        <w:t>viewmodel</w:t>
-      </w:r>
-      <w:proofErr w:type="spellEnd"/>
-      <w:r>
-        <w:t xml:space="preserve"> animator on </w:t>
+      <w:r>
+        <w:t xml:space="preserve">A.K.A Hozq, viewmodel animator on </w:t>
       </w:r>
       <w:r>
         <w:t xml:space="preserve">Spectre Divide) and </w:t>
@@ -4293,10 +4252,7 @@
     </w:p>
     <w:p>
       <w:r>
-        <w:t>The most important part of animating a character is the rig. Having watched videos on the animation for The Finals,</w:t>
-      </w:r>
-      <w:r>
-        <w:t xml:space="preserve"> with one video in particular </w:t>
+        <w:t xml:space="preserve">The most important part of animating a character is the rig. Having watched videos on the animation for The Finals, with one video in particular </w:t>
       </w:r>
       <w:sdt>
         <w:sdtPr>
@@ -4325,10 +4281,7 @@
         </w:sdtContent>
       </w:sdt>
       <w:r>
-        <w:t xml:space="preserve"> </w:t>
-      </w:r>
-      <w:r>
-        <w:t>giving some insight into the inner workings), I have come to the conclusion that my rig must be slightly more complex than I’d like it to be.</w:t>
+        <w:t xml:space="preserve"> giving some insight into the inner workings), I have come to the conclusion that my rig must be slightly more complex than I’d like it to be.</w:t>
       </w:r>
     </w:p>
     <w:p>
@@ -4583,15 +4536,7 @@
     </w:p>
     <w:p>
       <w:r>
-        <w:t>Hitscan Firearms will fire an imaginary “ray” called a “</w:t>
-      </w:r>
-      <w:proofErr w:type="spellStart"/>
-      <w:r>
-        <w:t>raycast</w:t>
-      </w:r>
-      <w:proofErr w:type="spellEnd"/>
-      <w:r>
-        <w:t xml:space="preserve">.” This ray checks along the path </w:t>
+        <w:t xml:space="preserve">Hitscan Firearms will fire an imaginary “ray” called a “raycast.” This ray checks along the path </w:t>
       </w:r>
       <w:r>
         <w:t>from the origin of the attack to an endpoint</w:t>
@@ -4610,29 +4555,13 @@
     </w:p>
     <w:p>
       <w:r>
-        <w:t xml:space="preserve">Projectile Firearms will fire a </w:t>
-      </w:r>
-      <w:proofErr w:type="spellStart"/>
-      <w:r>
-        <w:t>rigidbody</w:t>
-      </w:r>
-      <w:proofErr w:type="spellEnd"/>
-      <w:r>
-        <w:t xml:space="preserve"> projectile (an object with physics). These projectiles will react to other objects in the game world, will be able to bounce </w:t>
+        <w:t xml:space="preserve">Projectile Firearms will fire a rigidbody projectile (an object with physics). These projectiles will react to other objects in the game world, will be able to bounce </w:t>
       </w:r>
       <w:r>
         <w:t>off</w:t>
       </w:r>
       <w:r>
-        <w:t xml:space="preserve"> walls, and can be affected by anything that might affect any </w:t>
-      </w:r>
-      <w:proofErr w:type="spellStart"/>
-      <w:r>
-        <w:t>rigidbodies</w:t>
-      </w:r>
-      <w:proofErr w:type="spellEnd"/>
-      <w:r>
-        <w:t xml:space="preserve"> in the scene.</w:t>
+        <w:t xml:space="preserve"> walls, and can be affected by anything that might affect any rigidbodies in the scene.</w:t>
       </w:r>
     </w:p>
     <w:p>
@@ -4647,15 +4576,7 @@
     </w:p>
     <w:p>
       <w:r>
-        <w:t xml:space="preserve">Melee weapons will trace between two points each fixed timestep by storing their last position and performing a </w:t>
-      </w:r>
-      <w:proofErr w:type="spellStart"/>
-      <w:r>
-        <w:t>linecast</w:t>
-      </w:r>
-      <w:proofErr w:type="spellEnd"/>
-      <w:r>
-        <w:t xml:space="preserve"> between those two points, ensuring that no targets are missed between strikes. To ensure that targets are not missed due to being too close, the system will also cast outwards from the player to the end of the weapon along the path of the strike. Anything that can be damage will be cached and ignored by further traces until the attack has ended.</w:t>
+        <w:t>Melee weapons will trace between two points each fixed timestep by storing their last position and performing a linecast between those two points, ensuring that no targets are missed between strikes. To ensure that targets are not missed due to being too close, the system will also cast outwards from the player to the end of the weapon along the path of the strike. Anything that can be damage will be cached and ignored by further traces until the attack has ended.</w:t>
       </w:r>
     </w:p>
     <w:p>
@@ -4682,44 +4603,12 @@
         <w:t>.</w:t>
       </w:r>
       <w:r>
-        <w:t xml:space="preserve"> There is also an additional performance impact from the normalisation of the fire vector, since </w:t>
-      </w:r>
-      <w:proofErr w:type="spellStart"/>
-      <w:r>
-        <w:t>RaycastCommands</w:t>
-      </w:r>
-      <w:proofErr w:type="spellEnd"/>
-      <w:r>
-        <w:t xml:space="preserve"> will not accept a vector that is not normalised.</w:t>
-      </w:r>
-    </w:p>
-    <w:p>
-      <w:r>
-        <w:t xml:space="preserve">In its first iteration, the system used two lists of a </w:t>
-      </w:r>
-      <w:proofErr w:type="spellStart"/>
-      <w:r>
-        <w:t>BulletData</w:t>
-      </w:r>
-      <w:proofErr w:type="spellEnd"/>
-      <w:r>
-        <w:t xml:space="preserve"> struct, used to determine some information about the “bullets.” A Native Array of </w:t>
-      </w:r>
-      <w:proofErr w:type="spellStart"/>
-      <w:r>
-        <w:t>RaycastCommands</w:t>
-      </w:r>
-      <w:proofErr w:type="spellEnd"/>
-      <w:r>
-        <w:t xml:space="preserve"> and </w:t>
-      </w:r>
-      <w:proofErr w:type="spellStart"/>
-      <w:r>
-        <w:t>RaycastHits</w:t>
-      </w:r>
-      <w:proofErr w:type="spellEnd"/>
-      <w:r>
-        <w:t xml:space="preserve"> is currently used to store the information needed by the Raycast batch.</w:t>
+        <w:t xml:space="preserve"> There is also an additional performance impact from the normalisation of the fire vector, since RaycastCommands will not accept a vector that is not normalised.</w:t>
+      </w:r>
+    </w:p>
+    <w:p>
+      <w:r>
+        <w:t>In its first iteration, the system used two lists of a BulletData struct, used to determine some information about the “bullets.” A Native Array of RaycastCommands and RaycastHits is currently used to store the information needed by the Raycast batch.</w:t>
       </w:r>
     </w:p>
     <w:p>
@@ -4750,49 +4639,17 @@
     </w:p>
     <w:p>
       <w:r>
-        <w:t xml:space="preserve">In the scene, there is a camera for rendering, the Input Manager that the player uses, a </w:t>
-      </w:r>
-      <w:proofErr w:type="spellStart"/>
-      <w:r>
-        <w:t>Rigidbody</w:t>
-      </w:r>
-      <w:proofErr w:type="spellEnd"/>
-      <w:r>
-        <w:t xml:space="preserve"> with a hinge joint placed in front of the test weapon, and the test weapon itself.</w:t>
-      </w:r>
-    </w:p>
-    <w:p>
-      <w:r>
-        <w:t xml:space="preserve">The test weapon fires a variable number of </w:t>
-      </w:r>
-      <w:proofErr w:type="spellStart"/>
-      <w:r>
-        <w:t>raycasts</w:t>
-      </w:r>
-      <w:proofErr w:type="spellEnd"/>
-      <w:r>
-        <w:t xml:space="preserve"> every frame, with an optional divergence. The divergence is a maximum measure, divided by 2, of how perpendicular the fire vector can be to the forward vector of the weapon.</w:t>
-      </w:r>
-    </w:p>
-    <w:p>
-      <w:r>
-        <w:t xml:space="preserve">When a </w:t>
-      </w:r>
-      <w:proofErr w:type="spellStart"/>
-      <w:r>
-        <w:t>raycast</w:t>
-      </w:r>
-      <w:proofErr w:type="spellEnd"/>
-      <w:r>
-        <w:t xml:space="preserve"> hits the </w:t>
-      </w:r>
-      <w:proofErr w:type="spellStart"/>
-      <w:r>
-        <w:t>Rigidbody</w:t>
-      </w:r>
-      <w:proofErr w:type="spellEnd"/>
-      <w:r>
-        <w:t xml:space="preserve"> in the scene, it applies a force at the point the ray hits, pushing the object around in a circle. </w:t>
+        <w:t>In the scene, there is a camera for rendering, the Input Manager that the player uses, a Rigidbody with a hinge joint placed in front of the test weapon, and the test weapon itself.</w:t>
+      </w:r>
+    </w:p>
+    <w:p>
+      <w:r>
+        <w:t>The test weapon fires a variable number of raycasts every frame, with an optional divergence. The divergence is a maximum measure, divided by 2, of how perpendicular the fire vector can be to the forward vector of the weapon.</w:t>
+      </w:r>
+    </w:p>
+    <w:p>
+      <w:r>
+        <w:t xml:space="preserve">When a raycast hits the Rigidbody in the scene, it applies a force at the point the ray hits, pushing the object around in a circle. </w:t>
       </w:r>
     </w:p>
     <w:p>
@@ -4906,39 +4763,7 @@
         </w:numPr>
       </w:pPr>
       <w:r>
-        <w:t xml:space="preserve">The Scheduler queues that bullet by creating a </w:t>
-      </w:r>
-      <w:proofErr w:type="spellStart"/>
-      <w:r>
-        <w:t>RaycastData</w:t>
-      </w:r>
-      <w:proofErr w:type="spellEnd"/>
-      <w:r>
-        <w:t xml:space="preserve"> struct from the provided information. It also checks if the owning weapon has a tracer prefab and creates one at the start point. The new </w:t>
-      </w:r>
-      <w:proofErr w:type="spellStart"/>
-      <w:r>
-        <w:t>RaycastData</w:t>
-      </w:r>
-      <w:proofErr w:type="spellEnd"/>
-      <w:r>
-        <w:t xml:space="preserve"> is then added to a 2D array of </w:t>
-      </w:r>
-      <w:proofErr w:type="spellStart"/>
-      <w:r>
-        <w:t>RaycastData</w:t>
-      </w:r>
-      <w:proofErr w:type="spellEnd"/>
-      <w:r>
-        <w:t xml:space="preserve"> structs and increments the number of expected </w:t>
-      </w:r>
-      <w:proofErr w:type="spellStart"/>
-      <w:r>
-        <w:t>raycasts</w:t>
-      </w:r>
-      <w:proofErr w:type="spellEnd"/>
-      <w:r>
-        <w:t xml:space="preserve"> on the next simulation step (hereby called Ticks).</w:t>
+        <w:t>The Scheduler queues that bullet by creating a RaycastData struct from the provided information. It also checks if the owning weapon has a tracer prefab and creates one at the start point. The new RaycastData is then added to a 2D array of RaycastData structs and increments the number of expected raycasts on the next simulation step (hereby called Ticks).</w:t>
       </w:r>
     </w:p>
     <w:p>
@@ -5011,15 +4836,7 @@
         </w:numPr>
       </w:pPr>
       <w:r>
-        <w:t xml:space="preserve">Calculate the damage dealt based on the distance the projectile has travelled, using </w:t>
-      </w:r>
-      <w:proofErr w:type="spellStart"/>
-      <w:r>
-        <w:t>BaseWeapon.DamageDealt</w:t>
-      </w:r>
-      <w:proofErr w:type="spellEnd"/>
-      <w:r>
-        <w:t>()</w:t>
+        <w:t>Calculate the damage dealt based on the distance the projectile has travelled, using BaseWeapon.DamageDealt()</w:t>
       </w:r>
     </w:p>
     <w:p>
@@ -5031,15 +4848,7 @@
         </w:numPr>
       </w:pPr>
       <w:r>
-        <w:t xml:space="preserve">Create and/or add the damage, hit point and hit force to an existing </w:t>
-      </w:r>
-      <w:proofErr w:type="spellStart"/>
-      <w:r>
-        <w:t>ColliderHitData</w:t>
-      </w:r>
-      <w:proofErr w:type="spellEnd"/>
-      <w:r>
-        <w:t xml:space="preserve"> (stored in a dictionary using the collider hit as a key).</w:t>
+        <w:t>Create and/or add the damage, hit point and hit force to an existing ColliderHitData (stored in a dictionary using the collider hit as a key).</w:t>
       </w:r>
     </w:p>
     <w:p>
@@ -5099,15 +4908,7 @@
         </w:numPr>
       </w:pPr>
       <w:r>
-        <w:t xml:space="preserve">Iterates through each collider that was hit this Tick, checks for a </w:t>
-      </w:r>
-      <w:proofErr w:type="spellStart"/>
-      <w:r>
-        <w:t>rigidbody</w:t>
-      </w:r>
-      <w:proofErr w:type="spellEnd"/>
-      <w:r>
-        <w:t xml:space="preserve"> and applies forces if one exists, and checks for a damageable and applies damage if one exists on this collider.</w:t>
+        <w:t>Iterates through each collider that was hit this Tick, checks for a rigidbody and applies forces if one exists, and checks for a damageable and applies damage if one exists on this collider.</w:t>
       </w:r>
     </w:p>
     <w:p>
@@ -5119,15 +4920,7 @@
         </w:numPr>
       </w:pPr>
       <w:r>
-        <w:t xml:space="preserve">Clears the colliders hit this tick, disposes of the </w:t>
-      </w:r>
-      <w:proofErr w:type="spellStart"/>
-      <w:r>
-        <w:t>raycast</w:t>
-      </w:r>
-      <w:proofErr w:type="spellEnd"/>
-      <w:r>
-        <w:t xml:space="preserve"> commands and the returned hits (to prevent memory leaks) and prints the time in milliseconds that this process took to complete.</w:t>
+        <w:t>Clears the colliders hit this tick, disposes of the raycast commands and the returned hits (to prevent memory leaks) and prints the time in milliseconds that this process took to complete.</w:t>
       </w:r>
     </w:p>
     <w:p>
@@ -5145,26 +4938,10 @@
         <w:t>Projectiles are not implemented in the prototype submission, though a shell exists for them to be implemented, with an object pool for them to draw from. All projectiles must have a</w:t>
       </w:r>
       <w:r>
-        <w:t xml:space="preserve"> child of the abstract </w:t>
-      </w:r>
-      <w:proofErr w:type="spellStart"/>
-      <w:r>
-        <w:t>Base</w:t>
-      </w:r>
-      <w:r>
-        <w:t>Projectile</w:t>
-      </w:r>
-      <w:proofErr w:type="spellEnd"/>
-      <w:r>
-        <w:t xml:space="preserve"> component present on their prefab for a </w:t>
-      </w:r>
-      <w:proofErr w:type="spellStart"/>
-      <w:r>
-        <w:t>ProjectileWeapon</w:t>
-      </w:r>
-      <w:proofErr w:type="spellEnd"/>
-      <w:r>
-        <w:t xml:space="preserve"> to fire them, due to a part of the object pooling process and as a sensible design choice.</w:t>
+        <w:t xml:space="preserve"> child of the abstract Base</w:t>
+      </w:r>
+      <w:r>
+        <w:t>Projectile component present on their prefab for a ProjectileWeapon to fire them, due to a part of the object pooling process and as a sensible design choice.</w:t>
       </w:r>
     </w:p>
     <w:p>
@@ -5206,15 +4983,7 @@
         </w:numPr>
       </w:pPr>
       <w:r>
-        <w:t xml:space="preserve">The projectile’s velocity is then set to its forward direction multiplied by the speed it flies at, and the </w:t>
-      </w:r>
-      <w:proofErr w:type="spellStart"/>
-      <w:r>
-        <w:t>rigidbody’s</w:t>
-      </w:r>
-      <w:proofErr w:type="spellEnd"/>
-      <w:r>
-        <w:t xml:space="preserve"> Use Gravity field is set if the projectile should use normal gravity.</w:t>
+        <w:t>The projectile’s velocity is then set to its forward direction multiplied by the speed it flies at, and the rigidbody’s Use Gravity field is set if the projectile should use normal gravity.</w:t>
       </w:r>
     </w:p>
     <w:p>
@@ -5318,15 +5087,7 @@
     </w:p>
     <w:p>
       <w:r>
-        <w:t xml:space="preserve">Everything that needs to take damage will either have a Damageable component or one that derives from Damageable. This script is simple; the script handles receiving health events/changes to health, regeneration after a short period of time (if enabled) and has an Immune flag, which prevents negative health events (taking damage) from occurring. This script also supplies a Delegate with a </w:t>
-      </w:r>
-      <w:proofErr w:type="spellStart"/>
-      <w:r>
-        <w:t>HitEvent</w:t>
-      </w:r>
-      <w:proofErr w:type="spellEnd"/>
-      <w:r>
-        <w:t xml:space="preserve"> parameter, allowing for other scripts to listen for health events, and a method “Damageable Died” which should be called when health reaches zero.  </w:t>
+        <w:t xml:space="preserve">Everything that needs to take damage will either have a Damageable component or one that derives from Damageable. This script is simple; the script handles receiving health events/changes to health, regeneration after a short period of time (if enabled) and has an Immune flag, which prevents negative health events (taking damage) from occurring. This script also supplies a Delegate with a HitEvent parameter, allowing for other scripts to listen for health events, and a method “Damageable Died” which should be called when health reaches zero.  </w:t>
       </w:r>
     </w:p>
     <w:p>
@@ -5398,15 +5159,7 @@
         <w:t xml:space="preserve">Weapons also have a Weapon Animator script, but with some different functionality </w:t>
       </w:r>
       <w:r>
-        <w:t xml:space="preserve">using the </w:t>
-      </w:r>
-      <w:proofErr w:type="spellStart"/>
-      <w:r>
-        <w:t>isWeapon</w:t>
-      </w:r>
-      <w:proofErr w:type="spellEnd"/>
-      <w:r>
-        <w:t xml:space="preserve"> flag.</w:t>
+        <w:t>using the isWeapon flag.</w:t>
       </w:r>
       <w:r>
         <w:t xml:space="preserve"> While characters </w:t>
@@ -5437,15 +5190,7 @@
         <w:t>The project began with a character controller that I had already written</w:t>
       </w:r>
       <w:r>
-        <w:t xml:space="preserve">, though several modifications have already been made to this character controller to improve on compatibility. Almost all variables on the </w:t>
-      </w:r>
-      <w:proofErr w:type="spellStart"/>
-      <w:r>
-        <w:t>Rigidbody</w:t>
-      </w:r>
-      <w:proofErr w:type="spellEnd"/>
-      <w:r>
-        <w:t xml:space="preserve"> Player Motor script are internally accessible to allow the </w:t>
+        <w:t xml:space="preserve">, though several modifications have already been made to this character controller to improve on compatibility. Almost all variables on the Rigidbody Player Motor script are internally accessible to allow the </w:t>
       </w:r>
       <w:r>
         <w:t>Player Weapon Controller</w:t>
@@ -5466,15 +5211,7 @@
     </w:p>
     <w:p>
       <w:r>
-        <w:t>The RBPM (</w:t>
-      </w:r>
-      <w:proofErr w:type="spellStart"/>
-      <w:r>
-        <w:t>Rigidbody</w:t>
-      </w:r>
-      <w:proofErr w:type="spellEnd"/>
-      <w:r>
-        <w:t xml:space="preserve"> Player Motor) handles all the player’s movement and rotation, while exposing some data on the aim rotation (previous, delta and current rotation) for later use in weapon sway.</w:t>
+        <w:t>The RBPM (Rigidbody Player Motor) handles all the player’s movement and rotation, while exposing some data on the aim rotation (previous, delta and current rotation) for later use in weapon sway.</w:t>
       </w:r>
     </w:p>
     <w:p>
@@ -5489,23 +5226,7 @@
     </w:p>
     <w:p>
       <w:r>
-        <w:t xml:space="preserve">While holding down right click or left trigger (usual first-person shooter controls for aiming), the player’s view zooms in on both the </w:t>
-      </w:r>
-      <w:proofErr w:type="spellStart"/>
-      <w:r>
-        <w:t>viewmodel</w:t>
-      </w:r>
-      <w:proofErr w:type="spellEnd"/>
-      <w:r>
-        <w:t xml:space="preserve"> and </w:t>
-      </w:r>
-      <w:proofErr w:type="spellStart"/>
-      <w:r>
-        <w:t>worldmodel</w:t>
-      </w:r>
-      <w:proofErr w:type="spellEnd"/>
-      <w:r>
-        <w:t xml:space="preserve"> (more on this in the next section). Initially, the RBPM handled this aiming, until I realised the Player Weapon Controller needed to perform the aiming calculations, so it could pull information from the weapon. </w:t>
+        <w:t xml:space="preserve">While holding down right click or left trigger (usual first-person shooter controls for aiming), the player’s view zooms in on both the viewmodel and worldmodel (more on this in the next section). Initially, the RBPM handled this aiming, until I realised the Player Weapon Controller needed to perform the aiming calculations, so it could pull information from the weapon. </w:t>
       </w:r>
     </w:p>
     <w:p>
@@ -5781,15 +5502,7 @@
     </w:p>
     <w:p>
       <w:r>
-        <w:t xml:space="preserve">In a simple scene with around 12 cubes, ~20 </w:t>
-      </w:r>
-      <w:proofErr w:type="spellStart"/>
-      <w:r>
-        <w:t>rigidbodies</w:t>
-      </w:r>
-      <w:proofErr w:type="spellEnd"/>
-      <w:r>
-        <w:t xml:space="preserve"> with interactable components, the UI and the Input Manager, the Unity Editor reaches ~300-400 FPS. Once the player and their weapons are spawned, this </w:t>
+        <w:t xml:space="preserve">In a simple scene with around 12 cubes, ~20 rigidbodies with interactable components, the UI and the Input Manager, the Unity Editor reaches ~300-400 FPS. Once the player and their weapons are spawned, this </w:t>
       </w:r>
       <w:r>
         <w:rPr>
@@ -5816,6 +5529,9 @@
         <w:keepNext/>
       </w:pPr>
       <w:r>
+        <w:rPr>
+          <w:noProof/>
+        </w:rPr>
         <w:drawing>
           <wp:inline distT="0" distB="0" distL="0" distR="0" wp14:anchorId="3990D267" wp14:editId="38C545B2">
             <wp:extent cx="5731510" cy="654050"/>
@@ -5882,6 +5598,9 @@
         <w:keepNext/>
       </w:pPr>
       <w:r>
+        <w:rPr>
+          <w:noProof/>
+        </w:rPr>
         <w:drawing>
           <wp:inline distT="0" distB="0" distL="0" distR="0" wp14:anchorId="31C97B59" wp14:editId="3FDC7999">
             <wp:extent cx="5731510" cy="886460"/>
@@ -5948,6 +5667,11 @@
       </w:r>
       <w:bookmarkEnd w:id="42"/>
     </w:p>
+    <w:p>
+      <w:r>
+        <w:t>The weapon setup guide will be included as an additional document, as it will massively over-inflate this document. It will detail how to set up a weapon, what each parameter means, and how to add it to the pool of usable weapons.</w:t>
+      </w:r>
+    </w:p>
     <w:p/>
     <w:p>
       <w:pPr>
@@ -5961,23 +5685,7 @@
     </w:p>
     <w:p>
       <w:r>
-        <w:t xml:space="preserve">To achieve a </w:t>
-      </w:r>
-      <w:proofErr w:type="spellStart"/>
-      <w:r>
-        <w:t>viewmodel</w:t>
-      </w:r>
-      <w:proofErr w:type="spellEnd"/>
-      <w:r>
-        <w:t>/</w:t>
-      </w:r>
-      <w:proofErr w:type="spellStart"/>
-      <w:r>
-        <w:t>worldmodel</w:t>
-      </w:r>
-      <w:proofErr w:type="spellEnd"/>
-      <w:r>
-        <w:t xml:space="preserve"> setup in this project, I make heavy use of features specific to Unity’s Universal Render Pipeline: Render Features and Camera Stacking. </w:t>
+        <w:t xml:space="preserve">To achieve a viewmodel/worldmodel setup in this project, I make heavy use of features specific to Unity’s Universal Render Pipeline: Render Features and Camera Stacking. </w:t>
       </w:r>
     </w:p>
     <w:p>
@@ -5992,7 +5700,11 @@
     </w:p>
     <w:p>
       <w:r>
-        <w:t xml:space="preserve">As an unfortunate result of the project’s setup, it is only compatible with Unity’s URP (universal render pipeline). While there’s no specific setup that forces the use of the URP, it would require modification (or at least hacky workarounds with rendering) to achieve </w:t>
+        <w:t xml:space="preserve">As an unfortunate result of the project’s setup, it is only compatible with Unity’s URP (universal render pipeline). While there’s no specific setup that forces the use of the </w:t>
+      </w:r>
+      <w:r>
+        <w:lastRenderedPageBreak/>
+        <w:t xml:space="preserve">URP, it would require modification (or at least hacky workarounds with rendering) to achieve </w:t>
       </w:r>
       <w:r>
         <w:t>a similar result.</w:t>
@@ -6004,7 +5716,6 @@
       </w:pPr>
       <w:bookmarkStart w:id="45" w:name="_Toc199073594"/>
       <w:r>
-        <w:lastRenderedPageBreak/>
         <w:t>Render Features</w:t>
       </w:r>
       <w:bookmarkEnd w:id="45"/>
@@ -6014,23 +5725,7 @@
         <w:t>Render Features are additional things that can be added to a Renderer in Unity’s URP, ranging from Screen Space Ambient Occlusion to modifying the final render. This project makes use of the Render Objects feature</w:t>
       </w:r>
       <w:r>
-        <w:t xml:space="preserve"> which renders opaques separately on the transparent queue to force them to only render shadows. Two of these are used, one of each of the two separate Renderers. The </w:t>
-      </w:r>
-      <w:proofErr w:type="spellStart"/>
-      <w:r>
-        <w:t>viewmodel</w:t>
-      </w:r>
-      <w:proofErr w:type="spellEnd"/>
-      <w:r>
-        <w:t xml:space="preserve"> camera renders the world shadow-only and the world camera renders the </w:t>
-      </w:r>
-      <w:proofErr w:type="spellStart"/>
-      <w:r>
-        <w:t>viewmodel</w:t>
-      </w:r>
-      <w:proofErr w:type="spellEnd"/>
-      <w:r>
-        <w:t xml:space="preserve"> as shadow only. </w:t>
+        <w:t xml:space="preserve"> which renders opaques separately on the transparent queue to force them to only render shadows. Two of these are used, one of each of the two separate Renderers. The viewmodel camera renders the world shadow-only and the world camera renders the viewmodel as shadow only. </w:t>
       </w:r>
     </w:p>
     <w:p>
@@ -6055,23 +5750,7 @@
     </w:p>
     <w:p>
       <w:r>
-        <w:t xml:space="preserve">Camera Stacking allows independent FOV between the world and </w:t>
-      </w:r>
-      <w:proofErr w:type="spellStart"/>
-      <w:r>
-        <w:t>viewmodel</w:t>
-      </w:r>
-      <w:proofErr w:type="spellEnd"/>
-      <w:r>
-        <w:t xml:space="preserve"> to create the typical FPS view, whilst also rendering the </w:t>
-      </w:r>
-      <w:proofErr w:type="spellStart"/>
-      <w:r>
-        <w:t>viewmodel</w:t>
-      </w:r>
-      <w:proofErr w:type="spellEnd"/>
-      <w:r>
-        <w:t xml:space="preserve"> in front of everything else in the world. </w:t>
+        <w:t xml:space="preserve">Camera Stacking allows independent FOV between the world and viewmodel to create the typical FPS view, whilst also rendering the viewmodel in front of everything else in the world. </w:t>
       </w:r>
       <w:r>
         <w:t xml:space="preserve">The Player Weapon Controller changes the FOV of both cameras independently when aiming a ranged weapon. This introduces another issue, in that some objects cannot be rendered in the world in the editor and can make debugging or animating a little more difficult. </w:t>
@@ -6080,20 +5759,18 @@
     <w:bookmarkStart w:id="47" w:name="_Toc199073596" w:displacedByCustomXml="next"/>
     <w:sdt>
       <w:sdtPr>
+        <w:rPr>
+          <w:rFonts w:asciiTheme="minorHAnsi" w:eastAsiaTheme="minorHAnsi" w:hAnsiTheme="minorHAnsi" w:cstheme="minorBidi"/>
+          <w:color w:val="auto"/>
+          <w:sz w:val="24"/>
+          <w:szCs w:val="24"/>
+        </w:rPr>
         <w:id w:val="-2070874111"/>
         <w:docPartObj>
           <w:docPartGallery w:val="Bibliographies"/>
           <w:docPartUnique/>
         </w:docPartObj>
       </w:sdtPr>
-      <w:sdtEndPr>
-        <w:rPr>
-          <w:rFonts w:asciiTheme="minorHAnsi" w:eastAsiaTheme="minorHAnsi" w:hAnsiTheme="minorHAnsi" w:cstheme="minorBidi"/>
-          <w:color w:val="auto"/>
-          <w:sz w:val="24"/>
-          <w:szCs w:val="24"/>
-        </w:rPr>
-      </w:sdtEndPr>
       <w:sdtContent>
         <w:p>
           <w:pPr>
@@ -6235,6 +5912,7 @@
                 <w:rPr>
                   <w:noProof/>
                 </w:rPr>
+                <w:lastRenderedPageBreak/>
                 <w:t>LayzuhCatz. (2025, 05 25). Retrieved from YouTube: https://www.youtube.com/@LayzuhCatz</w:t>
               </w:r>
             </w:p>
@@ -6250,7 +5928,6 @@
                 <w:rPr>
                   <w:noProof/>
                 </w:rPr>
-                <w:lastRenderedPageBreak/>
                 <w:t>Le, K. (n.d.). Retrieved from https://www.youtube.com/@khoaleanimation</w:t>
               </w:r>
             </w:p>
@@ -7777,6 +7454,7 @@
   <w:style w:type="character" w:default="1" w:styleId="DefaultParagraphFont">
     <w:name w:val="Default Paragraph Font"/>
     <w:uiPriority w:val="1"/>
+    <w:semiHidden/>
     <w:unhideWhenUsed/>
   </w:style>
   <w:style w:type="table" w:default="1" w:styleId="TableNormal">

</xml_diff>

<commit_message>
team spawns and potential entity fix
</commit_message>
<xml_diff>
--- a/DesignDocument.docx
+++ b/DesignDocument.docx
@@ -5486,11 +5486,255 @@
     </w:p>
     <w:p>
       <w:pPr>
+        <w:pStyle w:val="Heading3"/>
+      </w:pPr>
+      <w:r>
+        <w:lastRenderedPageBreak/>
+        <w:t>How It works</w:t>
+      </w:r>
+    </w:p>
+    <w:p>
+      <w:r>
+        <w:t>There are two parts to the system – the Net Projectile script and the Projectile Simulator script.</w:t>
+      </w:r>
+    </w:p>
+    <w:p>
+      <w:pPr>
+        <w:pStyle w:val="Heading4"/>
+      </w:pPr>
+      <w:r>
+        <w:t>Net Projectile</w:t>
+      </w:r>
+    </w:p>
+    <w:p>
+      <w:r>
+        <w:t>The Net Projectile contains all the data needed by the Simulator to drive the projectiles. It has multipliers employed by charged weapons, references to visual effects, information about velocity, direction, lifetimes and distances, as well as more data/references needed to ensure its proper function.</w:t>
+      </w:r>
+    </w:p>
+    <w:p>
+      <w:r>
+        <w:t>When initialised by a weapon, it resets itself back to the spawned state and sets some values passed to the initialise method. The object is then spawned and set alive on all clients, allowing the visual effects to be seen by those clients.</w:t>
+      </w:r>
+    </w:p>
+    <w:p>
+      <w:r>
+        <w:t>Each timestep, the simulator “Ticks” the projectiles, moving them forwards, incrementing their alive time and calculating their position and velocity for the next frame.</w:t>
+      </w:r>
+    </w:p>
+    <w:p>
+      <w:r>
+        <w:t>When a projectile’s alive time reaches its max lifetime, or it reaches its maximum distance, it is terminated by the simulator. This will spawn any hit effects, stop any vfx that might play as a result, and queue the despawn method to return it to the object pool it belongs to.</w:t>
+      </w:r>
+    </w:p>
+    <w:p>
+      <w:pPr>
+        <w:pStyle w:val="Heading4"/>
+      </w:pPr>
+      <w:r>
+        <w:t>Projectile Simulator</w:t>
+      </w:r>
+    </w:p>
+    <w:p>
+      <w:r>
+        <w:t>The Projectile Simulator is of similar complexity to the previous iteration’s Bullet Scheduler, though has many differences.</w:t>
+      </w:r>
+    </w:p>
+    <w:p>
+      <w:r>
+        <w:t>The projectile simulator has a dictionary of all colliders hit by the object and their associated hit data, allowing efficient access and storage of the damage, hit count and accumulated force that must be applied to a collider or entity.</w:t>
+      </w:r>
+    </w:p>
+    <w:p>
+      <w:r>
+        <w:t>If there are zero projectiles spawned, or all spawned projectiles are “dead”, this script will idle.</w:t>
+      </w:r>
+    </w:p>
+    <w:p>
+      <w:r>
+        <w:t>If there are active projectiles, the Simulator will perform the following steps in order:</w:t>
+      </w:r>
+    </w:p>
+    <w:p>
+      <w:pPr>
+        <w:pStyle w:val="ListParagraph"/>
+        <w:numPr>
+          <w:ilvl w:val="0"/>
+          <w:numId w:val="7"/>
+        </w:numPr>
+      </w:pPr>
+      <w:r>
+        <w:t>Create a native array of raycast commands, iterates through the array and assigns the start point and the direction, then draws a debug ray to show this.</w:t>
+      </w:r>
+    </w:p>
+    <w:p>
+      <w:pPr>
+        <w:pStyle w:val="ListParagraph"/>
+        <w:numPr>
+          <w:ilvl w:val="0"/>
+          <w:numId w:val="7"/>
+        </w:numPr>
+      </w:pPr>
+      <w:r>
+        <w:t>Creates a native array of raycast hits with length of the cast commands * max hits per command. This allows the simulation to ignore multiple hits on invalid targets, such as the owner of the weapon (to prevent shooting yourself in the foot) or objects that should be ignored by projectiles.</w:t>
+      </w:r>
+    </w:p>
+    <w:p>
+      <w:pPr>
+        <w:pStyle w:val="ListParagraph"/>
+        <w:numPr>
+          <w:ilvl w:val="0"/>
+          <w:numId w:val="7"/>
+        </w:numPr>
+      </w:pPr>
+      <w:r>
+        <w:t>Schedules and completes the job – since this is done directly inline and I am accessing the data, execution is “held up” by the job’s completion. Luckily, this step only takes single-digit milliseconds.</w:t>
+      </w:r>
+    </w:p>
+    <w:p>
+      <w:pPr>
+        <w:pStyle w:val="ListParagraph"/>
+        <w:numPr>
+          <w:ilvl w:val="0"/>
+          <w:numId w:val="7"/>
+        </w:numPr>
+      </w:pPr>
+      <w:r>
+        <w:lastRenderedPageBreak/>
+        <w:t>Check each raycast commands’ allocated hits (cast command index + n) and check the following</w:t>
+      </w:r>
+    </w:p>
+    <w:p>
+      <w:pPr>
+        <w:pStyle w:val="ListParagraph"/>
+        <w:numPr>
+          <w:ilvl w:val="1"/>
+          <w:numId w:val="7"/>
+        </w:numPr>
+      </w:pPr>
+      <w:r>
+        <w:t>Did we hit something?</w:t>
+      </w:r>
+    </w:p>
+    <w:p>
+      <w:pPr>
+        <w:pStyle w:val="ListParagraph"/>
+        <w:numPr>
+          <w:ilvl w:val="1"/>
+          <w:numId w:val="7"/>
+        </w:numPr>
+      </w:pPr>
+      <w:r>
+        <w:t>Is it one of the projectile’s ignored colliders?</w:t>
+      </w:r>
+    </w:p>
+    <w:p>
+      <w:pPr>
+        <w:pStyle w:val="ListParagraph"/>
+        <w:numPr>
+          <w:ilvl w:val="1"/>
+          <w:numId w:val="7"/>
+        </w:numPr>
+      </w:pPr>
+      <w:r>
+        <w:t>Is the hit distance not zero AND is it less than the previous hit distance?</w:t>
+      </w:r>
+    </w:p>
+    <w:p>
+      <w:pPr>
+        <w:pStyle w:val="ListParagraph"/>
+        <w:numPr>
+          <w:ilvl w:val="0"/>
+          <w:numId w:val="7"/>
+        </w:numPr>
+      </w:pPr>
+      <w:r>
+        <w:t>If A and B are false and C is true, then this projectile hit something and the simulator then processes the hit. Otherwise, the projectile is Ticked and will continue onwards if it is not due to be terminated.</w:t>
+      </w:r>
+    </w:p>
+    <w:p>
+      <w:pPr>
+        <w:pStyle w:val="ListParagraph"/>
+        <w:numPr>
+          <w:ilvl w:val="0"/>
+          <w:numId w:val="7"/>
+        </w:numPr>
+      </w:pPr>
+      <w:r>
+        <w:t>In the Process Hit method, we output the collider we hit and the weapon that hit it. We query the collider and either create a new entry in the hit data dictionary (if we have not hit this collider this frame) or add it to that collider’s entry.</w:t>
+      </w:r>
+      <w:r>
+        <w:t xml:space="preserve"> The projectile is then terminated.</w:t>
+      </w:r>
+    </w:p>
+    <w:p>
+      <w:pPr>
+        <w:pStyle w:val="ListParagraph"/>
+        <w:numPr>
+          <w:ilvl w:val="0"/>
+          <w:numId w:val="7"/>
+        </w:numPr>
+      </w:pPr>
+      <w:r>
+        <w:t>At the end of each of simulation step, each hit collider is then:</w:t>
+      </w:r>
+    </w:p>
+    <w:p>
+      <w:pPr>
+        <w:pStyle w:val="ListParagraph"/>
+        <w:numPr>
+          <w:ilvl w:val="1"/>
+          <w:numId w:val="7"/>
+        </w:numPr>
+      </w:pPr>
+      <w:r>
+        <w:t>Moved by a force it is has a rigidbody, applied at the average point at which each projectile hit it that frame.</w:t>
+      </w:r>
+    </w:p>
+    <w:p>
+      <w:pPr>
+        <w:pStyle w:val="ListParagraph"/>
+        <w:numPr>
+          <w:ilvl w:val="1"/>
+          <w:numId w:val="7"/>
+        </w:numPr>
+      </w:pPr>
+      <w:r>
+        <w:t>Damaged, if it has an associated damageable and that damageable can take damage from the owner of the projectile.</w:t>
+      </w:r>
+    </w:p>
+    <w:p>
+      <w:pPr>
+        <w:pStyle w:val="ListParagraph"/>
+        <w:numPr>
+          <w:ilvl w:val="0"/>
+          <w:numId w:val="7"/>
+        </w:numPr>
+      </w:pPr>
+      <w:r>
+        <w:t>The native arrays are disposed to prevent leaks, and the collider hit data dictionary is cleared to be used again next step.</w:t>
+      </w:r>
+    </w:p>
+    <w:p>
+      <w:r>
+        <w:t xml:space="preserve">Also present in the Projectile Simulator is the </w:t>
+      </w:r>
+      <w:r>
+        <w:rPr>
+          <w:i/>
+          <w:iCs/>
+        </w:rPr>
+        <w:t>old</w:t>
+      </w:r>
+      <w:r>
+        <w:t xml:space="preserve"> projectile simulation code, which was significantly less performant and relied on populating and clearing lists each frame.</w:t>
+      </w:r>
+    </w:p>
+    <w:p>
+      <w:pPr>
         <w:pStyle w:val="Heading2"/>
       </w:pPr>
       <w:bookmarkStart w:id="41" w:name="_Toc199073590"/>
       <w:r>
-        <w:lastRenderedPageBreak/>
         <w:t>Performance Profiling</w:t>
       </w:r>
       <w:bookmarkEnd w:id="41"/>
@@ -5590,7 +5834,11 @@
     </w:p>
     <w:p>
       <w:r>
-        <w:t>There is also no noticeable decline in performance on weapons that fire multiple projectiles per frame, evidenced by figure 2. This, however, is only an issue early on due to the use of Object Pooling. Once the pool has been established, projectile spawning will only become more efficient.</w:t>
+        <w:t xml:space="preserve">There is also no noticeable decline in performance on weapons that fire multiple projectiles per frame, evidenced by figure 2. This, however, is only an issue early on due </w:t>
+      </w:r>
+      <w:r>
+        <w:lastRenderedPageBreak/>
+        <w:t>to the use of Object Pooling. Once the pool has been established, projectile spawning will only become more efficient.</w:t>
       </w:r>
     </w:p>
     <w:p>
@@ -5700,52 +5948,52 @@
     </w:p>
     <w:p>
       <w:r>
-        <w:t xml:space="preserve">As an unfortunate result of the project’s setup, it is only compatible with Unity’s URP (universal render pipeline). While there’s no specific setup that forces the use of the </w:t>
+        <w:t xml:space="preserve">As an unfortunate result of the project’s setup, it is only compatible with Unity’s URP (universal render pipeline). While there’s no specific setup that forces the use of the URP, it would require modification (or at least hacky workarounds with rendering) to achieve </w:t>
+      </w:r>
+      <w:r>
+        <w:t>a similar result.</w:t>
+      </w:r>
+    </w:p>
+    <w:p>
+      <w:pPr>
+        <w:pStyle w:val="Heading3"/>
+      </w:pPr>
+      <w:bookmarkStart w:id="45" w:name="_Toc199073594"/>
+      <w:r>
+        <w:t>Render Features</w:t>
+      </w:r>
+      <w:bookmarkEnd w:id="45"/>
+    </w:p>
+    <w:p>
+      <w:r>
+        <w:t>Render Features are additional things that can be added to a Renderer in Unity’s URP, ranging from Screen Space Ambient Occlusion to modifying the final render. This project makes use of the Render Objects feature</w:t>
+      </w:r>
+      <w:r>
+        <w:t xml:space="preserve"> which renders opaques separately on the transparent queue to force them to only render shadows. Two of these are used, one of each of the two separate Renderers. The viewmodel camera renders the world shadow-only and the world camera renders the viewmodel as shadow only. </w:t>
+      </w:r>
+    </w:p>
+    <w:p>
+      <w:r>
+        <w:t>Additionally, there is a Fullscreen Shader Pass material created via the Shader Graph, which functions as an expanded post processing shader, used for altering the screen (mostly by altering viewport UVs) when the player is low on health.</w:t>
+      </w:r>
+    </w:p>
+    <w:p>
+      <w:pPr>
+        <w:pStyle w:val="Heading3"/>
+      </w:pPr>
+      <w:bookmarkStart w:id="46" w:name="_Toc199073595"/>
+      <w:r>
+        <w:t>Camera Stacking</w:t>
+      </w:r>
+      <w:bookmarkEnd w:id="46"/>
+    </w:p>
+    <w:p>
+      <w:r>
+        <w:t xml:space="preserve">Camera Stacking is a feature only available in the URP’s Forward and Forward+ path, the only difference of which is per-object light limits not being present in Forward+. It </w:t>
       </w:r>
       <w:r>
         <w:lastRenderedPageBreak/>
-        <w:t xml:space="preserve">URP, it would require modification (or at least hacky workarounds with rendering) to achieve </w:t>
-      </w:r>
-      <w:r>
-        <w:t>a similar result.</w:t>
-      </w:r>
-    </w:p>
-    <w:p>
-      <w:pPr>
-        <w:pStyle w:val="Heading3"/>
-      </w:pPr>
-      <w:bookmarkStart w:id="45" w:name="_Toc199073594"/>
-      <w:r>
-        <w:t>Render Features</w:t>
-      </w:r>
-      <w:bookmarkEnd w:id="45"/>
-    </w:p>
-    <w:p>
-      <w:r>
-        <w:t>Render Features are additional things that can be added to a Renderer in Unity’s URP, ranging from Screen Space Ambient Occlusion to modifying the final render. This project makes use of the Render Objects feature</w:t>
-      </w:r>
-      <w:r>
-        <w:t xml:space="preserve"> which renders opaques separately on the transparent queue to force them to only render shadows. Two of these are used, one of each of the two separate Renderers. The viewmodel camera renders the world shadow-only and the world camera renders the viewmodel as shadow only. </w:t>
-      </w:r>
-    </w:p>
-    <w:p>
-      <w:r>
-        <w:t>Additionally, there is a Fullscreen Shader Pass material created via the Shader Graph, which functions as an expanded post processing shader, used for altering the screen (mostly by altering viewport UVs) when the player is low on health.</w:t>
-      </w:r>
-    </w:p>
-    <w:p>
-      <w:pPr>
-        <w:pStyle w:val="Heading3"/>
-      </w:pPr>
-      <w:bookmarkStart w:id="46" w:name="_Toc199073595"/>
-      <w:r>
-        <w:t>Camera Stacking</w:t>
-      </w:r>
-      <w:bookmarkEnd w:id="46"/>
-    </w:p>
-    <w:p>
-      <w:r>
-        <w:t>Camera Stacking is a feature only available in the URP’s Forward and Forward+ path, the only difference of which is per-object light limits not being present in Forward+. It overlays multiple cameras, rendering them directly on top of each other. Unity performs several optimisations (that they neglect to mention in the documentation) to reduce overdraw. This allows the setup to maintain a similar frame rate to a single-camera render setup.</w:t>
+        <w:t>overlays multiple cameras, rendering them directly on top of each other. Unity performs several optimisations (that they neglect to mention in the documentation) to reduce overdraw. This allows the setup to maintain a similar frame rate to a single-camera render setup.</w:t>
       </w:r>
     </w:p>
     <w:p>
@@ -5912,7 +6160,6 @@
                 <w:rPr>
                   <w:noProof/>
                 </w:rPr>
-                <w:lastRenderedPageBreak/>
                 <w:t>LayzuhCatz. (2025, 05 25). Retrieved from YouTube: https://www.youtube.com/@LayzuhCatz</w:t>
               </w:r>
             </w:p>
@@ -6833,6 +7080,92 @@
       </w:rPr>
     </w:lvl>
   </w:abstractNum>
+  <w:abstractNum w:abstractNumId="6" w15:restartNumberingAfterBreak="0">
+    <w:nsid w:val="7C162FC6"/>
+    <w:multiLevelType w:val="hybridMultilevel"/>
+    <w:tmpl w:val="0FE63D14"/>
+    <w:lvl w:ilvl="0" w:tplc="0809000F">
+      <w:start w:val="1"/>
+      <w:numFmt w:val="decimal"/>
+      <w:lvlText w:val="%1."/>
+      <w:lvlJc w:val="left"/>
+      <w:pPr>
+        <w:ind w:left="765" w:hanging="360"/>
+      </w:pPr>
+    </w:lvl>
+    <w:lvl w:ilvl="1" w:tplc="08090019">
+      <w:start w:val="1"/>
+      <w:numFmt w:val="lowerLetter"/>
+      <w:lvlText w:val="%2."/>
+      <w:lvlJc w:val="left"/>
+      <w:pPr>
+        <w:ind w:left="1485" w:hanging="360"/>
+      </w:pPr>
+    </w:lvl>
+    <w:lvl w:ilvl="2" w:tplc="0809001B" w:tentative="1">
+      <w:start w:val="1"/>
+      <w:numFmt w:val="lowerRoman"/>
+      <w:lvlText w:val="%3."/>
+      <w:lvlJc w:val="right"/>
+      <w:pPr>
+        <w:ind w:left="2205" w:hanging="180"/>
+      </w:pPr>
+    </w:lvl>
+    <w:lvl w:ilvl="3" w:tplc="0809000F" w:tentative="1">
+      <w:start w:val="1"/>
+      <w:numFmt w:val="decimal"/>
+      <w:lvlText w:val="%4."/>
+      <w:lvlJc w:val="left"/>
+      <w:pPr>
+        <w:ind w:left="2925" w:hanging="360"/>
+      </w:pPr>
+    </w:lvl>
+    <w:lvl w:ilvl="4" w:tplc="08090019" w:tentative="1">
+      <w:start w:val="1"/>
+      <w:numFmt w:val="lowerLetter"/>
+      <w:lvlText w:val="%5."/>
+      <w:lvlJc w:val="left"/>
+      <w:pPr>
+        <w:ind w:left="3645" w:hanging="360"/>
+      </w:pPr>
+    </w:lvl>
+    <w:lvl w:ilvl="5" w:tplc="0809001B" w:tentative="1">
+      <w:start w:val="1"/>
+      <w:numFmt w:val="lowerRoman"/>
+      <w:lvlText w:val="%6."/>
+      <w:lvlJc w:val="right"/>
+      <w:pPr>
+        <w:ind w:left="4365" w:hanging="180"/>
+      </w:pPr>
+    </w:lvl>
+    <w:lvl w:ilvl="6" w:tplc="0809000F" w:tentative="1">
+      <w:start w:val="1"/>
+      <w:numFmt w:val="decimal"/>
+      <w:lvlText w:val="%7."/>
+      <w:lvlJc w:val="left"/>
+      <w:pPr>
+        <w:ind w:left="5085" w:hanging="360"/>
+      </w:pPr>
+    </w:lvl>
+    <w:lvl w:ilvl="7" w:tplc="08090019" w:tentative="1">
+      <w:start w:val="1"/>
+      <w:numFmt w:val="lowerLetter"/>
+      <w:lvlText w:val="%8."/>
+      <w:lvlJc w:val="left"/>
+      <w:pPr>
+        <w:ind w:left="5805" w:hanging="360"/>
+      </w:pPr>
+    </w:lvl>
+    <w:lvl w:ilvl="8" w:tplc="0809001B" w:tentative="1">
+      <w:start w:val="1"/>
+      <w:numFmt w:val="lowerRoman"/>
+      <w:lvlText w:val="%9."/>
+      <w:lvlJc w:val="right"/>
+      <w:pPr>
+        <w:ind w:left="6525" w:hanging="180"/>
+      </w:pPr>
+    </w:lvl>
+  </w:abstractNum>
   <w:num w:numId="1" w16cid:durableId="960067283">
     <w:abstractNumId w:val="4"/>
   </w:num>
@@ -6850,6 +7183,9 @@
   </w:num>
   <w:num w:numId="6" w16cid:durableId="603197419">
     <w:abstractNumId w:val="3"/>
+  </w:num>
+  <w:num w:numId="7" w16cid:durableId="1777940549">
+    <w:abstractNumId w:val="6"/>
   </w:num>
 </w:numbering>
 </file>

</xml_diff>